<commit_message>
AWS Phase 2: Compute & Containers (7 topics, resume core)
Docker interview angle, ECR push flow + SHA tags, ECS task def/service/roles,
Fargate vs EC2, App Runner (RAG chatbot story), ALB + autoscaling, Lambda

Co-Authored-By: Claude Fable 5 <noreply@anthropic.com>
Claude-Session: https://claude.ai/code/session_01Vm8nqoCZNTvUn3BNmW1Tgz
</commit_message>
<xml_diff>
--- a/AWS_Interview_Theory.docx
+++ b/AWS_Interview_Theory.docx
@@ -1789,6 +1789,2161 @@
           <w:szCs w:val="18"/>
         </w:rPr>
         <w:t xml:space="preserve">Compute bills by time, storage by GB-month, and egress by GB - transfer out and cross-AZ traffic are the classic surprises, NAT Gateway the classic silent cost. On-demand for spiky load, Savings Plans for the steady baseline, Spot at ~90% off for interruptible work like batch and CI. I set budgets and billing alarms on day one and tag everything.</w:t>
+      </w:r>
+    </w:p>
+    <w:p>
+      <w:pPr>
+        <w:spacing w:before="200" w:after="60" w:line="230" w:lineRule="auto"/>
+      </w:pPr>
+      <w:r>
+        <w:rPr>
+          <w:b/>
+          <w:color w:val="1F4E79"/>
+          <w:sz w:val="26"/>
+          <w:szCs w:val="26"/>
+        </w:rPr>
+        <w:t xml:space="preserve">AWS Phase 2 - Compute and Containers (resume core)</w:t>
+      </w:r>
+    </w:p>
+    <w:p>
+      <w:pPr>
+        <w:spacing w:before="140" w:after="40" w:line="230" w:lineRule="auto"/>
+      </w:pPr>
+      <w:r>
+        <w:rPr>
+          <w:b/>
+          <w:sz w:val="21"/>
+          <w:szCs w:val="21"/>
+        </w:rPr>
+        <w:t xml:space="preserve">A2.1  Docker Recap - The Interview Angle</w:t>
+      </w:r>
+    </w:p>
+    <w:p>
+      <w:pPr>
+        <w:spacing w:before="0" w:after="40" w:line="230" w:lineRule="auto"/>
+      </w:pPr>
+      <w:r>
+        <w:rPr>
+          <w:b/>
+          <w:sz w:val="18"/>
+          <w:szCs w:val="18"/>
+        </w:rPr>
+        <w:t xml:space="preserve">What it is:  </w:t>
+      </w:r>
+      <w:r>
+        <w:rPr>
+          <w:sz w:val="18"/>
+          <w:szCs w:val="18"/>
+        </w:rPr>
+        <w:t xml:space="preserve">Docker packages the app with its whole environment into an image; containers are running instances sharing the host kernel - lighter than VMs.</w:t>
+      </w:r>
+    </w:p>
+    <w:p>
+      <w:pPr>
+        <w:ind w:left="260" w:hanging="200"/>
+        <w:spacing w:before="0" w:after="25" w:line="230" w:lineRule="auto"/>
+      </w:pPr>
+      <w:r>
+        <w:rPr>
+          <w:sz w:val="18"/>
+          <w:szCs w:val="18"/>
+        </w:rPr>
+        <w:t xml:space="preserve">•   </w:t>
+      </w:r>
+      <w:r>
+        <w:rPr>
+          <w:sz w:val="18"/>
+          <w:szCs w:val="18"/>
+        </w:rPr>
+        <w:t xml:space="preserve">Image = immutable layered snapshot (base OS + deps + code); container = a running process with isolated filesystem/network from that image.</w:t>
+      </w:r>
+    </w:p>
+    <w:p>
+      <w:pPr>
+        <w:ind w:left="260" w:hanging="200"/>
+        <w:spacing w:before="0" w:after="25" w:line="230" w:lineRule="auto"/>
+      </w:pPr>
+      <w:r>
+        <w:rPr>
+          <w:sz w:val="18"/>
+          <w:szCs w:val="18"/>
+        </w:rPr>
+        <w:t xml:space="preserve">•   </w:t>
+      </w:r>
+      <w:r>
+        <w:rPr>
+          <w:sz w:val="18"/>
+          <w:szCs w:val="18"/>
+        </w:rPr>
+        <w:t xml:space="preserve">Container vs VM: containers share the host kernel - MBs and milliseconds vs GBs and minutes. Isolation is process-level, not hardware-level.</w:t>
+      </w:r>
+    </w:p>
+    <w:p>
+      <w:pPr>
+        <w:ind w:left="260" w:hanging="200"/>
+        <w:spacing w:before="0" w:after="25" w:line="230" w:lineRule="auto"/>
+      </w:pPr>
+      <w:r>
+        <w:rPr>
+          <w:sz w:val="18"/>
+          <w:szCs w:val="18"/>
+        </w:rPr>
+        <w:t xml:space="preserve">•   </w:t>
+      </w:r>
+      <w:r>
+        <w:rPr>
+          <w:sz w:val="18"/>
+          <w:szCs w:val="18"/>
+        </w:rPr>
+        <w:t xml:space="preserve">Dockerfile best practices interviewers probe: order layers for cache (deps install before code copy), multi-stage builds (build tools out of the final image), slim base images, non-root USER, .dockerignore.</w:t>
+      </w:r>
+    </w:p>
+    <w:p>
+      <w:pPr>
+        <w:ind w:left="260" w:hanging="200"/>
+        <w:spacing w:before="0" w:after="25" w:line="230" w:lineRule="auto"/>
+      </w:pPr>
+      <w:r>
+        <w:rPr>
+          <w:sz w:val="18"/>
+          <w:szCs w:val="18"/>
+        </w:rPr>
+        <w:t xml:space="preserve">•   </w:t>
+      </w:r>
+      <w:r>
+        <w:rPr>
+          <w:sz w:val="18"/>
+          <w:szCs w:val="18"/>
+        </w:rPr>
+        <w:t xml:space="preserve">'Works on my machine' dies: dev, CI and prod run the identical image - the image IS the artifact CI ships.</w:t>
+      </w:r>
+    </w:p>
+    <w:p>
+      <w:pPr>
+        <w:ind w:left="260" w:hanging="200"/>
+        <w:spacing w:before="0" w:after="25" w:line="230" w:lineRule="auto"/>
+      </w:pPr>
+      <w:r>
+        <w:rPr>
+          <w:sz w:val="18"/>
+          <w:szCs w:val="18"/>
+        </w:rPr>
+        <w:t xml:space="preserve">•   </w:t>
+      </w:r>
+      <w:r>
+        <w:rPr>
+          <w:sz w:val="18"/>
+          <w:szCs w:val="18"/>
+        </w:rPr>
+        <w:t xml:space="preserve">Registry flow: build -&gt; tag -&gt; push (ECR) -&gt; pull and run (ECS).</w:t>
+      </w:r>
+    </w:p>
+    <w:p>
+      <w:pPr>
+        <w:ind w:left="260" w:hanging="200"/>
+        <w:spacing w:before="0" w:after="25" w:line="230" w:lineRule="auto"/>
+      </w:pPr>
+      <w:r>
+        <w:rPr>
+          <w:sz w:val="18"/>
+          <w:szCs w:val="18"/>
+        </w:rPr>
+        <w:t xml:space="preserve">•   </w:t>
+      </w:r>
+      <w:r>
+        <w:rPr>
+          <w:sz w:val="18"/>
+          <w:szCs w:val="18"/>
+        </w:rPr>
+        <w:t xml:space="preserve">Compose runs multi-container stacks locally (app + Postgres + Redis) - my dev setup mirror of production.</w:t>
+      </w:r>
+    </w:p>
+    <w:p>
+      <w:pPr>
+        <w:ind w:left="260" w:hanging="0"/>
+        <w:spacing w:before="0" w:after="15" w:line="230" w:lineRule="auto"/>
+        <w:shd w:val="clear" w:color="auto" w:fill="F2F2F2"/>
+      </w:pPr>
+      <w:r>
+        <w:rPr>
+          <w:b/>
+          <w:sz w:val="17"/>
+          <w:szCs w:val="17"/>
+        </w:rPr>
+        <w:t xml:space="preserve">Example:  </w:t>
+      </w:r>
+      <w:r>
+        <w:rPr>
+          <w:rFonts w:ascii="Consolas" w:hAnsi="Consolas" w:cs="Consolas"/>
+          <w:color w:val="3B3B3B"/>
+          <w:sz w:val="17"/>
+          <w:szCs w:val="17"/>
+        </w:rPr>
+        <w:t xml:space="preserve">FROM python:3.12-slim AS base</w:t>
+      </w:r>
+    </w:p>
+    <w:p>
+      <w:pPr>
+        <w:ind w:left="260" w:hanging="0"/>
+        <w:spacing w:before="0" w:after="15" w:line="230" w:lineRule="auto"/>
+        <w:shd w:val="clear" w:color="auto" w:fill="F2F2F2"/>
+      </w:pPr>
+      <w:r>
+        <w:rPr>
+          <w:rFonts w:ascii="Consolas" w:hAnsi="Consolas" w:cs="Consolas"/>
+          <w:color w:val="3B3B3B"/>
+          <w:sz w:val="17"/>
+          <w:szCs w:val="17"/>
+        </w:rPr>
+        <w:t xml:space="preserve">WORKDIR /app</w:t>
+      </w:r>
+    </w:p>
+    <w:p>
+      <w:pPr>
+        <w:ind w:left="260" w:hanging="0"/>
+        <w:spacing w:before="0" w:after="15" w:line="230" w:lineRule="auto"/>
+        <w:shd w:val="clear" w:color="auto" w:fill="F2F2F2"/>
+      </w:pPr>
+      <w:r>
+        <w:rPr>
+          <w:rFonts w:ascii="Consolas" w:hAnsi="Consolas" w:cs="Consolas"/>
+          <w:color w:val="3B3B3B"/>
+          <w:sz w:val="17"/>
+          <w:szCs w:val="17"/>
+        </w:rPr>
+        <w:t xml:space="preserve">COPY requirements.txt .</w:t>
+      </w:r>
+    </w:p>
+    <w:p>
+      <w:pPr>
+        <w:ind w:left="260" w:hanging="0"/>
+        <w:spacing w:before="0" w:after="15" w:line="230" w:lineRule="auto"/>
+        <w:shd w:val="clear" w:color="auto" w:fill="F2F2F2"/>
+      </w:pPr>
+      <w:r>
+        <w:rPr>
+          <w:rFonts w:ascii="Consolas" w:hAnsi="Consolas" w:cs="Consolas"/>
+          <w:color w:val="3B3B3B"/>
+          <w:sz w:val="17"/>
+          <w:szCs w:val="17"/>
+        </w:rPr>
+        <w:t xml:space="preserve">RUN pip install -r requirements.txt</w:t>
+      </w:r>
+    </w:p>
+    <w:p>
+      <w:pPr>
+        <w:ind w:left="260" w:hanging="0"/>
+        <w:spacing w:before="0" w:after="15" w:line="230" w:lineRule="auto"/>
+        <w:shd w:val="clear" w:color="auto" w:fill="F2F2F2"/>
+      </w:pPr>
+      <w:r>
+        <w:rPr>
+          <w:rFonts w:ascii="Consolas" w:hAnsi="Consolas" w:cs="Consolas"/>
+          <w:color w:val="3B3B3B"/>
+          <w:sz w:val="17"/>
+          <w:szCs w:val="17"/>
+        </w:rPr>
+        <w:t xml:space="preserve">COPY . .</w:t>
+      </w:r>
+    </w:p>
+    <w:p>
+      <w:pPr>
+        <w:ind w:left="260" w:hanging="0"/>
+        <w:spacing w:before="0" w:after="15" w:line="230" w:lineRule="auto"/>
+        <w:shd w:val="clear" w:color="auto" w:fill="F2F2F2"/>
+      </w:pPr>
+      <w:r>
+        <w:rPr>
+          <w:rFonts w:ascii="Consolas" w:hAnsi="Consolas" w:cs="Consolas"/>
+          <w:color w:val="3B3B3B"/>
+          <w:sz w:val="17"/>
+          <w:szCs w:val="17"/>
+        </w:rPr>
+        <w:t xml:space="preserve">USER app</w:t>
+      </w:r>
+    </w:p>
+    <w:p>
+      <w:pPr>
+        <w:ind w:left="260" w:hanging="0"/>
+        <w:spacing w:before="0" w:after="15" w:line="230" w:lineRule="auto"/>
+        <w:shd w:val="clear" w:color="auto" w:fill="F2F2F2"/>
+      </w:pPr>
+      <w:r>
+        <w:rPr>
+          <w:rFonts w:ascii="Consolas" w:hAnsi="Consolas" w:cs="Consolas"/>
+          <w:color w:val="3B3B3B"/>
+          <w:sz w:val="17"/>
+          <w:szCs w:val="17"/>
+        </w:rPr>
+        <w:t xml:space="preserve">CMD ["gunicorn", "-k",</w:t>
+      </w:r>
+    </w:p>
+    <w:p>
+      <w:pPr>
+        <w:ind w:left="260" w:hanging="0"/>
+        <w:spacing w:before="0" w:after="15" w:line="230" w:lineRule="auto"/>
+        <w:shd w:val="clear" w:color="auto" w:fill="F2F2F2"/>
+      </w:pPr>
+      <w:r>
+        <w:rPr>
+          <w:rFonts w:ascii="Consolas" w:hAnsi="Consolas" w:cs="Consolas"/>
+          <w:color w:val="3B3B3B"/>
+          <w:sz w:val="17"/>
+          <w:szCs w:val="17"/>
+        </w:rPr>
+        <w:t xml:space="preserve">  "uvicorn.workers.UvicornWorker",</w:t>
+      </w:r>
+    </w:p>
+    <w:p>
+      <w:pPr>
+        <w:ind w:left="260" w:hanging="0"/>
+        <w:spacing w:before="0" w:after="15" w:line="230" w:lineRule="auto"/>
+        <w:shd w:val="clear" w:color="auto" w:fill="F2F2F2"/>
+      </w:pPr>
+      <w:r>
+        <w:rPr>
+          <w:rFonts w:ascii="Consolas" w:hAnsi="Consolas" w:cs="Consolas"/>
+          <w:color w:val="3B3B3B"/>
+          <w:sz w:val="17"/>
+          <w:szCs w:val="17"/>
+        </w:rPr>
+        <w:t xml:space="preserve">  "app.main:app"]</w:t>
+      </w:r>
+    </w:p>
+    <w:p>
+      <w:pPr>
+        <w:ind w:left="120" w:hanging="0"/>
+        <w:spacing w:before="50" w:after="110" w:line="230" w:lineRule="auto"/>
+        <w:pBdr>
+          <w:left w:val="single" w:sz="12" w:space="4" w:color="2E5E1F"/>
+        </w:pBdr>
+      </w:pPr>
+      <w:r>
+        <w:rPr>
+          <w:b/>
+          <w:color w:val="2E5E1F"/>
+          <w:sz w:val="18"/>
+          <w:szCs w:val="18"/>
+        </w:rPr>
+        <w:t xml:space="preserve">Interview answer:  </w:t>
+      </w:r>
+      <w:r>
+        <w:rPr>
+          <w:i/>
+          <w:sz w:val="18"/>
+          <w:szCs w:val="18"/>
+        </w:rPr>
+        <w:t xml:space="preserve">An image is a layered immutable snapshot; a container is that image running as an isolated process sharing the host kernel - hence lighter and faster than VMs. My Dockerfile answers: dependency layers before code for cache hits, multi-stage builds to slim the runtime image, non-root user, and the image as the single artifact flowing dev -&gt; CI -&gt; ECR -&gt; ECS.</w:t>
+      </w:r>
+    </w:p>
+    <w:p>
+      <w:pPr>
+        <w:spacing w:before="140" w:after="40" w:line="230" w:lineRule="auto"/>
+      </w:pPr>
+      <w:r>
+        <w:rPr>
+          <w:b/>
+          <w:sz w:val="21"/>
+          <w:szCs w:val="21"/>
+        </w:rPr>
+        <w:t xml:space="preserve">A2.2  ECR - Elastic Container Registry</w:t>
+      </w:r>
+    </w:p>
+    <w:p>
+      <w:pPr>
+        <w:spacing w:before="0" w:after="40" w:line="230" w:lineRule="auto"/>
+      </w:pPr>
+      <w:r>
+        <w:rPr>
+          <w:b/>
+          <w:sz w:val="18"/>
+          <w:szCs w:val="18"/>
+        </w:rPr>
+        <w:t xml:space="preserve">What it is:  </w:t>
+      </w:r>
+      <w:r>
+        <w:rPr>
+          <w:sz w:val="18"/>
+          <w:szCs w:val="18"/>
+        </w:rPr>
+        <w:t xml:space="preserve">ECR is AWS's private Docker registry - CI pushes images there, ECS/App Runner pull from there, with IAM controlling both sides.</w:t>
+      </w:r>
+    </w:p>
+    <w:p>
+      <w:pPr>
+        <w:ind w:left="260" w:hanging="200"/>
+        <w:spacing w:before="0" w:after="25" w:line="230" w:lineRule="auto"/>
+      </w:pPr>
+      <w:r>
+        <w:rPr>
+          <w:sz w:val="18"/>
+          <w:szCs w:val="18"/>
+        </w:rPr>
+        <w:t xml:space="preserve">•   </w:t>
+      </w:r>
+      <w:r>
+        <w:rPr>
+          <w:sz w:val="18"/>
+          <w:szCs w:val="18"/>
+        </w:rPr>
+        <w:t xml:space="preserve">Private repositories per app; images addressed as account.dkr.ecr.region.amazonaws.com/repo:tag.</w:t>
+      </w:r>
+    </w:p>
+    <w:p>
+      <w:pPr>
+        <w:ind w:left="260" w:hanging="200"/>
+        <w:spacing w:before="0" w:after="25" w:line="230" w:lineRule="auto"/>
+      </w:pPr>
+      <w:r>
+        <w:rPr>
+          <w:sz w:val="18"/>
+          <w:szCs w:val="18"/>
+        </w:rPr>
+        <w:t xml:space="preserve">•   </w:t>
+      </w:r>
+      <w:r>
+        <w:rPr>
+          <w:sz w:val="18"/>
+          <w:szCs w:val="18"/>
+        </w:rPr>
+        <w:t xml:space="preserve">Auth is IAM-based: get-login-password pipes a temp token into docker login - no permanent registry passwords; CI roles get push rights, task execution roles get pull rights.</w:t>
+      </w:r>
+    </w:p>
+    <w:p>
+      <w:pPr>
+        <w:ind w:left="260" w:hanging="200"/>
+        <w:spacing w:before="0" w:after="25" w:line="230" w:lineRule="auto"/>
+      </w:pPr>
+      <w:r>
+        <w:rPr>
+          <w:sz w:val="18"/>
+          <w:szCs w:val="18"/>
+        </w:rPr>
+        <w:t xml:space="preserve">•   </w:t>
+      </w:r>
+      <w:r>
+        <w:rPr>
+          <w:sz w:val="18"/>
+          <w:szCs w:val="18"/>
+        </w:rPr>
+        <w:t xml:space="preserve">Image scanning flags CVEs on push (basic free, enhanced via Inspector) - a security checkbox interviewers like.</w:t>
+      </w:r>
+    </w:p>
+    <w:p>
+      <w:pPr>
+        <w:ind w:left="260" w:hanging="200"/>
+        <w:spacing w:before="0" w:after="25" w:line="230" w:lineRule="auto"/>
+      </w:pPr>
+      <w:r>
+        <w:rPr>
+          <w:sz w:val="18"/>
+          <w:szCs w:val="18"/>
+        </w:rPr>
+        <w:t xml:space="preserve">•   </w:t>
+      </w:r>
+      <w:r>
+        <w:rPr>
+          <w:sz w:val="18"/>
+          <w:szCs w:val="18"/>
+        </w:rPr>
+        <w:t xml:space="preserve">Lifecycle policies auto-delete old images (keep last 10) - untended repos silently accumulate storage cost.</w:t>
+      </w:r>
+    </w:p>
+    <w:p>
+      <w:pPr>
+        <w:ind w:left="260" w:hanging="200"/>
+        <w:spacing w:before="0" w:after="25" w:line="230" w:lineRule="auto"/>
+      </w:pPr>
+      <w:r>
+        <w:rPr>
+          <w:sz w:val="18"/>
+          <w:szCs w:val="18"/>
+        </w:rPr>
+        <w:t xml:space="preserve">•   </w:t>
+      </w:r>
+      <w:r>
+        <w:rPr>
+          <w:sz w:val="18"/>
+          <w:szCs w:val="18"/>
+        </w:rPr>
+        <w:t xml:space="preserve">Tagging discipline: immutable tags with the git SHA (app:3fa2b91) - :latest deploys are un-rollback-able mysteries; SHA tags make rollback = redeploy previous tag.</w:t>
+      </w:r>
+    </w:p>
+    <w:p>
+      <w:pPr>
+        <w:ind w:left="260" w:hanging="200"/>
+        <w:spacing w:before="0" w:after="25" w:line="230" w:lineRule="auto"/>
+      </w:pPr>
+      <w:r>
+        <w:rPr>
+          <w:sz w:val="18"/>
+          <w:szCs w:val="18"/>
+        </w:rPr>
+        <w:t xml:space="preserve">•   </w:t>
+      </w:r>
+      <w:r>
+        <w:rPr>
+          <w:sz w:val="18"/>
+          <w:szCs w:val="18"/>
+        </w:rPr>
+        <w:t xml:space="preserve">Cross-account/region replication supports multi-env setups.</w:t>
+      </w:r>
+    </w:p>
+    <w:p>
+      <w:pPr>
+        <w:ind w:left="260" w:hanging="0"/>
+        <w:spacing w:before="0" w:after="15" w:line="230" w:lineRule="auto"/>
+        <w:shd w:val="clear" w:color="auto" w:fill="F2F2F2"/>
+      </w:pPr>
+      <w:r>
+        <w:rPr>
+          <w:b/>
+          <w:sz w:val="17"/>
+          <w:szCs w:val="17"/>
+        </w:rPr>
+        <w:t xml:space="preserve">Example:  </w:t>
+      </w:r>
+      <w:r>
+        <w:rPr>
+          <w:rFonts w:ascii="Consolas" w:hAnsi="Consolas" w:cs="Consolas"/>
+          <w:color w:val="3B3B3B"/>
+          <w:sz w:val="17"/>
+          <w:szCs w:val="17"/>
+        </w:rPr>
+        <w:t xml:space="preserve">aws ecr get-login-password |</w:t>
+      </w:r>
+    </w:p>
+    <w:p>
+      <w:pPr>
+        <w:ind w:left="260" w:hanging="0"/>
+        <w:spacing w:before="0" w:after="15" w:line="230" w:lineRule="auto"/>
+        <w:shd w:val="clear" w:color="auto" w:fill="F2F2F2"/>
+      </w:pPr>
+      <w:r>
+        <w:rPr>
+          <w:rFonts w:ascii="Consolas" w:hAnsi="Consolas" w:cs="Consolas"/>
+          <w:color w:val="3B3B3B"/>
+          <w:sz w:val="17"/>
+          <w:szCs w:val="17"/>
+        </w:rPr>
+        <w:t xml:space="preserve">  docker login --username AWS \</w:t>
+      </w:r>
+    </w:p>
+    <w:p>
+      <w:pPr>
+        <w:ind w:left="260" w:hanging="0"/>
+        <w:spacing w:before="0" w:after="15" w:line="230" w:lineRule="auto"/>
+        <w:shd w:val="clear" w:color="auto" w:fill="F2F2F2"/>
+      </w:pPr>
+      <w:r>
+        <w:rPr>
+          <w:rFonts w:ascii="Consolas" w:hAnsi="Consolas" w:cs="Consolas"/>
+          <w:color w:val="3B3B3B"/>
+          <w:sz w:val="17"/>
+          <w:szCs w:val="17"/>
+        </w:rPr>
+        <w:t xml:space="preserve">    --password-stdin $ECR_URI</w:t>
+      </w:r>
+    </w:p>
+    <w:p>
+      <w:pPr>
+        <w:ind w:left="260" w:hanging="0"/>
+        <w:spacing w:before="0" w:after="15" w:line="230" w:lineRule="auto"/>
+        <w:shd w:val="clear" w:color="auto" w:fill="F2F2F2"/>
+      </w:pPr>
+      <w:r>
+        <w:rPr>
+          <w:rFonts w:ascii="Consolas" w:hAnsi="Consolas" w:cs="Consolas"/>
+          <w:color w:val="3B3B3B"/>
+          <w:sz w:val="17"/>
+          <w:szCs w:val="17"/>
+        </w:rPr>
+        <w:t xml:space="preserve">docker build -t $ECR_URI/mailflow:$GIT_SHA .</w:t>
+      </w:r>
+    </w:p>
+    <w:p>
+      <w:pPr>
+        <w:ind w:left="260" w:hanging="0"/>
+        <w:spacing w:before="0" w:after="15" w:line="230" w:lineRule="auto"/>
+        <w:shd w:val="clear" w:color="auto" w:fill="F2F2F2"/>
+      </w:pPr>
+      <w:r>
+        <w:rPr>
+          <w:rFonts w:ascii="Consolas" w:hAnsi="Consolas" w:cs="Consolas"/>
+          <w:color w:val="3B3B3B"/>
+          <w:sz w:val="17"/>
+          <w:szCs w:val="17"/>
+        </w:rPr>
+        <w:t xml:space="preserve">docker push $ECR_URI/mailflow:$GIT_SHA</w:t>
+      </w:r>
+    </w:p>
+    <w:p>
+      <w:pPr>
+        <w:ind w:left="120" w:hanging="0"/>
+        <w:spacing w:before="50" w:after="110" w:line="230" w:lineRule="auto"/>
+        <w:pBdr>
+          <w:left w:val="single" w:sz="12" w:space="4" w:color="2E5E1F"/>
+        </w:pBdr>
+      </w:pPr>
+      <w:r>
+        <w:rPr>
+          <w:b/>
+          <w:color w:val="2E5E1F"/>
+          <w:sz w:val="18"/>
+          <w:szCs w:val="18"/>
+        </w:rPr>
+        <w:t xml:space="preserve">Interview answer:  </w:t>
+      </w:r>
+      <w:r>
+        <w:rPr>
+          <w:i/>
+          <w:sz w:val="18"/>
+          <w:szCs w:val="18"/>
+        </w:rPr>
+        <w:t xml:space="preserve">ECR is the private registry in the deploy chain: CI authenticates with a temporary IAM token, pushes an image tagged with the git SHA, ECS pulls it via the task execution role. Scan-on-push catches CVEs, lifecycle policies prune old images, and SHA-based immutable tags - never bare :latest - are what make rollbacks a one-line redeploy.</w:t>
+      </w:r>
+    </w:p>
+    <w:p>
+      <w:pPr>
+        <w:spacing w:before="140" w:after="40" w:line="230" w:lineRule="auto"/>
+      </w:pPr>
+      <w:r>
+        <w:rPr>
+          <w:b/>
+          <w:sz w:val="21"/>
+          <w:szCs w:val="21"/>
+        </w:rPr>
+        <w:t xml:space="preserve">A2.3  ECS - Cluster, Task Definition, Service</w:t>
+      </w:r>
+    </w:p>
+    <w:p>
+      <w:pPr>
+        <w:spacing w:before="0" w:after="40" w:line="230" w:lineRule="auto"/>
+      </w:pPr>
+      <w:r>
+        <w:rPr>
+          <w:b/>
+          <w:sz w:val="18"/>
+          <w:szCs w:val="18"/>
+        </w:rPr>
+        <w:t xml:space="preserve">What it is:  </w:t>
+      </w:r>
+      <w:r>
+        <w:rPr>
+          <w:sz w:val="18"/>
+          <w:szCs w:val="18"/>
+        </w:rPr>
+        <w:t xml:space="preserve">ECS is AWS's container orchestrator: a task definition describes containers, a service keeps N copies running behind a load balancer in a cluster.</w:t>
+      </w:r>
+    </w:p>
+    <w:p>
+      <w:pPr>
+        <w:ind w:left="260" w:hanging="200"/>
+        <w:spacing w:before="0" w:after="25" w:line="230" w:lineRule="auto"/>
+      </w:pPr>
+      <w:r>
+        <w:rPr>
+          <w:sz w:val="18"/>
+          <w:szCs w:val="18"/>
+        </w:rPr>
+        <w:t xml:space="preserve">•   </w:t>
+      </w:r>
+      <w:r>
+        <w:rPr>
+          <w:sz w:val="18"/>
+          <w:szCs w:val="18"/>
+        </w:rPr>
+        <w:t xml:space="preserve">Task definition = the versioned JSON blueprint: image, CPU/memory, env vars, secrets, ports, log config. A task = one running copy.</w:t>
+      </w:r>
+    </w:p>
+    <w:p>
+      <w:pPr>
+        <w:ind w:left="260" w:hanging="200"/>
+        <w:spacing w:before="0" w:after="25" w:line="230" w:lineRule="auto"/>
+      </w:pPr>
+      <w:r>
+        <w:rPr>
+          <w:sz w:val="18"/>
+          <w:szCs w:val="18"/>
+        </w:rPr>
+        <w:t xml:space="preserve">•   </w:t>
+      </w:r>
+      <w:r>
+        <w:rPr>
+          <w:sz w:val="18"/>
+          <w:szCs w:val="18"/>
+        </w:rPr>
+        <w:t xml:space="preserve">Service = the supervisor: desired count, replaces crashed tasks, registers them in the ALB target group, rolls new versions gradually.</w:t>
+      </w:r>
+    </w:p>
+    <w:p>
+      <w:pPr>
+        <w:ind w:left="260" w:hanging="200"/>
+        <w:spacing w:before="0" w:after="25" w:line="230" w:lineRule="auto"/>
+      </w:pPr>
+      <w:r>
+        <w:rPr>
+          <w:sz w:val="18"/>
+          <w:szCs w:val="18"/>
+        </w:rPr>
+        <w:t xml:space="preserve">•   </w:t>
+      </w:r>
+      <w:r>
+        <w:rPr>
+          <w:sz w:val="18"/>
+          <w:szCs w:val="18"/>
+        </w:rPr>
+        <w:t xml:space="preserve">Cluster = the logical grouping of capacity (Fargate or EC2 instances).</w:t>
+      </w:r>
+    </w:p>
+    <w:p>
+      <w:pPr>
+        <w:ind w:left="260" w:hanging="200"/>
+        <w:spacing w:before="0" w:after="25" w:line="230" w:lineRule="auto"/>
+      </w:pPr>
+      <w:r>
+        <w:rPr>
+          <w:sz w:val="18"/>
+          <w:szCs w:val="18"/>
+        </w:rPr>
+        <w:t xml:space="preserve">•   </w:t>
+      </w:r>
+      <w:r>
+        <w:rPr>
+          <w:sz w:val="18"/>
+          <w:szCs w:val="18"/>
+        </w:rPr>
+        <w:t xml:space="preserve">Two IAM roles per task - execution role (pull image, write logs, read secrets - infrastructure) vs task role (what YOUR CODE may call - S3, SQS). Interviewers love this distinction.</w:t>
+      </w:r>
+    </w:p>
+    <w:p>
+      <w:pPr>
+        <w:ind w:left="260" w:hanging="200"/>
+        <w:spacing w:before="0" w:after="25" w:line="230" w:lineRule="auto"/>
+      </w:pPr>
+      <w:r>
+        <w:rPr>
+          <w:sz w:val="18"/>
+          <w:szCs w:val="18"/>
+        </w:rPr>
+        <w:t xml:space="preserve">•   </w:t>
+      </w:r>
+      <w:r>
+        <w:rPr>
+          <w:sz w:val="18"/>
+          <w:szCs w:val="18"/>
+        </w:rPr>
+        <w:t xml:space="preserve">Deploy flow: push new image -&gt; register new task definition revision -&gt; service rolling-updates with min/max healthy percent -&gt; ALB health checks gate traffic; circuit breaker auto-rolls-back failed deploys.</w:t>
+      </w:r>
+    </w:p>
+    <w:p>
+      <w:pPr>
+        <w:ind w:left="260" w:hanging="200"/>
+        <w:spacing w:before="0" w:after="25" w:line="230" w:lineRule="auto"/>
+      </w:pPr>
+      <w:r>
+        <w:rPr>
+          <w:sz w:val="18"/>
+          <w:szCs w:val="18"/>
+        </w:rPr>
+        <w:t xml:space="preserve">•   </w:t>
+      </w:r>
+      <w:r>
+        <w:rPr>
+          <w:sz w:val="18"/>
+          <w:szCs w:val="18"/>
+        </w:rPr>
+        <w:t xml:space="preserve">Scaling: service auto scaling on CPU/memory/request-count metrics.</w:t>
+      </w:r>
+    </w:p>
+    <w:p>
+      <w:pPr>
+        <w:ind w:left="260" w:hanging="200"/>
+        <w:spacing w:before="0" w:after="25" w:line="230" w:lineRule="auto"/>
+      </w:pPr>
+      <w:r>
+        <w:rPr>
+          <w:sz w:val="18"/>
+          <w:szCs w:val="18"/>
+        </w:rPr>
+        <w:t xml:space="preserve">•   </w:t>
+      </w:r>
+      <w:r>
+        <w:rPr>
+          <w:sz w:val="18"/>
+          <w:szCs w:val="18"/>
+        </w:rPr>
+        <w:t xml:space="preserve">vs Kubernetes: ECS is simpler and AWS-native (my production use); EKS when the org wants the k8s ecosystem/portability.</w:t>
+      </w:r>
+    </w:p>
+    <w:p>
+      <w:pPr>
+        <w:ind w:left="260" w:hanging="0"/>
+        <w:spacing w:before="0" w:after="15" w:line="230" w:lineRule="auto"/>
+        <w:shd w:val="clear" w:color="auto" w:fill="F2F2F2"/>
+      </w:pPr>
+      <w:r>
+        <w:rPr>
+          <w:b/>
+          <w:sz w:val="17"/>
+          <w:szCs w:val="17"/>
+        </w:rPr>
+        <w:t xml:space="preserve">Example:  </w:t>
+      </w:r>
+      <w:r>
+        <w:rPr>
+          <w:rFonts w:ascii="Consolas" w:hAnsi="Consolas" w:cs="Consolas"/>
+          <w:color w:val="3B3B3B"/>
+          <w:sz w:val="17"/>
+          <w:szCs w:val="17"/>
+        </w:rPr>
+        <w:t xml:space="preserve">{</w:t>
+      </w:r>
+    </w:p>
+    <w:p>
+      <w:pPr>
+        <w:ind w:left="260" w:hanging="0"/>
+        <w:spacing w:before="0" w:after="15" w:line="230" w:lineRule="auto"/>
+        <w:shd w:val="clear" w:color="auto" w:fill="F2F2F2"/>
+      </w:pPr>
+      <w:r>
+        <w:rPr>
+          <w:rFonts w:ascii="Consolas" w:hAnsi="Consolas" w:cs="Consolas"/>
+          <w:color w:val="3B3B3B"/>
+          <w:sz w:val="17"/>
+          <w:szCs w:val="17"/>
+        </w:rPr>
+        <w:t xml:space="preserve"> "family": "mailflow-api",</w:t>
+      </w:r>
+    </w:p>
+    <w:p>
+      <w:pPr>
+        <w:ind w:left="260" w:hanging="0"/>
+        <w:spacing w:before="0" w:after="15" w:line="230" w:lineRule="auto"/>
+        <w:shd w:val="clear" w:color="auto" w:fill="F2F2F2"/>
+      </w:pPr>
+      <w:r>
+        <w:rPr>
+          <w:rFonts w:ascii="Consolas" w:hAnsi="Consolas" w:cs="Consolas"/>
+          <w:color w:val="3B3B3B"/>
+          <w:sz w:val="17"/>
+          <w:szCs w:val="17"/>
+        </w:rPr>
+        <w:t xml:space="preserve"> "cpu": "512", "memory": "1024",</w:t>
+      </w:r>
+    </w:p>
+    <w:p>
+      <w:pPr>
+        <w:ind w:left="260" w:hanging="0"/>
+        <w:spacing w:before="0" w:after="15" w:line="230" w:lineRule="auto"/>
+        <w:shd w:val="clear" w:color="auto" w:fill="F2F2F2"/>
+      </w:pPr>
+      <w:r>
+        <w:rPr>
+          <w:rFonts w:ascii="Consolas" w:hAnsi="Consolas" w:cs="Consolas"/>
+          <w:color w:val="3B3B3B"/>
+          <w:sz w:val="17"/>
+          <w:szCs w:val="17"/>
+        </w:rPr>
+        <w:t xml:space="preserve"> "containerDefinitions": [{</w:t>
+      </w:r>
+    </w:p>
+    <w:p>
+      <w:pPr>
+        <w:ind w:left="260" w:hanging="0"/>
+        <w:spacing w:before="0" w:after="15" w:line="230" w:lineRule="auto"/>
+        <w:shd w:val="clear" w:color="auto" w:fill="F2F2F2"/>
+      </w:pPr>
+      <w:r>
+        <w:rPr>
+          <w:rFonts w:ascii="Consolas" w:hAnsi="Consolas" w:cs="Consolas"/>
+          <w:color w:val="3B3B3B"/>
+          <w:sz w:val="17"/>
+          <w:szCs w:val="17"/>
+        </w:rPr>
+        <w:t xml:space="preserve">   "image": "...ecr.../mailflow:3fa2b91",</w:t>
+      </w:r>
+    </w:p>
+    <w:p>
+      <w:pPr>
+        <w:ind w:left="260" w:hanging="0"/>
+        <w:spacing w:before="0" w:after="15" w:line="230" w:lineRule="auto"/>
+        <w:shd w:val="clear" w:color="auto" w:fill="F2F2F2"/>
+      </w:pPr>
+      <w:r>
+        <w:rPr>
+          <w:rFonts w:ascii="Consolas" w:hAnsi="Consolas" w:cs="Consolas"/>
+          <w:color w:val="3B3B3B"/>
+          <w:sz w:val="17"/>
+          <w:szCs w:val="17"/>
+        </w:rPr>
+        <w:t xml:space="preserve">   "portMappings": [{"containerPort": 8000}],</w:t>
+      </w:r>
+    </w:p>
+    <w:p>
+      <w:pPr>
+        <w:ind w:left="260" w:hanging="0"/>
+        <w:spacing w:before="0" w:after="15" w:line="230" w:lineRule="auto"/>
+        <w:shd w:val="clear" w:color="auto" w:fill="F2F2F2"/>
+      </w:pPr>
+      <w:r>
+        <w:rPr>
+          <w:rFonts w:ascii="Consolas" w:hAnsi="Consolas" w:cs="Consolas"/>
+          <w:color w:val="3B3B3B"/>
+          <w:sz w:val="17"/>
+          <w:szCs w:val="17"/>
+        </w:rPr>
+        <w:t xml:space="preserve">   "secrets": [{"name": "DB_PASSWORD",</w:t>
+      </w:r>
+    </w:p>
+    <w:p>
+      <w:pPr>
+        <w:ind w:left="260" w:hanging="0"/>
+        <w:spacing w:before="0" w:after="15" w:line="230" w:lineRule="auto"/>
+        <w:shd w:val="clear" w:color="auto" w:fill="F2F2F2"/>
+      </w:pPr>
+      <w:r>
+        <w:rPr>
+          <w:rFonts w:ascii="Consolas" w:hAnsi="Consolas" w:cs="Consolas"/>
+          <w:color w:val="3B3B3B"/>
+          <w:sz w:val="17"/>
+          <w:szCs w:val="17"/>
+        </w:rPr>
+        <w:t xml:space="preserve">     "valueFrom": "arn:aws:ssm:..."}]</w:t>
+      </w:r>
+    </w:p>
+    <w:p>
+      <w:pPr>
+        <w:ind w:left="260" w:hanging="0"/>
+        <w:spacing w:before="0" w:after="15" w:line="230" w:lineRule="auto"/>
+        <w:shd w:val="clear" w:color="auto" w:fill="F2F2F2"/>
+      </w:pPr>
+      <w:r>
+        <w:rPr>
+          <w:rFonts w:ascii="Consolas" w:hAnsi="Consolas" w:cs="Consolas"/>
+          <w:color w:val="3B3B3B"/>
+          <w:sz w:val="17"/>
+          <w:szCs w:val="17"/>
+        </w:rPr>
+        <w:t xml:space="preserve"> }]</w:t>
+      </w:r>
+    </w:p>
+    <w:p>
+      <w:pPr>
+        <w:ind w:left="260" w:hanging="0"/>
+        <w:spacing w:before="0" w:after="15" w:line="230" w:lineRule="auto"/>
+        <w:shd w:val="clear" w:color="auto" w:fill="F2F2F2"/>
+      </w:pPr>
+      <w:r>
+        <w:rPr>
+          <w:rFonts w:ascii="Consolas" w:hAnsi="Consolas" w:cs="Consolas"/>
+          <w:color w:val="3B3B3B"/>
+          <w:sz w:val="17"/>
+          <w:szCs w:val="17"/>
+        </w:rPr>
+        <w:t xml:space="preserve">}</w:t>
+      </w:r>
+    </w:p>
+    <w:p>
+      <w:pPr>
+        <w:ind w:left="120" w:hanging="0"/>
+        <w:spacing w:before="50" w:after="110" w:line="230" w:lineRule="auto"/>
+        <w:pBdr>
+          <w:left w:val="single" w:sz="12" w:space="4" w:color="2E5E1F"/>
+        </w:pBdr>
+      </w:pPr>
+      <w:r>
+        <w:rPr>
+          <w:b/>
+          <w:color w:val="2E5E1F"/>
+          <w:sz w:val="18"/>
+          <w:szCs w:val="18"/>
+        </w:rPr>
+        <w:t xml:space="preserve">Interview answer:  </w:t>
+      </w:r>
+      <w:r>
+        <w:rPr>
+          <w:i/>
+          <w:sz w:val="18"/>
+          <w:szCs w:val="18"/>
+        </w:rPr>
+        <w:t xml:space="preserve">ECS runs containers from a versioned task definition - image, resources, env, secrets - while a service keeps the desired count alive behind the ALB and rolls deployments with health-check gating and auto-rollback. Two roles matter: the execution role pulls images and reads secrets, the task role scopes what the app code itself can call. I ran production APIs this way; EKS is the choice when the k8s ecosystem is required.</w:t>
+      </w:r>
+    </w:p>
+    <w:p>
+      <w:pPr>
+        <w:spacing w:before="140" w:after="40" w:line="230" w:lineRule="auto"/>
+      </w:pPr>
+      <w:r>
+        <w:rPr>
+          <w:b/>
+          <w:sz w:val="21"/>
+          <w:szCs w:val="21"/>
+        </w:rPr>
+        <w:t xml:space="preserve">A2.4  Fargate vs EC2 Launch Type</w:t>
+      </w:r>
+    </w:p>
+    <w:p>
+      <w:pPr>
+        <w:spacing w:before="0" w:after="40" w:line="230" w:lineRule="auto"/>
+      </w:pPr>
+      <w:r>
+        <w:rPr>
+          <w:b/>
+          <w:sz w:val="18"/>
+          <w:szCs w:val="18"/>
+        </w:rPr>
+        <w:t xml:space="preserve">What it is:  </w:t>
+      </w:r>
+      <w:r>
+        <w:rPr>
+          <w:sz w:val="18"/>
+          <w:szCs w:val="18"/>
+        </w:rPr>
+        <w:t xml:space="preserve">Fargate runs containers serverless - AWS manages the hosts; EC2 launch type gives us the instances to manage but cheaper at steady scale.</w:t>
+      </w:r>
+    </w:p>
+    <w:p>
+      <w:pPr>
+        <w:ind w:left="260" w:hanging="200"/>
+        <w:spacing w:before="0" w:after="25" w:line="230" w:lineRule="auto"/>
+      </w:pPr>
+      <w:r>
+        <w:rPr>
+          <w:sz w:val="18"/>
+          <w:szCs w:val="18"/>
+        </w:rPr>
+        <w:t xml:space="preserve">•   </w:t>
+      </w:r>
+      <w:r>
+        <w:rPr>
+          <w:sz w:val="18"/>
+          <w:szCs w:val="18"/>
+        </w:rPr>
+        <w:t xml:space="preserve">Fargate: declare CPU/memory per task, AWS finds the compute - no instances to patch, size or scale. Billing per task-second.</w:t>
+      </w:r>
+    </w:p>
+    <w:p>
+      <w:pPr>
+        <w:ind w:left="260" w:hanging="200"/>
+        <w:spacing w:before="0" w:after="25" w:line="230" w:lineRule="auto"/>
+      </w:pPr>
+      <w:r>
+        <w:rPr>
+          <w:sz w:val="18"/>
+          <w:szCs w:val="18"/>
+        </w:rPr>
+        <w:t xml:space="preserve">•   </w:t>
+      </w:r>
+      <w:r>
+        <w:rPr>
+          <w:sz w:val="18"/>
+          <w:szCs w:val="18"/>
+        </w:rPr>
+        <w:t xml:space="preserve">EC2 type: we run the container instances - patching, capacity planning, bin-packing are ours; instance pricing (with reserved/spot discounts) wins at high steady utilization.</w:t>
+      </w:r>
+    </w:p>
+    <w:p>
+      <w:pPr>
+        <w:ind w:left="260" w:hanging="200"/>
+        <w:spacing w:before="0" w:after="25" w:line="230" w:lineRule="auto"/>
+      </w:pPr>
+      <w:r>
+        <w:rPr>
+          <w:sz w:val="18"/>
+          <w:szCs w:val="18"/>
+        </w:rPr>
+        <w:t xml:space="preserve">•   </w:t>
+      </w:r>
+      <w:r>
+        <w:rPr>
+          <w:sz w:val="18"/>
+          <w:szCs w:val="18"/>
+        </w:rPr>
+        <w:t xml:space="preserve">Fargate trade-offs: no GPU (mostly), per-vCPU price premium, no daemonsets/privileged containers, cold task start seconds.</w:t>
+      </w:r>
+    </w:p>
+    <w:p>
+      <w:pPr>
+        <w:ind w:left="260" w:hanging="200"/>
+        <w:spacing w:before="0" w:after="25" w:line="230" w:lineRule="auto"/>
+      </w:pPr>
+      <w:r>
+        <w:rPr>
+          <w:sz w:val="18"/>
+          <w:szCs w:val="18"/>
+        </w:rPr>
+        <w:t xml:space="preserve">•   </w:t>
+      </w:r>
+      <w:r>
+        <w:rPr>
+          <w:sz w:val="18"/>
+          <w:szCs w:val="18"/>
+        </w:rPr>
+        <w:t xml:space="preserve">Choose Fargate: variable load, small teams, no ops appetite - the default answer today.</w:t>
+      </w:r>
+    </w:p>
+    <w:p>
+      <w:pPr>
+        <w:ind w:left="260" w:hanging="200"/>
+        <w:spacing w:before="0" w:after="25" w:line="230" w:lineRule="auto"/>
+      </w:pPr>
+      <w:r>
+        <w:rPr>
+          <w:sz w:val="18"/>
+          <w:szCs w:val="18"/>
+        </w:rPr>
+        <w:t xml:space="preserve">•   </w:t>
+      </w:r>
+      <w:r>
+        <w:rPr>
+          <w:sz w:val="18"/>
+          <w:szCs w:val="18"/>
+        </w:rPr>
+        <w:t xml:space="preserve">Choose EC2: steady high load where reserved pricing wins, GPU tasks, special kernel/daemon needs.</w:t>
+      </w:r>
+    </w:p>
+    <w:p>
+      <w:pPr>
+        <w:ind w:left="260" w:hanging="200"/>
+        <w:spacing w:before="0" w:after="25" w:line="230" w:lineRule="auto"/>
+      </w:pPr>
+      <w:r>
+        <w:rPr>
+          <w:sz w:val="18"/>
+          <w:szCs w:val="18"/>
+        </w:rPr>
+        <w:t xml:space="preserve">•   </w:t>
+      </w:r>
+      <w:r>
+        <w:rPr>
+          <w:sz w:val="18"/>
+          <w:szCs w:val="18"/>
+        </w:rPr>
+        <w:t xml:space="preserve">Fargate Spot: ~70% off for interruptible tasks - workers, batch.</w:t>
+      </w:r>
+    </w:p>
+    <w:p>
+      <w:pPr>
+        <w:ind w:left="260" w:hanging="200"/>
+        <w:spacing w:before="0" w:after="25" w:line="230" w:lineRule="auto"/>
+      </w:pPr>
+      <w:r>
+        <w:rPr>
+          <w:sz w:val="18"/>
+          <w:szCs w:val="18"/>
+        </w:rPr>
+        <w:t xml:space="preserve">•   </w:t>
+      </w:r>
+      <w:r>
+        <w:rPr>
+          <w:sz w:val="18"/>
+          <w:szCs w:val="18"/>
+        </w:rPr>
+        <w:t xml:space="preserve">Same task definitions either way - the launch type is a service-level choice, mixable in one cluster.</w:t>
+      </w:r>
+    </w:p>
+    <w:p>
+      <w:pPr>
+        <w:ind w:left="260" w:hanging="0"/>
+        <w:spacing w:before="0" w:after="15" w:line="230" w:lineRule="auto"/>
+        <w:shd w:val="clear" w:color="auto" w:fill="F2F2F2"/>
+      </w:pPr>
+      <w:r>
+        <w:rPr>
+          <w:b/>
+          <w:sz w:val="17"/>
+          <w:szCs w:val="17"/>
+        </w:rPr>
+        <w:t xml:space="preserve">Example:  </w:t>
+      </w:r>
+      <w:r>
+        <w:rPr>
+          <w:rFonts w:ascii="Consolas" w:hAnsi="Consolas" w:cs="Consolas"/>
+          <w:color w:val="3B3B3B"/>
+          <w:sz w:val="17"/>
+          <w:szCs w:val="17"/>
+        </w:rPr>
+        <w:t xml:space="preserve">aws ecs create-service ...</w:t>
+      </w:r>
+    </w:p>
+    <w:p>
+      <w:pPr>
+        <w:ind w:left="260" w:hanging="0"/>
+        <w:spacing w:before="0" w:after="15" w:line="230" w:lineRule="auto"/>
+        <w:shd w:val="clear" w:color="auto" w:fill="F2F2F2"/>
+      </w:pPr>
+      <w:r>
+        <w:rPr>
+          <w:rFonts w:ascii="Consolas" w:hAnsi="Consolas" w:cs="Consolas"/>
+          <w:color w:val="3B3B3B"/>
+          <w:sz w:val="17"/>
+          <w:szCs w:val="17"/>
+        </w:rPr>
+        <w:t xml:space="preserve">  --launch-type FARGATE \</w:t>
+      </w:r>
+    </w:p>
+    <w:p>
+      <w:pPr>
+        <w:ind w:left="260" w:hanging="0"/>
+        <w:spacing w:before="0" w:after="15" w:line="230" w:lineRule="auto"/>
+        <w:shd w:val="clear" w:color="auto" w:fill="F2F2F2"/>
+      </w:pPr>
+      <w:r>
+        <w:rPr>
+          <w:rFonts w:ascii="Consolas" w:hAnsi="Consolas" w:cs="Consolas"/>
+          <w:color w:val="3B3B3B"/>
+          <w:sz w:val="17"/>
+          <w:szCs w:val="17"/>
+        </w:rPr>
+        <w:t xml:space="preserve">  --network-configuration \</w:t>
+      </w:r>
+    </w:p>
+    <w:p>
+      <w:pPr>
+        <w:ind w:left="260" w:hanging="0"/>
+        <w:spacing w:before="0" w:after="15" w:line="230" w:lineRule="auto"/>
+        <w:shd w:val="clear" w:color="auto" w:fill="F2F2F2"/>
+      </w:pPr>
+      <w:r>
+        <w:rPr>
+          <w:rFonts w:ascii="Consolas" w:hAnsi="Consolas" w:cs="Consolas"/>
+          <w:color w:val="3B3B3B"/>
+          <w:sz w:val="17"/>
+          <w:szCs w:val="17"/>
+        </w:rPr>
+        <w:t xml:space="preserve">   "awsvpcConfiguration={subnets=[private],</w:t>
+      </w:r>
+    </w:p>
+    <w:p>
+      <w:pPr>
+        <w:ind w:left="260" w:hanging="0"/>
+        <w:spacing w:before="0" w:after="15" w:line="230" w:lineRule="auto"/>
+        <w:shd w:val="clear" w:color="auto" w:fill="F2F2F2"/>
+      </w:pPr>
+      <w:r>
+        <w:rPr>
+          <w:rFonts w:ascii="Consolas" w:hAnsi="Consolas" w:cs="Consolas"/>
+          <w:color w:val="3B3B3B"/>
+          <w:sz w:val="17"/>
+          <w:szCs w:val="17"/>
+        </w:rPr>
+        <w:t xml:space="preserve">    securityGroups=[app-sg]}"</w:t>
+      </w:r>
+    </w:p>
+    <w:p>
+      <w:pPr>
+        <w:ind w:left="120" w:hanging="0"/>
+        <w:spacing w:before="50" w:after="110" w:line="230" w:lineRule="auto"/>
+        <w:pBdr>
+          <w:left w:val="single" w:sz="12" w:space="4" w:color="2E5E1F"/>
+        </w:pBdr>
+      </w:pPr>
+      <w:r>
+        <w:rPr>
+          <w:b/>
+          <w:color w:val="2E5E1F"/>
+          <w:sz w:val="18"/>
+          <w:szCs w:val="18"/>
+        </w:rPr>
+        <w:t xml:space="preserve">Interview answer:  </w:t>
+      </w:r>
+      <w:r>
+        <w:rPr>
+          <w:i/>
+          <w:sz w:val="18"/>
+          <w:szCs w:val="18"/>
+        </w:rPr>
+        <w:t xml:space="preserve">Fargate is serverless containers - per-task CPU/memory, no hosts to patch, billed per second; EC2 launch type hands us the instances with their ops burden but cheaper economics at steady high utilization, plus GPU and daemon options. My default is Fargate with Fargate Spot for workers, switching to EC2 only when sustained scale or special hardware justifies it.</w:t>
+      </w:r>
+    </w:p>
+    <w:p>
+      <w:pPr>
+        <w:spacing w:before="140" w:after="40" w:line="230" w:lineRule="auto"/>
+      </w:pPr>
+      <w:r>
+        <w:rPr>
+          <w:b/>
+          <w:sz w:val="21"/>
+          <w:szCs w:val="21"/>
+        </w:rPr>
+        <w:t xml:space="preserve">A2.5  App Runner</w:t>
+      </w:r>
+    </w:p>
+    <w:p>
+      <w:pPr>
+        <w:spacing w:before="0" w:after="40" w:line="230" w:lineRule="auto"/>
+      </w:pPr>
+      <w:r>
+        <w:rPr>
+          <w:b/>
+          <w:sz w:val="18"/>
+          <w:szCs w:val="18"/>
+        </w:rPr>
+        <w:t xml:space="preserve">What it is:  </w:t>
+      </w:r>
+      <w:r>
+        <w:rPr>
+          <w:sz w:val="18"/>
+          <w:szCs w:val="18"/>
+        </w:rPr>
+        <w:t xml:space="preserve">App Runner is the simplest AWS container deploy: point it at an ECR image or repo, it handles load balancing, HTTPS, autoscaling - PaaS-style.</w:t>
+      </w:r>
+    </w:p>
+    <w:p>
+      <w:pPr>
+        <w:ind w:left="260" w:hanging="200"/>
+        <w:spacing w:before="0" w:after="25" w:line="230" w:lineRule="auto"/>
+      </w:pPr>
+      <w:r>
+        <w:rPr>
+          <w:sz w:val="18"/>
+          <w:szCs w:val="18"/>
+        </w:rPr>
+        <w:t xml:space="preserve">•   </w:t>
+      </w:r>
+      <w:r>
+        <w:rPr>
+          <w:sz w:val="18"/>
+          <w:szCs w:val="18"/>
+        </w:rPr>
+        <w:t xml:space="preserve">Give it an image (or source repo with a buildfile) -&gt; it builds/pulls, runs N copies, terminates TLS, autoscales on concurrent requests - no ALB, no cluster, no task definitions to manage.</w:t>
+      </w:r>
+    </w:p>
+    <w:p>
+      <w:pPr>
+        <w:ind w:left="260" w:hanging="200"/>
+        <w:spacing w:before="0" w:after="25" w:line="230" w:lineRule="auto"/>
+      </w:pPr>
+      <w:r>
+        <w:rPr>
+          <w:sz w:val="18"/>
+          <w:szCs w:val="18"/>
+        </w:rPr>
+        <w:t xml:space="preserve">•   </w:t>
+      </w:r>
+      <w:r>
+        <w:rPr>
+          <w:sz w:val="18"/>
+          <w:szCs w:val="18"/>
+        </w:rPr>
+        <w:t xml:space="preserve">Per-service config is tiny: CPU/memory, min/max instances, env vars, health check path, auto-deploy on new image push.</w:t>
+      </w:r>
+    </w:p>
+    <w:p>
+      <w:pPr>
+        <w:ind w:left="260" w:hanging="200"/>
+        <w:spacing w:before="0" w:after="25" w:line="230" w:lineRule="auto"/>
+      </w:pPr>
+      <w:r>
+        <w:rPr>
+          <w:sz w:val="18"/>
+          <w:szCs w:val="18"/>
+        </w:rPr>
+        <w:t xml:space="preserve">•   </w:t>
+      </w:r>
+      <w:r>
+        <w:rPr>
+          <w:sz w:val="18"/>
+          <w:szCs w:val="18"/>
+        </w:rPr>
+        <w:t xml:space="preserve">Scales down to near-idle cost (provisioned-but-paused instances) - great for low/spiky traffic APIs and demos.</w:t>
+      </w:r>
+    </w:p>
+    <w:p>
+      <w:pPr>
+        <w:ind w:left="260" w:hanging="200"/>
+        <w:spacing w:before="0" w:after="25" w:line="230" w:lineRule="auto"/>
+      </w:pPr>
+      <w:r>
+        <w:rPr>
+          <w:sz w:val="18"/>
+          <w:szCs w:val="18"/>
+        </w:rPr>
+        <w:t xml:space="preserve">•   </w:t>
+      </w:r>
+      <w:r>
+        <w:rPr>
+          <w:sz w:val="18"/>
+          <w:szCs w:val="18"/>
+        </w:rPr>
+        <w:t xml:space="preserve">Limits vs ECS: less network control (VPC connector needed for RDS access), request/response model only (no long websockets historically, no workers/daemons), fewer knobs overall.</w:t>
+      </w:r>
+    </w:p>
+    <w:p>
+      <w:pPr>
+        <w:ind w:left="260" w:hanging="200"/>
+        <w:spacing w:before="0" w:after="25" w:line="230" w:lineRule="auto"/>
+      </w:pPr>
+      <w:r>
+        <w:rPr>
+          <w:sz w:val="18"/>
+          <w:szCs w:val="18"/>
+        </w:rPr>
+        <w:t xml:space="preserve">•   </w:t>
+      </w:r>
+      <w:r>
+        <w:rPr>
+          <w:sz w:val="18"/>
+          <w:szCs w:val="18"/>
+        </w:rPr>
+        <w:t xml:space="preserve">The ladder to name: App Runner (simplest) -&gt; ECS Fargate (production control) -&gt; EKS (k8s ecosystem) - choose the lowest rung that fits.</w:t>
+      </w:r>
+    </w:p>
+    <w:p>
+      <w:pPr>
+        <w:ind w:left="260" w:hanging="200"/>
+        <w:spacing w:before="0" w:after="25" w:line="230" w:lineRule="auto"/>
+      </w:pPr>
+      <w:r>
+        <w:rPr>
+          <w:sz w:val="18"/>
+          <w:szCs w:val="18"/>
+        </w:rPr>
+        <w:t xml:space="preserve">•   </w:t>
+      </w:r>
+      <w:r>
+        <w:rPr>
+          <w:sz w:val="18"/>
+          <w:szCs w:val="18"/>
+        </w:rPr>
+        <w:t xml:space="preserve">My production use: the RAG chatbot ran on App Runner - Flask container from ECR, HTTPS and autoscaling out of the box (resume story).</w:t>
+      </w:r>
+    </w:p>
+    <w:p>
+      <w:pPr>
+        <w:ind w:left="260" w:hanging="0"/>
+        <w:spacing w:before="0" w:after="15" w:line="230" w:lineRule="auto"/>
+        <w:shd w:val="clear" w:color="auto" w:fill="F2F2F2"/>
+      </w:pPr>
+      <w:r>
+        <w:rPr>
+          <w:b/>
+          <w:sz w:val="17"/>
+          <w:szCs w:val="17"/>
+        </w:rPr>
+        <w:t xml:space="preserve">Example:  </w:t>
+      </w:r>
+      <w:r>
+        <w:rPr>
+          <w:rFonts w:ascii="Consolas" w:hAnsi="Consolas" w:cs="Consolas"/>
+          <w:color w:val="3B3B3B"/>
+          <w:sz w:val="17"/>
+          <w:szCs w:val="17"/>
+        </w:rPr>
+        <w:t xml:space="preserve">aws apprunner create-service \</w:t>
+      </w:r>
+    </w:p>
+    <w:p>
+      <w:pPr>
+        <w:ind w:left="260" w:hanging="0"/>
+        <w:spacing w:before="0" w:after="15" w:line="230" w:lineRule="auto"/>
+        <w:shd w:val="clear" w:color="auto" w:fill="F2F2F2"/>
+      </w:pPr>
+      <w:r>
+        <w:rPr>
+          <w:rFonts w:ascii="Consolas" w:hAnsi="Consolas" w:cs="Consolas"/>
+          <w:color w:val="3B3B3B"/>
+          <w:sz w:val="17"/>
+          <w:szCs w:val="17"/>
+        </w:rPr>
+        <w:t xml:space="preserve">  --service-name rag-chatbot \</w:t>
+      </w:r>
+    </w:p>
+    <w:p>
+      <w:pPr>
+        <w:ind w:left="260" w:hanging="0"/>
+        <w:spacing w:before="0" w:after="15" w:line="230" w:lineRule="auto"/>
+        <w:shd w:val="clear" w:color="auto" w:fill="F2F2F2"/>
+      </w:pPr>
+      <w:r>
+        <w:rPr>
+          <w:rFonts w:ascii="Consolas" w:hAnsi="Consolas" w:cs="Consolas"/>
+          <w:color w:val="3B3B3B"/>
+          <w:sz w:val="17"/>
+          <w:szCs w:val="17"/>
+        </w:rPr>
+        <w:t xml:space="preserve">  --source-configuration '{</w:t>
+      </w:r>
+    </w:p>
+    <w:p>
+      <w:pPr>
+        <w:ind w:left="260" w:hanging="0"/>
+        <w:spacing w:before="0" w:after="15" w:line="230" w:lineRule="auto"/>
+        <w:shd w:val="clear" w:color="auto" w:fill="F2F2F2"/>
+      </w:pPr>
+      <w:r>
+        <w:rPr>
+          <w:rFonts w:ascii="Consolas" w:hAnsi="Consolas" w:cs="Consolas"/>
+          <w:color w:val="3B3B3B"/>
+          <w:sz w:val="17"/>
+          <w:szCs w:val="17"/>
+        </w:rPr>
+        <w:t xml:space="preserve">    "ImageRepository": {</w:t>
+      </w:r>
+    </w:p>
+    <w:p>
+      <w:pPr>
+        <w:ind w:left="260" w:hanging="0"/>
+        <w:spacing w:before="0" w:after="15" w:line="230" w:lineRule="auto"/>
+        <w:shd w:val="clear" w:color="auto" w:fill="F2F2F2"/>
+      </w:pPr>
+      <w:r>
+        <w:rPr>
+          <w:rFonts w:ascii="Consolas" w:hAnsi="Consolas" w:cs="Consolas"/>
+          <w:color w:val="3B3B3B"/>
+          <w:sz w:val="17"/>
+          <w:szCs w:val="17"/>
+        </w:rPr>
+        <w:t xml:space="preserve">      "ImageIdentifier":</w:t>
+      </w:r>
+    </w:p>
+    <w:p>
+      <w:pPr>
+        <w:ind w:left="260" w:hanging="0"/>
+        <w:spacing w:before="0" w:after="15" w:line="230" w:lineRule="auto"/>
+        <w:shd w:val="clear" w:color="auto" w:fill="F2F2F2"/>
+      </w:pPr>
+      <w:r>
+        <w:rPr>
+          <w:rFonts w:ascii="Consolas" w:hAnsi="Consolas" w:cs="Consolas"/>
+          <w:color w:val="3B3B3B"/>
+          <w:sz w:val="17"/>
+          <w:szCs w:val="17"/>
+        </w:rPr>
+        <w:t xml:space="preserve">        "...ecr.../rag-bot:latest",</w:t>
+      </w:r>
+    </w:p>
+    <w:p>
+      <w:pPr>
+        <w:ind w:left="260" w:hanging="0"/>
+        <w:spacing w:before="0" w:after="15" w:line="230" w:lineRule="auto"/>
+        <w:shd w:val="clear" w:color="auto" w:fill="F2F2F2"/>
+      </w:pPr>
+      <w:r>
+        <w:rPr>
+          <w:rFonts w:ascii="Consolas" w:hAnsi="Consolas" w:cs="Consolas"/>
+          <w:color w:val="3B3B3B"/>
+          <w:sz w:val="17"/>
+          <w:szCs w:val="17"/>
+        </w:rPr>
+        <w:t xml:space="preserve">      "ImageRepositoryType": "ECR"}}'</w:t>
+      </w:r>
+    </w:p>
+    <w:p>
+      <w:pPr>
+        <w:ind w:left="120" w:hanging="0"/>
+        <w:spacing w:before="50" w:after="110" w:line="230" w:lineRule="auto"/>
+        <w:pBdr>
+          <w:left w:val="single" w:sz="12" w:space="4" w:color="2E5E1F"/>
+        </w:pBdr>
+      </w:pPr>
+      <w:r>
+        <w:rPr>
+          <w:b/>
+          <w:color w:val="2E5E1F"/>
+          <w:sz w:val="18"/>
+          <w:szCs w:val="18"/>
+        </w:rPr>
+        <w:t xml:space="preserve">Interview answer:  </w:t>
+      </w:r>
+      <w:r>
+        <w:rPr>
+          <w:i/>
+          <w:sz w:val="18"/>
+          <w:szCs w:val="18"/>
+        </w:rPr>
+        <w:t xml:space="preserve">App Runner is AWS's PaaS for containers: point it at an ECR image and it gives HTTPS, load balancing and request-based autoscaling with near-zero configuration - I ran my production RAG chatbot on it. The trade is control: VPC access needs a connector and there are no background workers, so the ladder is App Runner for simple web services, ECS Fargate when architecture grows, EKS for the k8s world.</w:t>
+      </w:r>
+    </w:p>
+    <w:p>
+      <w:pPr>
+        <w:spacing w:before="140" w:after="40" w:line="230" w:lineRule="auto"/>
+      </w:pPr>
+      <w:r>
+        <w:rPr>
+          <w:b/>
+          <w:sz w:val="21"/>
+          <w:szCs w:val="21"/>
+        </w:rPr>
+        <w:t xml:space="preserve">A2.6  ALB and Auto Scaling</w:t>
+      </w:r>
+    </w:p>
+    <w:p>
+      <w:pPr>
+        <w:spacing w:before="0" w:after="40" w:line="230" w:lineRule="auto"/>
+      </w:pPr>
+      <w:r>
+        <w:rPr>
+          <w:b/>
+          <w:sz w:val="18"/>
+          <w:szCs w:val="18"/>
+        </w:rPr>
+        <w:t xml:space="preserve">What it is:  </w:t>
+      </w:r>
+      <w:r>
+        <w:rPr>
+          <w:sz w:val="18"/>
+          <w:szCs w:val="18"/>
+        </w:rPr>
+        <w:t xml:space="preserve">The ALB spreads HTTP traffic across healthy targets with layer-7 routing; auto scaling adjusts how many targets exist.</w:t>
+      </w:r>
+    </w:p>
+    <w:p>
+      <w:pPr>
+        <w:ind w:left="260" w:hanging="200"/>
+        <w:spacing w:before="0" w:after="25" w:line="230" w:lineRule="auto"/>
+      </w:pPr>
+      <w:r>
+        <w:rPr>
+          <w:sz w:val="18"/>
+          <w:szCs w:val="18"/>
+        </w:rPr>
+        <w:t xml:space="preserve">•   </w:t>
+      </w:r>
+      <w:r>
+        <w:rPr>
+          <w:sz w:val="18"/>
+          <w:szCs w:val="18"/>
+        </w:rPr>
+        <w:t xml:space="preserve">ALB = layer 7: routes by path (/api/* -&gt; api service), host, headers - target groups hold the targets (ECS tasks via awsvpc IPs).</w:t>
+      </w:r>
+    </w:p>
+    <w:p>
+      <w:pPr>
+        <w:ind w:left="260" w:hanging="200"/>
+        <w:spacing w:before="0" w:after="25" w:line="230" w:lineRule="auto"/>
+      </w:pPr>
+      <w:r>
+        <w:rPr>
+          <w:sz w:val="18"/>
+          <w:szCs w:val="18"/>
+        </w:rPr>
+        <w:t xml:space="preserve">•   </w:t>
+      </w:r>
+      <w:r>
+        <w:rPr>
+          <w:sz w:val="18"/>
+          <w:szCs w:val="18"/>
+        </w:rPr>
+        <w:t xml:space="preserve">Health checks per target group: fail threshold -&gt; target pulled from rotation; ECS replaces it. This gating is what makes rolling deploys zero-downtime.</w:t>
+      </w:r>
+    </w:p>
+    <w:p>
+      <w:pPr>
+        <w:ind w:left="260" w:hanging="200"/>
+        <w:spacing w:before="0" w:after="25" w:line="230" w:lineRule="auto"/>
+      </w:pPr>
+      <w:r>
+        <w:rPr>
+          <w:sz w:val="18"/>
+          <w:szCs w:val="18"/>
+        </w:rPr>
+        <w:t xml:space="preserve">•   </w:t>
+      </w:r>
+      <w:r>
+        <w:rPr>
+          <w:sz w:val="18"/>
+          <w:szCs w:val="18"/>
+        </w:rPr>
+        <w:t xml:space="preserve">TLS terminates at the ALB with an ACM certificate (free, auto-renewing); HTTP-&gt;HTTPS redirect rule is standard.</w:t>
+      </w:r>
+    </w:p>
+    <w:p>
+      <w:pPr>
+        <w:ind w:left="260" w:hanging="200"/>
+        <w:spacing w:before="0" w:after="25" w:line="230" w:lineRule="auto"/>
+      </w:pPr>
+      <w:r>
+        <w:rPr>
+          <w:sz w:val="18"/>
+          <w:szCs w:val="18"/>
+        </w:rPr>
+        <w:t xml:space="preserve">•   </w:t>
+      </w:r>
+      <w:r>
+        <w:rPr>
+          <w:sz w:val="18"/>
+          <w:szCs w:val="18"/>
+        </w:rPr>
+        <w:t xml:space="preserve">ALB vs NLB: layer 7 features vs layer 4 raw TCP performance/static IPs - the standard comparison question.</w:t>
+      </w:r>
+    </w:p>
+    <w:p>
+      <w:pPr>
+        <w:ind w:left="260" w:hanging="200"/>
+        <w:spacing w:before="0" w:after="25" w:line="230" w:lineRule="auto"/>
+      </w:pPr>
+      <w:r>
+        <w:rPr>
+          <w:sz w:val="18"/>
+          <w:szCs w:val="18"/>
+        </w:rPr>
+        <w:t xml:space="preserve">•   </w:t>
+      </w:r>
+      <w:r>
+        <w:rPr>
+          <w:sz w:val="18"/>
+          <w:szCs w:val="18"/>
+        </w:rPr>
+        <w:t xml:space="preserve">Auto scaling: target tracking (keep CPU at 60%, or requests-per-target at N) is the sane default; step scaling for custom logic; scheduled for known peaks.</w:t>
+      </w:r>
+    </w:p>
+    <w:p>
+      <w:pPr>
+        <w:ind w:left="260" w:hanging="200"/>
+        <w:spacing w:before="0" w:after="25" w:line="230" w:lineRule="auto"/>
+      </w:pPr>
+      <w:r>
+        <w:rPr>
+          <w:sz w:val="18"/>
+          <w:szCs w:val="18"/>
+        </w:rPr>
+        <w:t xml:space="preserve">•   </w:t>
+      </w:r>
+      <w:r>
+        <w:rPr>
+          <w:sz w:val="18"/>
+          <w:szCs w:val="18"/>
+        </w:rPr>
+        <w:t xml:space="preserve">Scale on the right metric: request count per target often beats CPU for I/O-bound APIs.</w:t>
+      </w:r>
+    </w:p>
+    <w:p>
+      <w:pPr>
+        <w:ind w:left="260" w:hanging="200"/>
+        <w:spacing w:before="0" w:after="25" w:line="230" w:lineRule="auto"/>
+      </w:pPr>
+      <w:r>
+        <w:rPr>
+          <w:sz w:val="18"/>
+          <w:szCs w:val="18"/>
+        </w:rPr>
+        <w:t xml:space="preserve">•   </w:t>
+      </w:r>
+      <w:r>
+        <w:rPr>
+          <w:sz w:val="18"/>
+          <w:szCs w:val="18"/>
+        </w:rPr>
+        <w:t xml:space="preserve">Sticky sessions exist but stateless apps + external sessions (Redis) scale cleaner.</w:t>
+      </w:r>
+    </w:p>
+    <w:p>
+      <w:pPr>
+        <w:ind w:left="260" w:hanging="0"/>
+        <w:spacing w:before="0" w:after="15" w:line="230" w:lineRule="auto"/>
+        <w:shd w:val="clear" w:color="auto" w:fill="F2F2F2"/>
+      </w:pPr>
+      <w:r>
+        <w:rPr>
+          <w:b/>
+          <w:sz w:val="17"/>
+          <w:szCs w:val="17"/>
+        </w:rPr>
+        <w:t xml:space="preserve">Example:  </w:t>
+      </w:r>
+      <w:r>
+        <w:rPr>
+          <w:rFonts w:ascii="Consolas" w:hAnsi="Consolas" w:cs="Consolas"/>
+          <w:color w:val="3B3B3B"/>
+          <w:sz w:val="17"/>
+          <w:szCs w:val="17"/>
+        </w:rPr>
+        <w:t xml:space="preserve">listener 443 (ACM cert)</w:t>
+      </w:r>
+    </w:p>
+    <w:p>
+      <w:pPr>
+        <w:ind w:left="260" w:hanging="0"/>
+        <w:spacing w:before="0" w:after="15" w:line="230" w:lineRule="auto"/>
+        <w:shd w:val="clear" w:color="auto" w:fill="F2F2F2"/>
+      </w:pPr>
+      <w:r>
+        <w:rPr>
+          <w:rFonts w:ascii="Consolas" w:hAnsi="Consolas" w:cs="Consolas"/>
+          <w:color w:val="3B3B3B"/>
+          <w:sz w:val="17"/>
+          <w:szCs w:val="17"/>
+        </w:rPr>
+        <w:t xml:space="preserve">  /api/*  -&gt; tg-api  (ECS service A)</w:t>
+      </w:r>
+    </w:p>
+    <w:p>
+      <w:pPr>
+        <w:ind w:left="260" w:hanging="0"/>
+        <w:spacing w:before="0" w:after="15" w:line="230" w:lineRule="auto"/>
+        <w:shd w:val="clear" w:color="auto" w:fill="F2F2F2"/>
+      </w:pPr>
+      <w:r>
+        <w:rPr>
+          <w:rFonts w:ascii="Consolas" w:hAnsi="Consolas" w:cs="Consolas"/>
+          <w:color w:val="3B3B3B"/>
+          <w:sz w:val="17"/>
+          <w:szCs w:val="17"/>
+        </w:rPr>
+        <w:t xml:space="preserve">  /*      -&gt; tg-web  (ECS service B)</w:t>
+      </w:r>
+    </w:p>
+    <w:p>
+      <w:pPr>
+        <w:ind w:left="260" w:hanging="0"/>
+        <w:spacing w:before="0" w:after="15" w:line="230" w:lineRule="auto"/>
+        <w:shd w:val="clear" w:color="auto" w:fill="F2F2F2"/>
+      </w:pPr>
+      <w:r>
+        <w:rPr>
+          <w:rFonts w:ascii="Consolas" w:hAnsi="Consolas" w:cs="Consolas"/>
+          <w:color w:val="3B3B3B"/>
+          <w:sz w:val="17"/>
+          <w:szCs w:val="17"/>
+        </w:rPr>
+        <w:t xml:space="preserve">auto scaling: target-tracking</w:t>
+      </w:r>
+    </w:p>
+    <w:p>
+      <w:pPr>
+        <w:ind w:left="260" w:hanging="0"/>
+        <w:spacing w:before="0" w:after="15" w:line="230" w:lineRule="auto"/>
+        <w:shd w:val="clear" w:color="auto" w:fill="F2F2F2"/>
+      </w:pPr>
+      <w:r>
+        <w:rPr>
+          <w:rFonts w:ascii="Consolas" w:hAnsi="Consolas" w:cs="Consolas"/>
+          <w:color w:val="3B3B3B"/>
+          <w:sz w:val="17"/>
+          <w:szCs w:val="17"/>
+        </w:rPr>
+        <w:t xml:space="preserve">  ALBRequestCountPerTarget = 200</w:t>
+      </w:r>
+    </w:p>
+    <w:p>
+      <w:pPr>
+        <w:ind w:left="120" w:hanging="0"/>
+        <w:spacing w:before="50" w:after="110" w:line="230" w:lineRule="auto"/>
+        <w:pBdr>
+          <w:left w:val="single" w:sz="12" w:space="4" w:color="2E5E1F"/>
+        </w:pBdr>
+      </w:pPr>
+      <w:r>
+        <w:rPr>
+          <w:b/>
+          <w:color w:val="2E5E1F"/>
+          <w:sz w:val="18"/>
+          <w:szCs w:val="18"/>
+        </w:rPr>
+        <w:t xml:space="preserve">Interview answer:  </w:t>
+      </w:r>
+      <w:r>
+        <w:rPr>
+          <w:i/>
+          <w:sz w:val="18"/>
+          <w:szCs w:val="18"/>
+        </w:rPr>
+        <w:t xml:space="preserve">The ALB routes at layer 7 - path and host rules to target groups - terminating TLS with ACM certs, and its health checks gate which tasks receive traffic, enabling zero-downtime rolls. NLB is the layer-4 alternative for raw TCP or static IPs. Scaling uses target tracking - requests-per-target suits I/O-bound APIs better than CPU - and the service adds or removes tasks to hold that target.</w:t>
+      </w:r>
+    </w:p>
+    <w:p>
+      <w:pPr>
+        <w:spacing w:before="140" w:after="40" w:line="230" w:lineRule="auto"/>
+      </w:pPr>
+      <w:r>
+        <w:rPr>
+          <w:b/>
+          <w:sz w:val="21"/>
+          <w:szCs w:val="21"/>
+        </w:rPr>
+        <w:t xml:space="preserve">A2.7  Lambda - Serverless Functions</w:t>
+      </w:r>
+    </w:p>
+    <w:p>
+      <w:pPr>
+        <w:spacing w:before="0" w:after="40" w:line="230" w:lineRule="auto"/>
+      </w:pPr>
+      <w:r>
+        <w:rPr>
+          <w:b/>
+          <w:sz w:val="18"/>
+          <w:szCs w:val="18"/>
+        </w:rPr>
+        <w:t xml:space="preserve">What it is:  </w:t>
+      </w:r>
+      <w:r>
+        <w:rPr>
+          <w:sz w:val="18"/>
+          <w:szCs w:val="18"/>
+        </w:rPr>
+        <w:t xml:space="preserve">Lambda runs code per event with zero servers - billed per millisecond, scaling automatically - ideal for glue, events and spiky workloads.</w:t>
+      </w:r>
+    </w:p>
+    <w:p>
+      <w:pPr>
+        <w:ind w:left="260" w:hanging="200"/>
+        <w:spacing w:before="0" w:after="25" w:line="230" w:lineRule="auto"/>
+      </w:pPr>
+      <w:r>
+        <w:rPr>
+          <w:sz w:val="18"/>
+          <w:szCs w:val="18"/>
+        </w:rPr>
+        <w:t xml:space="preserve">•   </w:t>
+      </w:r>
+      <w:r>
+        <w:rPr>
+          <w:sz w:val="18"/>
+          <w:szCs w:val="18"/>
+        </w:rPr>
+        <w:t xml:space="preserve">Deploy a function (zip or container image up to 10GB); triggers: API Gateway HTTP, S3 events, SQS messages, EventBridge schedules, DynamoDB streams.</w:t>
+      </w:r>
+    </w:p>
+    <w:p>
+      <w:pPr>
+        <w:ind w:left="260" w:hanging="200"/>
+        <w:spacing w:before="0" w:after="25" w:line="230" w:lineRule="auto"/>
+      </w:pPr>
+      <w:r>
+        <w:rPr>
+          <w:sz w:val="18"/>
+          <w:szCs w:val="18"/>
+        </w:rPr>
+        <w:t xml:space="preserve">•   </w:t>
+      </w:r>
+      <w:r>
+        <w:rPr>
+          <w:sz w:val="18"/>
+          <w:szCs w:val="18"/>
+        </w:rPr>
+        <w:t xml:space="preserve">Scale = concurrency: each concurrent event gets an execution environment - thousands in parallel with no config.</w:t>
+      </w:r>
+    </w:p>
+    <w:p>
+      <w:pPr>
+        <w:ind w:left="260" w:hanging="200"/>
+        <w:spacing w:before="0" w:after="25" w:line="230" w:lineRule="auto"/>
+      </w:pPr>
+      <w:r>
+        <w:rPr>
+          <w:sz w:val="18"/>
+          <w:szCs w:val="18"/>
+        </w:rPr>
+        <w:t xml:space="preserve">•   </w:t>
+      </w:r>
+      <w:r>
+        <w:rPr>
+          <w:sz w:val="18"/>
+          <w:szCs w:val="18"/>
+        </w:rPr>
+        <w:t xml:space="preserve">Limits that decide fit: 15-minute max runtime, memory 128MB-10GB (CPU scales with memory), ephemeral /tmp, stateless between invocations.</w:t>
+      </w:r>
+    </w:p>
+    <w:p>
+      <w:pPr>
+        <w:ind w:left="260" w:hanging="200"/>
+        <w:spacing w:before="0" w:after="25" w:line="230" w:lineRule="auto"/>
+      </w:pPr>
+      <w:r>
+        <w:rPr>
+          <w:sz w:val="18"/>
+          <w:szCs w:val="18"/>
+        </w:rPr>
+        <w:t xml:space="preserve">•   </w:t>
+      </w:r>
+      <w:r>
+        <w:rPr>
+          <w:sz w:val="18"/>
+          <w:szCs w:val="18"/>
+        </w:rPr>
+        <w:t xml:space="preserve">Cold start: first invocation in a fresh environment adds latency (Python ~100-400ms) - mitigations: provisioned concurrency, lighter deps, keep-warm pings.</w:t>
+      </w:r>
+    </w:p>
+    <w:p>
+      <w:pPr>
+        <w:ind w:left="260" w:hanging="200"/>
+        <w:spacing w:before="0" w:after="25" w:line="230" w:lineRule="auto"/>
+      </w:pPr>
+      <w:r>
+        <w:rPr>
+          <w:sz w:val="18"/>
+          <w:szCs w:val="18"/>
+        </w:rPr>
+        <w:t xml:space="preserve">•   </w:t>
+      </w:r>
+      <w:r>
+        <w:rPr>
+          <w:sz w:val="18"/>
+          <w:szCs w:val="18"/>
+        </w:rPr>
+        <w:t xml:space="preserve">Right fit: event glue (S3 upload -&gt; thumbnail), scheduled jobs, SQS consumers, spiky/low-traffic APIs. Wrong fit: long-running, steady high-throughput services (a container is cheaper), websockets.</w:t>
+      </w:r>
+    </w:p>
+    <w:p>
+      <w:pPr>
+        <w:ind w:left="260" w:hanging="200"/>
+        <w:spacing w:before="0" w:after="25" w:line="230" w:lineRule="auto"/>
+      </w:pPr>
+      <w:r>
+        <w:rPr>
+          <w:sz w:val="18"/>
+          <w:szCs w:val="18"/>
+        </w:rPr>
+        <w:t xml:space="preserve">•   </w:t>
+      </w:r>
+      <w:r>
+        <w:rPr>
+          <w:sz w:val="18"/>
+          <w:szCs w:val="18"/>
+        </w:rPr>
+        <w:t xml:space="preserve">Lambda + SQS pairing: queue buffers, Lambda consumes with retries and DLQ - the standard async pattern.</w:t>
+      </w:r>
+    </w:p>
+    <w:p>
+      <w:pPr>
+        <w:ind w:left="260" w:hanging="200"/>
+        <w:spacing w:before="0" w:after="25" w:line="230" w:lineRule="auto"/>
+      </w:pPr>
+      <w:r>
+        <w:rPr>
+          <w:sz w:val="18"/>
+          <w:szCs w:val="18"/>
+        </w:rPr>
+        <w:t xml:space="preserve">•   </w:t>
+      </w:r>
+      <w:r>
+        <w:rPr>
+          <w:sz w:val="18"/>
+          <w:szCs w:val="18"/>
+        </w:rPr>
+        <w:t xml:space="preserve">Versus containers: Lambda for event-driven bursts, ECS for always-on services - cost math flips with sustained load.</w:t>
+      </w:r>
+    </w:p>
+    <w:p>
+      <w:pPr>
+        <w:ind w:left="260" w:hanging="0"/>
+        <w:spacing w:before="0" w:after="15" w:line="230" w:lineRule="auto"/>
+        <w:shd w:val="clear" w:color="auto" w:fill="F2F2F2"/>
+      </w:pPr>
+      <w:r>
+        <w:rPr>
+          <w:b/>
+          <w:sz w:val="17"/>
+          <w:szCs w:val="17"/>
+        </w:rPr>
+        <w:t xml:space="preserve">Example:  </w:t>
+      </w:r>
+      <w:r>
+        <w:rPr>
+          <w:rFonts w:ascii="Consolas" w:hAnsi="Consolas" w:cs="Consolas"/>
+          <w:color w:val="3B3B3B"/>
+          <w:sz w:val="17"/>
+          <w:szCs w:val="17"/>
+        </w:rPr>
+        <w:t xml:space="preserve">def handler(event, context):</w:t>
+      </w:r>
+    </w:p>
+    <w:p>
+      <w:pPr>
+        <w:ind w:left="260" w:hanging="0"/>
+        <w:spacing w:before="0" w:after="15" w:line="230" w:lineRule="auto"/>
+        <w:shd w:val="clear" w:color="auto" w:fill="F2F2F2"/>
+      </w:pPr>
+      <w:r>
+        <w:rPr>
+          <w:rFonts w:ascii="Consolas" w:hAnsi="Consolas" w:cs="Consolas"/>
+          <w:color w:val="3B3B3B"/>
+          <w:sz w:val="17"/>
+          <w:szCs w:val="17"/>
+        </w:rPr>
+        <w:t xml:space="preserve">    for rec in event["Records"]:      # SQS batch</w:t>
+      </w:r>
+    </w:p>
+    <w:p>
+      <w:pPr>
+        <w:ind w:left="260" w:hanging="0"/>
+        <w:spacing w:before="0" w:after="15" w:line="230" w:lineRule="auto"/>
+        <w:shd w:val="clear" w:color="auto" w:fill="F2F2F2"/>
+      </w:pPr>
+      <w:r>
+        <w:rPr>
+          <w:rFonts w:ascii="Consolas" w:hAnsi="Consolas" w:cs="Consolas"/>
+          <w:color w:val="3B3B3B"/>
+          <w:sz w:val="17"/>
+          <w:szCs w:val="17"/>
+        </w:rPr>
+        <w:t xml:space="preserve">        order = json.loads(rec["body"])</w:t>
+      </w:r>
+    </w:p>
+    <w:p>
+      <w:pPr>
+        <w:ind w:left="260" w:hanging="0"/>
+        <w:spacing w:before="0" w:after="15" w:line="230" w:lineRule="auto"/>
+        <w:shd w:val="clear" w:color="auto" w:fill="F2F2F2"/>
+      </w:pPr>
+      <w:r>
+        <w:rPr>
+          <w:rFonts w:ascii="Consolas" w:hAnsi="Consolas" w:cs="Consolas"/>
+          <w:color w:val="3B3B3B"/>
+          <w:sz w:val="17"/>
+          <w:szCs w:val="17"/>
+        </w:rPr>
+        <w:t xml:space="preserve">        process(order)</w:t>
+      </w:r>
+    </w:p>
+    <w:p>
+      <w:pPr>
+        <w:ind w:left="260" w:hanging="0"/>
+        <w:spacing w:before="0" w:after="15" w:line="230" w:lineRule="auto"/>
+        <w:shd w:val="clear" w:color="auto" w:fill="F2F2F2"/>
+      </w:pPr>
+      <w:r>
+        <w:rPr>
+          <w:rFonts w:ascii="Consolas" w:hAnsi="Consolas" w:cs="Consolas"/>
+          <w:color w:val="3B3B3B"/>
+          <w:sz w:val="17"/>
+          <w:szCs w:val="17"/>
+        </w:rPr>
+        <w:t xml:space="preserve"># trigger: SQS queue, batch size 10,</w:t>
+      </w:r>
+    </w:p>
+    <w:p>
+      <w:pPr>
+        <w:ind w:left="260" w:hanging="0"/>
+        <w:spacing w:before="0" w:after="15" w:line="230" w:lineRule="auto"/>
+        <w:shd w:val="clear" w:color="auto" w:fill="F2F2F2"/>
+      </w:pPr>
+      <w:r>
+        <w:rPr>
+          <w:rFonts w:ascii="Consolas" w:hAnsi="Consolas" w:cs="Consolas"/>
+          <w:color w:val="3B3B3B"/>
+          <w:sz w:val="17"/>
+          <w:szCs w:val="17"/>
+        </w:rPr>
+        <w:t xml:space="preserve"># DLQ after 3 failed receives</w:t>
+      </w:r>
+    </w:p>
+    <w:p>
+      <w:pPr>
+        <w:ind w:left="120" w:hanging="0"/>
+        <w:spacing w:before="50" w:after="110" w:line="230" w:lineRule="auto"/>
+        <w:pBdr>
+          <w:left w:val="single" w:sz="12" w:space="4" w:color="2E5E1F"/>
+        </w:pBdr>
+      </w:pPr>
+      <w:r>
+        <w:rPr>
+          <w:b/>
+          <w:color w:val="2E5E1F"/>
+          <w:sz w:val="18"/>
+          <w:szCs w:val="18"/>
+        </w:rPr>
+        <w:t xml:space="preserve">Interview answer:  </w:t>
+      </w:r>
+      <w:r>
+        <w:rPr>
+          <w:i/>
+          <w:sz w:val="18"/>
+          <w:szCs w:val="18"/>
+        </w:rPr>
+        <w:t xml:space="preserve">Lambda runs functions per event - S3 uploads, SQS messages, schedules, API Gateway - scaling by concurrency and billed per millisecond. The fit boundaries: 15-minute cap, stateless, cold starts mitigable with provisioned concurrency. I use it for event glue and queue consumers with DLQs, and keep always-on APIs in containers where sustained-load economics win.</w:t>
       </w:r>
     </w:p>
     <w:sectPr>

</xml_diff>

<commit_message>
AWS Phase 3: Data & Messaging (5 topics)
RDS Multi-AZ vs replicas, ElastiCache Redis, DynamoDB fit, SQS/SNS
idempotent consumers + fan-out, Route 53 + CloudFront front door

Co-Authored-By: Claude Fable 5 <noreply@anthropic.com>
Claude-Session: https://claude.ai/code/session_01Vm8nqoCZNTvUn3BNmW1Tgz
</commit_message>
<xml_diff>
--- a/AWS_Interview_Theory.docx
+++ b/AWS_Interview_Theory.docx
@@ -3944,6 +3944,1535 @@
           <w:szCs w:val="18"/>
         </w:rPr>
         <w:t xml:space="preserve">Lambda runs functions per event - S3 uploads, SQS messages, schedules, API Gateway - scaling by concurrency and billed per millisecond. The fit boundaries: 15-minute cap, stateless, cold starts mitigable with provisioned concurrency. I use it for event glue and queue consumers with DLQs, and keep always-on APIs in containers where sustained-load economics win.</w:t>
+      </w:r>
+    </w:p>
+    <w:p>
+      <w:pPr>
+        <w:spacing w:before="200" w:after="60" w:line="230" w:lineRule="auto"/>
+      </w:pPr>
+      <w:r>
+        <w:rPr>
+          <w:b/>
+          <w:color w:val="1F4E79"/>
+          <w:sz w:val="26"/>
+          <w:szCs w:val="26"/>
+        </w:rPr>
+        <w:t xml:space="preserve">AWS Phase 3 - Data and Messaging</w:t>
+      </w:r>
+    </w:p>
+    <w:p>
+      <w:pPr>
+        <w:spacing w:before="140" w:after="40" w:line="230" w:lineRule="auto"/>
+      </w:pPr>
+      <w:r>
+        <w:rPr>
+          <w:b/>
+          <w:sz w:val="21"/>
+          <w:szCs w:val="21"/>
+        </w:rPr>
+        <w:t xml:space="preserve">A3.1  RDS - Managed Relational Databases</w:t>
+      </w:r>
+    </w:p>
+    <w:p>
+      <w:pPr>
+        <w:spacing w:before="0" w:after="40" w:line="230" w:lineRule="auto"/>
+      </w:pPr>
+      <w:r>
+        <w:rPr>
+          <w:b/>
+          <w:sz w:val="18"/>
+          <w:szCs w:val="18"/>
+        </w:rPr>
+        <w:t xml:space="preserve">What it is:  </w:t>
+      </w:r>
+      <w:r>
+        <w:rPr>
+          <w:sz w:val="18"/>
+          <w:szCs w:val="18"/>
+        </w:rPr>
+        <w:t xml:space="preserve">RDS runs Postgres/MySQL managed - backups, patching, failover handled - with Multi-AZ for availability and read replicas for scale.</w:t>
+      </w:r>
+    </w:p>
+    <w:p>
+      <w:pPr>
+        <w:ind w:left="260" w:hanging="200"/>
+        <w:spacing w:before="0" w:after="25" w:line="230" w:lineRule="auto"/>
+      </w:pPr>
+      <w:r>
+        <w:rPr>
+          <w:sz w:val="18"/>
+          <w:szCs w:val="18"/>
+        </w:rPr>
+        <w:t xml:space="preserve">•   </w:t>
+      </w:r>
+      <w:r>
+        <w:rPr>
+          <w:sz w:val="18"/>
+          <w:szCs w:val="18"/>
+        </w:rPr>
+        <w:t xml:space="preserve">Managed = AWS does provisioning, OS/DB patching, automated backups with point-in-time restore, snapshots - no SSH into the DB host.</w:t>
+      </w:r>
+    </w:p>
+    <w:p>
+      <w:pPr>
+        <w:ind w:left="260" w:hanging="200"/>
+        <w:spacing w:before="0" w:after="25" w:line="230" w:lineRule="auto"/>
+      </w:pPr>
+      <w:r>
+        <w:rPr>
+          <w:sz w:val="18"/>
+          <w:szCs w:val="18"/>
+        </w:rPr>
+        <w:t xml:space="preserve">•   </w:t>
+      </w:r>
+      <w:r>
+        <w:rPr>
+          <w:sz w:val="18"/>
+          <w:szCs w:val="18"/>
+        </w:rPr>
+        <w:t xml:space="preserve">Multi-AZ: a synchronous standby in another AZ; failure -&gt; automatic failover (DNS flips, ~1-2 min). It is for AVAILABILITY - the standby serves no reads.</w:t>
+      </w:r>
+    </w:p>
+    <w:p>
+      <w:pPr>
+        <w:ind w:left="260" w:hanging="200"/>
+        <w:spacing w:before="0" w:after="25" w:line="230" w:lineRule="auto"/>
+      </w:pPr>
+      <w:r>
+        <w:rPr>
+          <w:sz w:val="18"/>
+          <w:szCs w:val="18"/>
+        </w:rPr>
+        <w:t xml:space="preserve">•   </w:t>
+      </w:r>
+      <w:r>
+        <w:rPr>
+          <w:sz w:val="18"/>
+          <w:szCs w:val="18"/>
+        </w:rPr>
+        <w:t xml:space="preserve">Read replicas: async copies that DO serve reads - offload reports/dashboards; app routes read-only queries there (replication lag = eventual consistency, know it).</w:t>
+      </w:r>
+    </w:p>
+    <w:p>
+      <w:pPr>
+        <w:ind w:left="260" w:hanging="200"/>
+        <w:spacing w:before="0" w:after="25" w:line="230" w:lineRule="auto"/>
+      </w:pPr>
+      <w:r>
+        <w:rPr>
+          <w:sz w:val="18"/>
+          <w:szCs w:val="18"/>
+        </w:rPr>
+        <w:t xml:space="preserve">•   </w:t>
+      </w:r>
+      <w:r>
+        <w:rPr>
+          <w:sz w:val="18"/>
+          <w:szCs w:val="18"/>
+        </w:rPr>
+        <w:t xml:space="preserve">Multi-AZ vs read replica is THE classic question: availability vs read scaling - production uses both.</w:t>
+      </w:r>
+    </w:p>
+    <w:p>
+      <w:pPr>
+        <w:ind w:left="260" w:hanging="200"/>
+        <w:spacing w:before="0" w:after="25" w:line="230" w:lineRule="auto"/>
+      </w:pPr>
+      <w:r>
+        <w:rPr>
+          <w:sz w:val="18"/>
+          <w:szCs w:val="18"/>
+        </w:rPr>
+        <w:t xml:space="preserve">•   </w:t>
+      </w:r>
+      <w:r>
+        <w:rPr>
+          <w:sz w:val="18"/>
+          <w:szCs w:val="18"/>
+        </w:rPr>
+        <w:t xml:space="preserve">Connections: apps connect via endpoint DNS; SG allows 5432 only from app SG; credentials from Secrets Manager; RDS Proxy pools connections for Lambda/many-task setups.</w:t>
+      </w:r>
+    </w:p>
+    <w:p>
+      <w:pPr>
+        <w:ind w:left="260" w:hanging="200"/>
+        <w:spacing w:before="0" w:after="25" w:line="230" w:lineRule="auto"/>
+      </w:pPr>
+      <w:r>
+        <w:rPr>
+          <w:sz w:val="18"/>
+          <w:szCs w:val="18"/>
+        </w:rPr>
+        <w:t xml:space="preserve">•   </w:t>
+      </w:r>
+      <w:r>
+        <w:rPr>
+          <w:sz w:val="18"/>
+          <w:szCs w:val="18"/>
+        </w:rPr>
+        <w:t xml:space="preserve">Aurora: AWS's re-engineered engine - shared storage across 6 copies, faster failover, serverless v2 autoscaling - name it as the step up.</w:t>
+      </w:r>
+    </w:p>
+    <w:p>
+      <w:pPr>
+        <w:ind w:left="260" w:hanging="200"/>
+        <w:spacing w:before="0" w:after="25" w:line="230" w:lineRule="auto"/>
+      </w:pPr>
+      <w:r>
+        <w:rPr>
+          <w:sz w:val="18"/>
+          <w:szCs w:val="18"/>
+        </w:rPr>
+        <w:t xml:space="preserve">•   </w:t>
+      </w:r>
+      <w:r>
+        <w:rPr>
+          <w:sz w:val="18"/>
+          <w:szCs w:val="18"/>
+        </w:rPr>
+        <w:t xml:space="preserve">Storage autoscaling, Performance Insights for slow-query hunting.</w:t>
+      </w:r>
+    </w:p>
+    <w:p>
+      <w:pPr>
+        <w:ind w:left="260" w:hanging="0"/>
+        <w:spacing w:before="0" w:after="15" w:line="230" w:lineRule="auto"/>
+        <w:shd w:val="clear" w:color="auto" w:fill="F2F2F2"/>
+      </w:pPr>
+      <w:r>
+        <w:rPr>
+          <w:b/>
+          <w:sz w:val="17"/>
+          <w:szCs w:val="17"/>
+        </w:rPr>
+        <w:t xml:space="preserve">Example:  </w:t>
+      </w:r>
+      <w:r>
+        <w:rPr>
+          <w:rFonts w:ascii="Consolas" w:hAnsi="Consolas" w:cs="Consolas"/>
+          <w:color w:val="3B3B3B"/>
+          <w:sz w:val="17"/>
+          <w:szCs w:val="17"/>
+        </w:rPr>
+        <w:t xml:space="preserve">DATABASE_URL = (</w:t>
+      </w:r>
+    </w:p>
+    <w:p>
+      <w:pPr>
+        <w:ind w:left="260" w:hanging="0"/>
+        <w:spacing w:before="0" w:after="15" w:line="230" w:lineRule="auto"/>
+        <w:shd w:val="clear" w:color="auto" w:fill="F2F2F2"/>
+      </w:pPr>
+      <w:r>
+        <w:rPr>
+          <w:rFonts w:ascii="Consolas" w:hAnsi="Consolas" w:cs="Consolas"/>
+          <w:color w:val="3B3B3B"/>
+          <w:sz w:val="17"/>
+          <w:szCs w:val="17"/>
+        </w:rPr>
+        <w:t xml:space="preserve"> "postgresql://app:" + secret +</w:t>
+      </w:r>
+    </w:p>
+    <w:p>
+      <w:pPr>
+        <w:ind w:left="260" w:hanging="0"/>
+        <w:spacing w:before="0" w:after="15" w:line="230" w:lineRule="auto"/>
+        <w:shd w:val="clear" w:color="auto" w:fill="F2F2F2"/>
+      </w:pPr>
+      <w:r>
+        <w:rPr>
+          <w:rFonts w:ascii="Consolas" w:hAnsi="Consolas" w:cs="Consolas"/>
+          <w:color w:val="3B3B3B"/>
+          <w:sz w:val="17"/>
+          <w:szCs w:val="17"/>
+        </w:rPr>
+        <w:t xml:space="preserve"> "@mailflow.abc123.ap-south-1"</w:t>
+      </w:r>
+    </w:p>
+    <w:p>
+      <w:pPr>
+        <w:ind w:left="260" w:hanging="0"/>
+        <w:spacing w:before="0" w:after="15" w:line="230" w:lineRule="auto"/>
+        <w:shd w:val="clear" w:color="auto" w:fill="F2F2F2"/>
+      </w:pPr>
+      <w:r>
+        <w:rPr>
+          <w:rFonts w:ascii="Consolas" w:hAnsi="Consolas" w:cs="Consolas"/>
+          <w:color w:val="3B3B3B"/>
+          <w:sz w:val="17"/>
+          <w:szCs w:val="17"/>
+        </w:rPr>
+        <w:t xml:space="preserve"> ".rds.amazonaws.com:5432/mailflow")</w:t>
+      </w:r>
+    </w:p>
+    <w:p>
+      <w:pPr>
+        <w:ind w:left="260" w:hanging="0"/>
+        <w:spacing w:before="0" w:after="15" w:line="230" w:lineRule="auto"/>
+        <w:shd w:val="clear" w:color="auto" w:fill="F2F2F2"/>
+      </w:pPr>
+      <w:r>
+        <w:rPr>
+          <w:rFonts w:ascii="Consolas" w:hAnsi="Consolas" w:cs="Consolas"/>
+          <w:color w:val="3B3B3B"/>
+          <w:sz w:val="17"/>
+          <w:szCs w:val="17"/>
+        </w:rPr>
+        <w:t xml:space="preserve"># SG: 5432 from app-sg only</w:t>
+      </w:r>
+    </w:p>
+    <w:p>
+      <w:pPr>
+        <w:ind w:left="260" w:hanging="0"/>
+        <w:spacing w:before="0" w:after="15" w:line="230" w:lineRule="auto"/>
+        <w:shd w:val="clear" w:color="auto" w:fill="F2F2F2"/>
+      </w:pPr>
+      <w:r>
+        <w:rPr>
+          <w:rFonts w:ascii="Consolas" w:hAnsi="Consolas" w:cs="Consolas"/>
+          <w:color w:val="3B3B3B"/>
+          <w:sz w:val="17"/>
+          <w:szCs w:val="17"/>
+        </w:rPr>
+        <w:t xml:space="preserve"># reads -&gt; replica endpoint</w:t>
+      </w:r>
+    </w:p>
+    <w:p>
+      <w:pPr>
+        <w:ind w:left="120" w:hanging="0"/>
+        <w:spacing w:before="50" w:after="110" w:line="230" w:lineRule="auto"/>
+        <w:pBdr>
+          <w:left w:val="single" w:sz="12" w:space="4" w:color="2E5E1F"/>
+        </w:pBdr>
+      </w:pPr>
+      <w:r>
+        <w:rPr>
+          <w:b/>
+          <w:color w:val="2E5E1F"/>
+          <w:sz w:val="18"/>
+          <w:szCs w:val="18"/>
+        </w:rPr>
+        <w:t xml:space="preserve">Interview answer:  </w:t>
+      </w:r>
+      <w:r>
+        <w:rPr>
+          <w:i/>
+          <w:sz w:val="18"/>
+          <w:szCs w:val="18"/>
+        </w:rPr>
+        <w:t xml:space="preserve">RDS is managed Postgres/MySQL - automated backups, patching and point-in-time restore. Multi-AZ keeps a synchronous standby for automatic failover (availability, no reads); read replicas are async and serve read traffic with some lag (scaling) - production uses both. Access flows through SG chains and Secrets Manager, RDS Proxy pools connections, and Aurora is the higher-end engine to name.</w:t>
+      </w:r>
+    </w:p>
+    <w:p>
+      <w:pPr>
+        <w:spacing w:before="140" w:after="40" w:line="230" w:lineRule="auto"/>
+      </w:pPr>
+      <w:r>
+        <w:rPr>
+          <w:b/>
+          <w:sz w:val="21"/>
+          <w:szCs w:val="21"/>
+        </w:rPr>
+        <w:t xml:space="preserve">A3.2  ElastiCache - Redis on AWS</w:t>
+      </w:r>
+    </w:p>
+    <w:p>
+      <w:pPr>
+        <w:spacing w:before="0" w:after="40" w:line="230" w:lineRule="auto"/>
+      </w:pPr>
+      <w:r>
+        <w:rPr>
+          <w:b/>
+          <w:sz w:val="18"/>
+          <w:szCs w:val="18"/>
+        </w:rPr>
+        <w:t xml:space="preserve">What it is:  </w:t>
+      </w:r>
+      <w:r>
+        <w:rPr>
+          <w:sz w:val="18"/>
+          <w:szCs w:val="18"/>
+        </w:rPr>
+        <w:t xml:space="preserve">ElastiCache is managed Redis (or Memcached) - the shared in-memory layer for caching, sessions, rate limiting and queues.</w:t>
+      </w:r>
+    </w:p>
+    <w:p>
+      <w:pPr>
+        <w:ind w:left="260" w:hanging="200"/>
+        <w:spacing w:before="0" w:after="25" w:line="230" w:lineRule="auto"/>
+      </w:pPr>
+      <w:r>
+        <w:rPr>
+          <w:sz w:val="18"/>
+          <w:szCs w:val="18"/>
+        </w:rPr>
+        <w:t xml:space="preserve">•   </w:t>
+      </w:r>
+      <w:r>
+        <w:rPr>
+          <w:sz w:val="18"/>
+          <w:szCs w:val="18"/>
+        </w:rPr>
+        <w:t xml:space="preserve">Managed Redis: patching, failover, replication handled; app code is unchanged - same redis client, an AWS endpoint.</w:t>
+      </w:r>
+    </w:p>
+    <w:p>
+      <w:pPr>
+        <w:ind w:left="260" w:hanging="200"/>
+        <w:spacing w:before="0" w:after="25" w:line="230" w:lineRule="auto"/>
+      </w:pPr>
+      <w:r>
+        <w:rPr>
+          <w:sz w:val="18"/>
+          <w:szCs w:val="18"/>
+        </w:rPr>
+        <w:t xml:space="preserve">•   </w:t>
+      </w:r>
+      <w:r>
+        <w:rPr>
+          <w:sz w:val="18"/>
+          <w:szCs w:val="18"/>
+        </w:rPr>
+        <w:t xml:space="preserve">Use cases from my stack: Django/FastAPI cache backend, session store, DRF throttle counters, Celery broker, hot API response caching.</w:t>
+      </w:r>
+    </w:p>
+    <w:p>
+      <w:pPr>
+        <w:ind w:left="260" w:hanging="200"/>
+        <w:spacing w:before="0" w:after="25" w:line="230" w:lineRule="auto"/>
+      </w:pPr>
+      <w:r>
+        <w:rPr>
+          <w:sz w:val="18"/>
+          <w:szCs w:val="18"/>
+        </w:rPr>
+        <w:t xml:space="preserve">•   </w:t>
+      </w:r>
+      <w:r>
+        <w:rPr>
+          <w:sz w:val="18"/>
+          <w:szCs w:val="18"/>
+        </w:rPr>
+        <w:t xml:space="preserve">Cluster mode off = primary + replicas (failover HA); cluster mode on = sharded across nodes for write scale.</w:t>
+      </w:r>
+    </w:p>
+    <w:p>
+      <w:pPr>
+        <w:ind w:left="260" w:hanging="200"/>
+        <w:spacing w:before="0" w:after="25" w:line="230" w:lineRule="auto"/>
+      </w:pPr>
+      <w:r>
+        <w:rPr>
+          <w:sz w:val="18"/>
+          <w:szCs w:val="18"/>
+        </w:rPr>
+        <w:t xml:space="preserve">•   </w:t>
+      </w:r>
+      <w:r>
+        <w:rPr>
+          <w:sz w:val="18"/>
+          <w:szCs w:val="18"/>
+        </w:rPr>
+        <w:t xml:space="preserve">Cache patterns: cache-aside (app checks cache, misses to DB, fills cache) is the default; TTLs on everything; invalidation on writes - same discipline as the Django caching notes.</w:t>
+      </w:r>
+    </w:p>
+    <w:p>
+      <w:pPr>
+        <w:ind w:left="260" w:hanging="200"/>
+        <w:spacing w:before="0" w:after="25" w:line="230" w:lineRule="auto"/>
+      </w:pPr>
+      <w:r>
+        <w:rPr>
+          <w:sz w:val="18"/>
+          <w:szCs w:val="18"/>
+        </w:rPr>
+        <w:t xml:space="preserve">•   </w:t>
+      </w:r>
+      <w:r>
+        <w:rPr>
+          <w:sz w:val="18"/>
+          <w:szCs w:val="18"/>
+        </w:rPr>
+        <w:t xml:space="preserve">Eviction policy when memory fills: allkeys-lru typical for pure cache; noeviction for queues (writes fail loudly instead of silently dropping jobs).</w:t>
+      </w:r>
+    </w:p>
+    <w:p>
+      <w:pPr>
+        <w:ind w:left="260" w:hanging="200"/>
+        <w:spacing w:before="0" w:after="25" w:line="230" w:lineRule="auto"/>
+      </w:pPr>
+      <w:r>
+        <w:rPr>
+          <w:sz w:val="18"/>
+          <w:szCs w:val="18"/>
+        </w:rPr>
+        <w:t xml:space="preserve">•   </w:t>
+      </w:r>
+      <w:r>
+        <w:rPr>
+          <w:sz w:val="18"/>
+          <w:szCs w:val="18"/>
+        </w:rPr>
+        <w:t xml:space="preserve">In-VPC only, SG-controlled - not internet-exposed; encryption + AUTH token for compliance.</w:t>
+      </w:r>
+    </w:p>
+    <w:p>
+      <w:pPr>
+        <w:ind w:left="260" w:hanging="200"/>
+        <w:spacing w:before="0" w:after="25" w:line="230" w:lineRule="auto"/>
+      </w:pPr>
+      <w:r>
+        <w:rPr>
+          <w:sz w:val="18"/>
+          <w:szCs w:val="18"/>
+        </w:rPr>
+        <w:t xml:space="preserve">•   </w:t>
+      </w:r>
+      <w:r>
+        <w:rPr>
+          <w:sz w:val="18"/>
+          <w:szCs w:val="18"/>
+        </w:rPr>
+        <w:t xml:space="preserve">Valkey (Redis fork) engine option post-license-change - naming it shows currency.</w:t>
+      </w:r>
+    </w:p>
+    <w:p>
+      <w:pPr>
+        <w:ind w:left="260" w:hanging="0"/>
+        <w:spacing w:before="0" w:after="15" w:line="230" w:lineRule="auto"/>
+        <w:shd w:val="clear" w:color="auto" w:fill="F2F2F2"/>
+      </w:pPr>
+      <w:r>
+        <w:rPr>
+          <w:b/>
+          <w:sz w:val="17"/>
+          <w:szCs w:val="17"/>
+        </w:rPr>
+        <w:t xml:space="preserve">Example:  </w:t>
+      </w:r>
+      <w:r>
+        <w:rPr>
+          <w:rFonts w:ascii="Consolas" w:hAnsi="Consolas" w:cs="Consolas"/>
+          <w:color w:val="3B3B3B"/>
+          <w:sz w:val="17"/>
+          <w:szCs w:val="17"/>
+        </w:rPr>
+        <w:t xml:space="preserve">CACHES = {"default": {</w:t>
+      </w:r>
+    </w:p>
+    <w:p>
+      <w:pPr>
+        <w:ind w:left="260" w:hanging="0"/>
+        <w:spacing w:before="0" w:after="15" w:line="230" w:lineRule="auto"/>
+        <w:shd w:val="clear" w:color="auto" w:fill="F2F2F2"/>
+      </w:pPr>
+      <w:r>
+        <w:rPr>
+          <w:rFonts w:ascii="Consolas" w:hAnsi="Consolas" w:cs="Consolas"/>
+          <w:color w:val="3B3B3B"/>
+          <w:sz w:val="17"/>
+          <w:szCs w:val="17"/>
+        </w:rPr>
+        <w:t xml:space="preserve">  "BACKEND": "django_redis.cache.RedisCache",</w:t>
+      </w:r>
+    </w:p>
+    <w:p>
+      <w:pPr>
+        <w:ind w:left="260" w:hanging="0"/>
+        <w:spacing w:before="0" w:after="15" w:line="230" w:lineRule="auto"/>
+        <w:shd w:val="clear" w:color="auto" w:fill="F2F2F2"/>
+      </w:pPr>
+      <w:r>
+        <w:rPr>
+          <w:rFonts w:ascii="Consolas" w:hAnsi="Consolas" w:cs="Consolas"/>
+          <w:color w:val="3B3B3B"/>
+          <w:sz w:val="17"/>
+          <w:szCs w:val="17"/>
+        </w:rPr>
+        <w:t xml:space="preserve">  "LOCATION":</w:t>
+      </w:r>
+    </w:p>
+    <w:p>
+      <w:pPr>
+        <w:ind w:left="260" w:hanging="0"/>
+        <w:spacing w:before="0" w:after="15" w:line="230" w:lineRule="auto"/>
+        <w:shd w:val="clear" w:color="auto" w:fill="F2F2F2"/>
+      </w:pPr>
+      <w:r>
+        <w:rPr>
+          <w:rFonts w:ascii="Consolas" w:hAnsi="Consolas" w:cs="Consolas"/>
+          <w:color w:val="3B3B3B"/>
+          <w:sz w:val="17"/>
+          <w:szCs w:val="17"/>
+        </w:rPr>
+        <w:t xml:space="preserve">   "rediss://mailflow-cache.abc.cache"</w:t>
+      </w:r>
+    </w:p>
+    <w:p>
+      <w:pPr>
+        <w:ind w:left="260" w:hanging="0"/>
+        <w:spacing w:before="0" w:after="15" w:line="230" w:lineRule="auto"/>
+        <w:shd w:val="clear" w:color="auto" w:fill="F2F2F2"/>
+      </w:pPr>
+      <w:r>
+        <w:rPr>
+          <w:rFonts w:ascii="Consolas" w:hAnsi="Consolas" w:cs="Consolas"/>
+          <w:color w:val="3B3B3B"/>
+          <w:sz w:val="17"/>
+          <w:szCs w:val="17"/>
+        </w:rPr>
+        <w:t xml:space="preserve">   ".amazonaws.com:6379/1"}}</w:t>
+      </w:r>
+    </w:p>
+    <w:p>
+      <w:pPr>
+        <w:ind w:left="260" w:hanging="0"/>
+        <w:spacing w:before="0" w:after="15" w:line="230" w:lineRule="auto"/>
+        <w:shd w:val="clear" w:color="auto" w:fill="F2F2F2"/>
+      </w:pPr>
+      <w:r>
+        <w:rPr>
+          <w:rFonts w:ascii="Consolas" w:hAnsi="Consolas" w:cs="Consolas"/>
+          <w:color w:val="3B3B3B"/>
+          <w:sz w:val="17"/>
+          <w:szCs w:val="17"/>
+        </w:rPr>
+        <w:t xml:space="preserve"># same client, managed endpoint</w:t>
+      </w:r>
+    </w:p>
+    <w:p>
+      <w:pPr>
+        <w:ind w:left="120" w:hanging="0"/>
+        <w:spacing w:before="50" w:after="110" w:line="230" w:lineRule="auto"/>
+        <w:pBdr>
+          <w:left w:val="single" w:sz="12" w:space="4" w:color="2E5E1F"/>
+        </w:pBdr>
+      </w:pPr>
+      <w:r>
+        <w:rPr>
+          <w:b/>
+          <w:color w:val="2E5E1F"/>
+          <w:sz w:val="18"/>
+          <w:szCs w:val="18"/>
+        </w:rPr>
+        <w:t xml:space="preserve">Interview answer:  </w:t>
+      </w:r>
+      <w:r>
+        <w:rPr>
+          <w:i/>
+          <w:sz w:val="18"/>
+          <w:szCs w:val="18"/>
+        </w:rPr>
+        <w:t xml:space="preserve">ElastiCache is managed Redis - the shared memory layer my apps already use for caching, sessions, throttling and Celery brokering, just with an AWS endpoint and no node ops. Replication gives failover, cluster mode shards for scale, cache-aside with TTLs is the working pattern, and eviction policy matters: LRU for caches but noeviction where Redis backs a queue.</w:t>
+      </w:r>
+    </w:p>
+    <w:p>
+      <w:pPr>
+        <w:spacing w:before="140" w:after="40" w:line="230" w:lineRule="auto"/>
+      </w:pPr>
+      <w:r>
+        <w:rPr>
+          <w:b/>
+          <w:sz w:val="21"/>
+          <w:szCs w:val="21"/>
+        </w:rPr>
+        <w:t xml:space="preserve">A3.3  DynamoDB - When NoSQL (short)</w:t>
+      </w:r>
+    </w:p>
+    <w:p>
+      <w:pPr>
+        <w:spacing w:before="0" w:after="40" w:line="230" w:lineRule="auto"/>
+      </w:pPr>
+      <w:r>
+        <w:rPr>
+          <w:b/>
+          <w:sz w:val="18"/>
+          <w:szCs w:val="18"/>
+        </w:rPr>
+        <w:t xml:space="preserve">What it is:  </w:t>
+      </w:r>
+      <w:r>
+        <w:rPr>
+          <w:sz w:val="18"/>
+          <w:szCs w:val="18"/>
+        </w:rPr>
+        <w:t xml:space="preserve">DynamoDB is AWS's serverless key-value store - single-digit-millisecond lookups at any scale, in exchange for query-pattern-first design.</w:t>
+      </w:r>
+    </w:p>
+    <w:p>
+      <w:pPr>
+        <w:ind w:left="260" w:hanging="200"/>
+        <w:spacing w:before="0" w:after="25" w:line="230" w:lineRule="auto"/>
+      </w:pPr>
+      <w:r>
+        <w:rPr>
+          <w:sz w:val="18"/>
+          <w:szCs w:val="18"/>
+        </w:rPr>
+        <w:t xml:space="preserve">•   </w:t>
+      </w:r>
+      <w:r>
+        <w:rPr>
+          <w:sz w:val="18"/>
+          <w:szCs w:val="18"/>
+        </w:rPr>
+        <w:t xml:space="preserve">Serverless: no instances, pay per request (on-demand) or provisioned capacity; scales automatically.</w:t>
+      </w:r>
+    </w:p>
+    <w:p>
+      <w:pPr>
+        <w:ind w:left="260" w:hanging="200"/>
+        <w:spacing w:before="0" w:after="25" w:line="230" w:lineRule="auto"/>
+      </w:pPr>
+      <w:r>
+        <w:rPr>
+          <w:sz w:val="18"/>
+          <w:szCs w:val="18"/>
+        </w:rPr>
+        <w:t xml:space="preserve">•   </w:t>
+      </w:r>
+      <w:r>
+        <w:rPr>
+          <w:sz w:val="18"/>
+          <w:szCs w:val="18"/>
+        </w:rPr>
+        <w:t xml:space="preserve">Model: partition key (+ optional sort key) -&gt; item. Blazing for get-by-key and key-range queries; no joins, no ad-hoc SQL.</w:t>
+      </w:r>
+    </w:p>
+    <w:p>
+      <w:pPr>
+        <w:ind w:left="260" w:hanging="200"/>
+        <w:spacing w:before="0" w:after="25" w:line="230" w:lineRule="auto"/>
+      </w:pPr>
+      <w:r>
+        <w:rPr>
+          <w:sz w:val="18"/>
+          <w:szCs w:val="18"/>
+        </w:rPr>
+        <w:t xml:space="preserve">•   </w:t>
+      </w:r>
+      <w:r>
+        <w:rPr>
+          <w:sz w:val="18"/>
+          <w:szCs w:val="18"/>
+        </w:rPr>
+        <w:t xml:space="preserve">Design is access-pattern-first: know the queries, shape the keys; GSIs (secondary indexes) add alternate lookups at extra cost.</w:t>
+      </w:r>
+    </w:p>
+    <w:p>
+      <w:pPr>
+        <w:ind w:left="260" w:hanging="200"/>
+        <w:spacing w:before="0" w:after="25" w:line="230" w:lineRule="auto"/>
+      </w:pPr>
+      <w:r>
+        <w:rPr>
+          <w:sz w:val="18"/>
+          <w:szCs w:val="18"/>
+        </w:rPr>
+        <w:t xml:space="preserve">•   </w:t>
+      </w:r>
+      <w:r>
+        <w:rPr>
+          <w:sz w:val="18"/>
+          <w:szCs w:val="18"/>
+        </w:rPr>
+        <w:t xml:space="preserve">Fits: sessions, carts, user profiles, IoT/event firehoses, feature flags - simple lookups at brutal scale.</w:t>
+      </w:r>
+    </w:p>
+    <w:p>
+      <w:pPr>
+        <w:ind w:left="260" w:hanging="200"/>
+        <w:spacing w:before="0" w:after="25" w:line="230" w:lineRule="auto"/>
+      </w:pPr>
+      <w:r>
+        <w:rPr>
+          <w:sz w:val="18"/>
+          <w:szCs w:val="18"/>
+        </w:rPr>
+        <w:t xml:space="preserve">•   </w:t>
+      </w:r>
+      <w:r>
+        <w:rPr>
+          <w:sz w:val="18"/>
+          <w:szCs w:val="18"/>
+        </w:rPr>
+        <w:t xml:space="preserve">Does not fit: relational data, flexible reporting, aggregations - that stays in RDS; scan operations are the anti-pattern tax.</w:t>
+      </w:r>
+    </w:p>
+    <w:p>
+      <w:pPr>
+        <w:ind w:left="260" w:hanging="200"/>
+        <w:spacing w:before="0" w:after="25" w:line="230" w:lineRule="auto"/>
+      </w:pPr>
+      <w:r>
+        <w:rPr>
+          <w:sz w:val="18"/>
+          <w:szCs w:val="18"/>
+        </w:rPr>
+        <w:t xml:space="preserve">•   </w:t>
+      </w:r>
+      <w:r>
+        <w:rPr>
+          <w:sz w:val="18"/>
+          <w:szCs w:val="18"/>
+        </w:rPr>
+        <w:t xml:space="preserve">Extras worth naming: TTL auto-expiry, streams (change events -&gt; Lambda), global tables (multi-region).</w:t>
+      </w:r>
+    </w:p>
+    <w:p>
+      <w:pPr>
+        <w:ind w:left="260" w:hanging="200"/>
+        <w:spacing w:before="0" w:after="25" w:line="230" w:lineRule="auto"/>
+      </w:pPr>
+      <w:r>
+        <w:rPr>
+          <w:sz w:val="18"/>
+          <w:szCs w:val="18"/>
+        </w:rPr>
+        <w:t xml:space="preserve">•   </w:t>
+      </w:r>
+      <w:r>
+        <w:rPr>
+          <w:sz w:val="18"/>
+          <w:szCs w:val="18"/>
+        </w:rPr>
+        <w:t xml:space="preserve">Honest 3-YOE answer: default to Postgres; reach for DynamoDB when a known key-value pattern must scale beyond comfortable RDS territory.</w:t>
+      </w:r>
+    </w:p>
+    <w:p>
+      <w:pPr>
+        <w:ind w:left="260" w:hanging="0"/>
+        <w:spacing w:before="0" w:after="15" w:line="230" w:lineRule="auto"/>
+        <w:shd w:val="clear" w:color="auto" w:fill="F2F2F2"/>
+      </w:pPr>
+      <w:r>
+        <w:rPr>
+          <w:b/>
+          <w:sz w:val="17"/>
+          <w:szCs w:val="17"/>
+        </w:rPr>
+        <w:t xml:space="preserve">Example:  </w:t>
+      </w:r>
+      <w:r>
+        <w:rPr>
+          <w:rFonts w:ascii="Consolas" w:hAnsi="Consolas" w:cs="Consolas"/>
+          <w:color w:val="3B3B3B"/>
+          <w:sz w:val="17"/>
+          <w:szCs w:val="17"/>
+        </w:rPr>
+        <w:t xml:space="preserve">table.get_item(Key={</w:t>
+      </w:r>
+    </w:p>
+    <w:p>
+      <w:pPr>
+        <w:ind w:left="260" w:hanging="0"/>
+        <w:spacing w:before="0" w:after="15" w:line="230" w:lineRule="auto"/>
+        <w:shd w:val="clear" w:color="auto" w:fill="F2F2F2"/>
+      </w:pPr>
+      <w:r>
+        <w:rPr>
+          <w:rFonts w:ascii="Consolas" w:hAnsi="Consolas" w:cs="Consolas"/>
+          <w:color w:val="3B3B3B"/>
+          <w:sz w:val="17"/>
+          <w:szCs w:val="17"/>
+        </w:rPr>
+        <w:t xml:space="preserve">  "pk": f"USER#{uid}",</w:t>
+      </w:r>
+    </w:p>
+    <w:p>
+      <w:pPr>
+        <w:ind w:left="260" w:hanging="0"/>
+        <w:spacing w:before="0" w:after="15" w:line="230" w:lineRule="auto"/>
+        <w:shd w:val="clear" w:color="auto" w:fill="F2F2F2"/>
+      </w:pPr>
+      <w:r>
+        <w:rPr>
+          <w:rFonts w:ascii="Consolas" w:hAnsi="Consolas" w:cs="Consolas"/>
+          <w:color w:val="3B3B3B"/>
+          <w:sz w:val="17"/>
+          <w:szCs w:val="17"/>
+        </w:rPr>
+        <w:t xml:space="preserve">  "sk": "CART"})</w:t>
+      </w:r>
+    </w:p>
+    <w:p>
+      <w:pPr>
+        <w:ind w:left="260" w:hanging="0"/>
+        <w:spacing w:before="0" w:after="15" w:line="230" w:lineRule="auto"/>
+        <w:shd w:val="clear" w:color="auto" w:fill="F2F2F2"/>
+      </w:pPr>
+      <w:r>
+        <w:rPr>
+          <w:rFonts w:ascii="Consolas" w:hAnsi="Consolas" w:cs="Consolas"/>
+          <w:color w:val="3B3B3B"/>
+          <w:sz w:val="17"/>
+          <w:szCs w:val="17"/>
+        </w:rPr>
+        <w:t xml:space="preserve"># ms lookup at any scale;</w:t>
+      </w:r>
+    </w:p>
+    <w:p>
+      <w:pPr>
+        <w:ind w:left="260" w:hanging="0"/>
+        <w:spacing w:before="0" w:after="15" w:line="230" w:lineRule="auto"/>
+        <w:shd w:val="clear" w:color="auto" w:fill="F2F2F2"/>
+      </w:pPr>
+      <w:r>
+        <w:rPr>
+          <w:rFonts w:ascii="Consolas" w:hAnsi="Consolas" w:cs="Consolas"/>
+          <w:color w:val="3B3B3B"/>
+          <w:sz w:val="17"/>
+          <w:szCs w:val="17"/>
+        </w:rPr>
+        <w:t xml:space="preserve"># but no JOIN, no ad-hoc SQL</w:t>
+      </w:r>
+    </w:p>
+    <w:p>
+      <w:pPr>
+        <w:ind w:left="120" w:hanging="0"/>
+        <w:spacing w:before="50" w:after="110" w:line="230" w:lineRule="auto"/>
+        <w:pBdr>
+          <w:left w:val="single" w:sz="12" w:space="4" w:color="2E5E1F"/>
+        </w:pBdr>
+      </w:pPr>
+      <w:r>
+        <w:rPr>
+          <w:b/>
+          <w:color w:val="2E5E1F"/>
+          <w:sz w:val="18"/>
+          <w:szCs w:val="18"/>
+        </w:rPr>
+        <w:t xml:space="preserve">Interview answer:  </w:t>
+      </w:r>
+      <w:r>
+        <w:rPr>
+          <w:i/>
+          <w:sz w:val="18"/>
+          <w:szCs w:val="18"/>
+        </w:rPr>
+        <w:t xml:space="preserve">DynamoDB is serverless key-value storage with constant-millisecond lookups at any scale - but it demands access-pattern-first design: partition/sort keys shaped to the queries, GSIs for alternates, no joins or ad-hoc analytics. I keep relational and reporting data in RDS and use DynamoDB for high-scale simple lookups like sessions and event streams.</w:t>
+      </w:r>
+    </w:p>
+    <w:p>
+      <w:pPr>
+        <w:spacing w:before="140" w:after="40" w:line="230" w:lineRule="auto"/>
+      </w:pPr>
+      <w:r>
+        <w:rPr>
+          <w:b/>
+          <w:sz w:val="21"/>
+          <w:szCs w:val="21"/>
+        </w:rPr>
+        <w:t xml:space="preserve">A3.4  SQS and SNS - Queues and Pub/Sub</w:t>
+      </w:r>
+    </w:p>
+    <w:p>
+      <w:pPr>
+        <w:spacing w:before="0" w:after="40" w:line="230" w:lineRule="auto"/>
+      </w:pPr>
+      <w:r>
+        <w:rPr>
+          <w:b/>
+          <w:sz w:val="18"/>
+          <w:szCs w:val="18"/>
+        </w:rPr>
+        <w:t xml:space="preserve">What it is:  </w:t>
+      </w:r>
+      <w:r>
+        <w:rPr>
+          <w:sz w:val="18"/>
+          <w:szCs w:val="18"/>
+        </w:rPr>
+        <w:t xml:space="preserve">SQS is a message queue - one consumer group works off each message; SNS is pub/sub - one event fans out to many subscribers.</w:t>
+      </w:r>
+    </w:p>
+    <w:p>
+      <w:pPr>
+        <w:ind w:left="260" w:hanging="200"/>
+        <w:spacing w:before="0" w:after="25" w:line="230" w:lineRule="auto"/>
+      </w:pPr>
+      <w:r>
+        <w:rPr>
+          <w:sz w:val="18"/>
+          <w:szCs w:val="18"/>
+        </w:rPr>
+        <w:t xml:space="preserve">•   </w:t>
+      </w:r>
+      <w:r>
+        <w:rPr>
+          <w:sz w:val="18"/>
+          <w:szCs w:val="18"/>
+        </w:rPr>
+        <w:t xml:space="preserve">SQS: producers enqueue, consumers poll, process, delete. Visibility timeout hides an in-flight message; crash = message reappears - at-least-once delivery, so consumers must be IDEMPOTENT (the key word).</w:t>
+      </w:r>
+    </w:p>
+    <w:p>
+      <w:pPr>
+        <w:ind w:left="260" w:hanging="200"/>
+        <w:spacing w:before="0" w:after="25" w:line="230" w:lineRule="auto"/>
+      </w:pPr>
+      <w:r>
+        <w:rPr>
+          <w:sz w:val="18"/>
+          <w:szCs w:val="18"/>
+        </w:rPr>
+        <w:t xml:space="preserve">•   </w:t>
+      </w:r>
+      <w:r>
+        <w:rPr>
+          <w:sz w:val="18"/>
+          <w:szCs w:val="18"/>
+        </w:rPr>
+        <w:t xml:space="preserve">DLQ: after N failed receives the message moves to a dead-letter queue for inspection - no infinite retry loops.</w:t>
+      </w:r>
+    </w:p>
+    <w:p>
+      <w:pPr>
+        <w:ind w:left="260" w:hanging="200"/>
+        <w:spacing w:before="0" w:after="25" w:line="230" w:lineRule="auto"/>
+      </w:pPr>
+      <w:r>
+        <w:rPr>
+          <w:sz w:val="18"/>
+          <w:szCs w:val="18"/>
+        </w:rPr>
+        <w:t xml:space="preserve">•   </w:t>
+      </w:r>
+      <w:r>
+        <w:rPr>
+          <w:sz w:val="18"/>
+          <w:szCs w:val="18"/>
+        </w:rPr>
+        <w:t xml:space="preserve">Standard queue = massive throughput, occasional duplicates, loose order; FIFO = strict order + exactly-once-ish within a message group, lower throughput.</w:t>
+      </w:r>
+    </w:p>
+    <w:p>
+      <w:pPr>
+        <w:ind w:left="260" w:hanging="200"/>
+        <w:spacing w:before="0" w:after="25" w:line="230" w:lineRule="auto"/>
+      </w:pPr>
+      <w:r>
+        <w:rPr>
+          <w:sz w:val="18"/>
+          <w:szCs w:val="18"/>
+        </w:rPr>
+        <w:t xml:space="preserve">•   </w:t>
+      </w:r>
+      <w:r>
+        <w:rPr>
+          <w:sz w:val="18"/>
+          <w:szCs w:val="18"/>
+        </w:rPr>
+        <w:t xml:space="preserve">SNS: topics with many subscribers - SQS queues, Lambda, email, webhooks. Fan-out pattern: SNS topic -&gt; multiple SQS queues = one event, many independent consumers.</w:t>
+      </w:r>
+    </w:p>
+    <w:p>
+      <w:pPr>
+        <w:ind w:left="260" w:hanging="200"/>
+        <w:spacing w:before="0" w:after="25" w:line="230" w:lineRule="auto"/>
+      </w:pPr>
+      <w:r>
+        <w:rPr>
+          <w:sz w:val="18"/>
+          <w:szCs w:val="18"/>
+        </w:rPr>
+        <w:t xml:space="preserve">•   </w:t>
+      </w:r>
+      <w:r>
+        <w:rPr>
+          <w:sz w:val="18"/>
+          <w:szCs w:val="18"/>
+        </w:rPr>
+        <w:t xml:space="preserve">SQS decouples and buffers (order placed -&gt; queue absorbs spikes -&gt; workers process at their pace); SNS broadcasts (order-events topic -&gt; invoice queue + analytics queue + notification Lambda).</w:t>
+      </w:r>
+    </w:p>
+    <w:p>
+      <w:pPr>
+        <w:ind w:left="260" w:hanging="200"/>
+        <w:spacing w:before="0" w:after="25" w:line="230" w:lineRule="auto"/>
+      </w:pPr>
+      <w:r>
+        <w:rPr>
+          <w:sz w:val="18"/>
+          <w:szCs w:val="18"/>
+        </w:rPr>
+        <w:t xml:space="preserve">•   </w:t>
+      </w:r>
+      <w:r>
+        <w:rPr>
+          <w:sz w:val="18"/>
+          <w:szCs w:val="18"/>
+        </w:rPr>
+        <w:t xml:space="preserve">Versus Celery: same queue concepts - SQS can BE the Celery broker; EventBridge is the richer event-bus alternative to name.</w:t>
+      </w:r>
+    </w:p>
+    <w:p>
+      <w:pPr>
+        <w:ind w:left="260" w:hanging="200"/>
+        <w:spacing w:before="0" w:after="25" w:line="230" w:lineRule="auto"/>
+      </w:pPr>
+      <w:r>
+        <w:rPr>
+          <w:sz w:val="18"/>
+          <w:szCs w:val="18"/>
+        </w:rPr>
+        <w:t xml:space="preserve">•   </w:t>
+      </w:r>
+      <w:r>
+        <w:rPr>
+          <w:sz w:val="18"/>
+          <w:szCs w:val="18"/>
+        </w:rPr>
+        <w:t xml:space="preserve">Long polling reduces empty-receive cost; batch operations cut API calls.</w:t>
+      </w:r>
+    </w:p>
+    <w:p>
+      <w:pPr>
+        <w:ind w:left="260" w:hanging="0"/>
+        <w:spacing w:before="0" w:after="15" w:line="230" w:lineRule="auto"/>
+        <w:shd w:val="clear" w:color="auto" w:fill="F2F2F2"/>
+      </w:pPr>
+      <w:r>
+        <w:rPr>
+          <w:b/>
+          <w:sz w:val="17"/>
+          <w:szCs w:val="17"/>
+        </w:rPr>
+        <w:t xml:space="preserve">Example:  </w:t>
+      </w:r>
+      <w:r>
+        <w:rPr>
+          <w:rFonts w:ascii="Consolas" w:hAnsi="Consolas" w:cs="Consolas"/>
+          <w:color w:val="3B3B3B"/>
+          <w:sz w:val="17"/>
+          <w:szCs w:val="17"/>
+        </w:rPr>
+        <w:t xml:space="preserve"># consumer loop (idempotent!)</w:t>
+      </w:r>
+    </w:p>
+    <w:p>
+      <w:pPr>
+        <w:ind w:left="260" w:hanging="0"/>
+        <w:spacing w:before="0" w:after="15" w:line="230" w:lineRule="auto"/>
+        <w:shd w:val="clear" w:color="auto" w:fill="F2F2F2"/>
+      </w:pPr>
+      <w:r>
+        <w:rPr>
+          <w:rFonts w:ascii="Consolas" w:hAnsi="Consolas" w:cs="Consolas"/>
+          <w:color w:val="3B3B3B"/>
+          <w:sz w:val="17"/>
+          <w:szCs w:val="17"/>
+        </w:rPr>
+        <w:t xml:space="preserve">msgs = sqs.receive_message(</w:t>
+      </w:r>
+    </w:p>
+    <w:p>
+      <w:pPr>
+        <w:ind w:left="260" w:hanging="0"/>
+        <w:spacing w:before="0" w:after="15" w:line="230" w:lineRule="auto"/>
+        <w:shd w:val="clear" w:color="auto" w:fill="F2F2F2"/>
+      </w:pPr>
+      <w:r>
+        <w:rPr>
+          <w:rFonts w:ascii="Consolas" w:hAnsi="Consolas" w:cs="Consolas"/>
+          <w:color w:val="3B3B3B"/>
+          <w:sz w:val="17"/>
+          <w:szCs w:val="17"/>
+        </w:rPr>
+        <w:t xml:space="preserve">  QueueUrl=Q, WaitTimeSeconds=20,</w:t>
+      </w:r>
+    </w:p>
+    <w:p>
+      <w:pPr>
+        <w:ind w:left="260" w:hanging="0"/>
+        <w:spacing w:before="0" w:after="15" w:line="230" w:lineRule="auto"/>
+        <w:shd w:val="clear" w:color="auto" w:fill="F2F2F2"/>
+      </w:pPr>
+      <w:r>
+        <w:rPr>
+          <w:rFonts w:ascii="Consolas" w:hAnsi="Consolas" w:cs="Consolas"/>
+          <w:color w:val="3B3B3B"/>
+          <w:sz w:val="17"/>
+          <w:szCs w:val="17"/>
+        </w:rPr>
+        <w:t xml:space="preserve">  MaxNumberOfMessages=10)</w:t>
+      </w:r>
+    </w:p>
+    <w:p>
+      <w:pPr>
+        <w:ind w:left="260" w:hanging="0"/>
+        <w:spacing w:before="0" w:after="15" w:line="230" w:lineRule="auto"/>
+        <w:shd w:val="clear" w:color="auto" w:fill="F2F2F2"/>
+      </w:pPr>
+      <w:r>
+        <w:rPr>
+          <w:rFonts w:ascii="Consolas" w:hAnsi="Consolas" w:cs="Consolas"/>
+          <w:color w:val="3B3B3B"/>
+          <w:sz w:val="17"/>
+          <w:szCs w:val="17"/>
+        </w:rPr>
+        <w:t xml:space="preserve">for m in msgs.get("Messages", []):</w:t>
+      </w:r>
+    </w:p>
+    <w:p>
+      <w:pPr>
+        <w:ind w:left="260" w:hanging="0"/>
+        <w:spacing w:before="0" w:after="15" w:line="230" w:lineRule="auto"/>
+        <w:shd w:val="clear" w:color="auto" w:fill="F2F2F2"/>
+      </w:pPr>
+      <w:r>
+        <w:rPr>
+          <w:rFonts w:ascii="Consolas" w:hAnsi="Consolas" w:cs="Consolas"/>
+          <w:color w:val="3B3B3B"/>
+          <w:sz w:val="17"/>
+          <w:szCs w:val="17"/>
+        </w:rPr>
+        <w:t xml:space="preserve">    if not already_done(m):  # dedupe</w:t>
+      </w:r>
+    </w:p>
+    <w:p>
+      <w:pPr>
+        <w:ind w:left="260" w:hanging="0"/>
+        <w:spacing w:before="0" w:after="15" w:line="230" w:lineRule="auto"/>
+        <w:shd w:val="clear" w:color="auto" w:fill="F2F2F2"/>
+      </w:pPr>
+      <w:r>
+        <w:rPr>
+          <w:rFonts w:ascii="Consolas" w:hAnsi="Consolas" w:cs="Consolas"/>
+          <w:color w:val="3B3B3B"/>
+          <w:sz w:val="17"/>
+          <w:szCs w:val="17"/>
+        </w:rPr>
+        <w:t xml:space="preserve">        process(m)</w:t>
+      </w:r>
+    </w:p>
+    <w:p>
+      <w:pPr>
+        <w:ind w:left="260" w:hanging="0"/>
+        <w:spacing w:before="0" w:after="15" w:line="230" w:lineRule="auto"/>
+        <w:shd w:val="clear" w:color="auto" w:fill="F2F2F2"/>
+      </w:pPr>
+      <w:r>
+        <w:rPr>
+          <w:rFonts w:ascii="Consolas" w:hAnsi="Consolas" w:cs="Consolas"/>
+          <w:color w:val="3B3B3B"/>
+          <w:sz w:val="17"/>
+          <w:szCs w:val="17"/>
+        </w:rPr>
+        <w:t xml:space="preserve">    sqs.delete_message(QueueUrl=Q,</w:t>
+      </w:r>
+    </w:p>
+    <w:p>
+      <w:pPr>
+        <w:ind w:left="260" w:hanging="0"/>
+        <w:spacing w:before="0" w:after="15" w:line="230" w:lineRule="auto"/>
+        <w:shd w:val="clear" w:color="auto" w:fill="F2F2F2"/>
+      </w:pPr>
+      <w:r>
+        <w:rPr>
+          <w:rFonts w:ascii="Consolas" w:hAnsi="Consolas" w:cs="Consolas"/>
+          <w:color w:val="3B3B3B"/>
+          <w:sz w:val="17"/>
+          <w:szCs w:val="17"/>
+        </w:rPr>
+        <w:t xml:space="preserve">      ReceiptHandle=m["ReceiptHandle"])</w:t>
+      </w:r>
+    </w:p>
+    <w:p>
+      <w:pPr>
+        <w:ind w:left="120" w:hanging="0"/>
+        <w:spacing w:before="50" w:after="110" w:line="230" w:lineRule="auto"/>
+        <w:pBdr>
+          <w:left w:val="single" w:sz="12" w:space="4" w:color="2E5E1F"/>
+        </w:pBdr>
+      </w:pPr>
+      <w:r>
+        <w:rPr>
+          <w:b/>
+          <w:color w:val="2E5E1F"/>
+          <w:sz w:val="18"/>
+          <w:szCs w:val="18"/>
+        </w:rPr>
+        <w:t xml:space="preserve">Interview answer:  </w:t>
+      </w:r>
+      <w:r>
+        <w:rPr>
+          <w:i/>
+          <w:sz w:val="18"/>
+          <w:szCs w:val="18"/>
+        </w:rPr>
+        <w:t xml:space="preserve">SQS queues decouple producers from consumers with at-least-once delivery - visibility timeouts, DLQs after repeated failures, and idempotent consumers as the non-negotiable discipline; FIFO adds ordering at throughput cost. SNS broadcasts one event to many subscribers, and SNS-to-multiple-SQS fan-out is the standard event pattern. Same concepts as Celery - SQS can even be its broker.</w:t>
+      </w:r>
+    </w:p>
+    <w:p>
+      <w:pPr>
+        <w:spacing w:before="140" w:after="40" w:line="230" w:lineRule="auto"/>
+      </w:pPr>
+      <w:r>
+        <w:rPr>
+          <w:b/>
+          <w:sz w:val="21"/>
+          <w:szCs w:val="21"/>
+        </w:rPr>
+        <w:t xml:space="preserve">A3.5  Route 53 and CloudFront - DNS and CDN</w:t>
+      </w:r>
+    </w:p>
+    <w:p>
+      <w:pPr>
+        <w:spacing w:before="0" w:after="40" w:line="230" w:lineRule="auto"/>
+      </w:pPr>
+      <w:r>
+        <w:rPr>
+          <w:b/>
+          <w:sz w:val="18"/>
+          <w:szCs w:val="18"/>
+        </w:rPr>
+        <w:t xml:space="preserve">What it is:  </w:t>
+      </w:r>
+      <w:r>
+        <w:rPr>
+          <w:sz w:val="18"/>
+          <w:szCs w:val="18"/>
+        </w:rPr>
+        <w:t xml:space="preserve">Route 53 is AWS DNS - domains resolving to your infrastructure with routing policies; CloudFront is the CDN caching content at edge locations worldwide.</w:t>
+      </w:r>
+    </w:p>
+    <w:p>
+      <w:pPr>
+        <w:ind w:left="260" w:hanging="200"/>
+        <w:spacing w:before="0" w:after="25" w:line="230" w:lineRule="auto"/>
+      </w:pPr>
+      <w:r>
+        <w:rPr>
+          <w:sz w:val="18"/>
+          <w:szCs w:val="18"/>
+        </w:rPr>
+        <w:t xml:space="preserve">•   </w:t>
+      </w:r>
+      <w:r>
+        <w:rPr>
+          <w:sz w:val="18"/>
+          <w:szCs w:val="18"/>
+        </w:rPr>
+        <w:t xml:space="preserve">Route 53: hosted zone per domain; records point names at resources - alias records map the apex domain straight to ALB/CloudFront (a thing plain CNAME cannot do).</w:t>
+      </w:r>
+    </w:p>
+    <w:p>
+      <w:pPr>
+        <w:ind w:left="260" w:hanging="200"/>
+        <w:spacing w:before="0" w:after="25" w:line="230" w:lineRule="auto"/>
+      </w:pPr>
+      <w:r>
+        <w:rPr>
+          <w:sz w:val="18"/>
+          <w:szCs w:val="18"/>
+        </w:rPr>
+        <w:t xml:space="preserve">•   </w:t>
+      </w:r>
+      <w:r>
+        <w:rPr>
+          <w:sz w:val="18"/>
+          <w:szCs w:val="18"/>
+        </w:rPr>
+        <w:t xml:space="preserve">Routing policies: simple, weighted (canary %), latency-based, failover (health-checked primary -&gt; standby), geolocation - each is an interview one-liner.</w:t>
+      </w:r>
+    </w:p>
+    <w:p>
+      <w:pPr>
+        <w:ind w:left="260" w:hanging="200"/>
+        <w:spacing w:before="0" w:after="25" w:line="230" w:lineRule="auto"/>
+      </w:pPr>
+      <w:r>
+        <w:rPr>
+          <w:sz w:val="18"/>
+          <w:szCs w:val="18"/>
+        </w:rPr>
+        <w:t xml:space="preserve">•   </w:t>
+      </w:r>
+      <w:r>
+        <w:rPr>
+          <w:sz w:val="18"/>
+          <w:szCs w:val="18"/>
+        </w:rPr>
+        <w:t xml:space="preserve">CloudFront: 400+ edge locations cache content near users - static assets from an S3 origin, dynamic API acceleration over AWS's backbone; origin access control locks the bucket to CloudFront only.</w:t>
+      </w:r>
+    </w:p>
+    <w:p>
+      <w:pPr>
+        <w:ind w:left="260" w:hanging="200"/>
+        <w:spacing w:before="0" w:after="25" w:line="230" w:lineRule="auto"/>
+      </w:pPr>
+      <w:r>
+        <w:rPr>
+          <w:sz w:val="18"/>
+          <w:szCs w:val="18"/>
+        </w:rPr>
+        <w:t xml:space="preserve">•   </w:t>
+      </w:r>
+      <w:r>
+        <w:rPr>
+          <w:sz w:val="18"/>
+          <w:szCs w:val="18"/>
+        </w:rPr>
+        <w:t xml:space="preserve">Cache behaviors per path pattern (/static/* long TTL, /api/* no-cache but still TLS/HTTP3 benefits); invalidations or hashed filenames handle deploys.</w:t>
+      </w:r>
+    </w:p>
+    <w:p>
+      <w:pPr>
+        <w:ind w:left="260" w:hanging="200"/>
+        <w:spacing w:before="0" w:after="25" w:line="230" w:lineRule="auto"/>
+      </w:pPr>
+      <w:r>
+        <w:rPr>
+          <w:sz w:val="18"/>
+          <w:szCs w:val="18"/>
+        </w:rPr>
+        <w:t xml:space="preserve">•   </w:t>
+      </w:r>
+      <w:r>
+        <w:rPr>
+          <w:sz w:val="18"/>
+          <w:szCs w:val="18"/>
+        </w:rPr>
+        <w:t xml:space="preserve">Free TLS via ACM on both; CloudFront + WAF adds edge protection (rate rules, common attacks).</w:t>
+      </w:r>
+    </w:p>
+    <w:p>
+      <w:pPr>
+        <w:ind w:left="260" w:hanging="200"/>
+        <w:spacing w:before="0" w:after="25" w:line="230" w:lineRule="auto"/>
+      </w:pPr>
+      <w:r>
+        <w:rPr>
+          <w:sz w:val="18"/>
+          <w:szCs w:val="18"/>
+        </w:rPr>
+        <w:t xml:space="preserve">•   </w:t>
+      </w:r>
+      <w:r>
+        <w:rPr>
+          <w:sz w:val="18"/>
+          <w:szCs w:val="18"/>
+        </w:rPr>
+        <w:t xml:space="preserve">The standard front door: Route 53 -&gt; CloudFront -&gt; S3 (static) + ALB (API) - the architecture-diagram answer.</w:t>
+      </w:r>
+    </w:p>
+    <w:p>
+      <w:pPr>
+        <w:ind w:left="260" w:hanging="200"/>
+        <w:spacing w:before="0" w:after="25" w:line="230" w:lineRule="auto"/>
+      </w:pPr>
+      <w:r>
+        <w:rPr>
+          <w:sz w:val="18"/>
+          <w:szCs w:val="18"/>
+        </w:rPr>
+        <w:t xml:space="preserve">•   </w:t>
+      </w:r>
+      <w:r>
+        <w:rPr>
+          <w:sz w:val="18"/>
+          <w:szCs w:val="18"/>
+        </w:rPr>
+        <w:t xml:space="preserve">S3 static site + CloudFront is how a React build ships globally for pennies.</w:t>
+      </w:r>
+    </w:p>
+    <w:p>
+      <w:pPr>
+        <w:ind w:left="260" w:hanging="0"/>
+        <w:spacing w:before="0" w:after="15" w:line="230" w:lineRule="auto"/>
+        <w:shd w:val="clear" w:color="auto" w:fill="F2F2F2"/>
+      </w:pPr>
+      <w:r>
+        <w:rPr>
+          <w:b/>
+          <w:sz w:val="17"/>
+          <w:szCs w:val="17"/>
+        </w:rPr>
+        <w:t xml:space="preserve">Example:  </w:t>
+      </w:r>
+      <w:r>
+        <w:rPr>
+          <w:rFonts w:ascii="Consolas" w:hAnsi="Consolas" w:cs="Consolas"/>
+          <w:color w:val="3B3B3B"/>
+          <w:sz w:val="17"/>
+          <w:szCs w:val="17"/>
+        </w:rPr>
+        <w:t xml:space="preserve">app.example.com  A(alias) -&gt; CloudFront</w:t>
+      </w:r>
+    </w:p>
+    <w:p>
+      <w:pPr>
+        <w:ind w:left="260" w:hanging="0"/>
+        <w:spacing w:before="0" w:after="15" w:line="230" w:lineRule="auto"/>
+        <w:shd w:val="clear" w:color="auto" w:fill="F2F2F2"/>
+      </w:pPr>
+      <w:r>
+        <w:rPr>
+          <w:rFonts w:ascii="Consolas" w:hAnsi="Consolas" w:cs="Consolas"/>
+          <w:color w:val="3B3B3B"/>
+          <w:sz w:val="17"/>
+          <w:szCs w:val="17"/>
+        </w:rPr>
+        <w:t xml:space="preserve">  /static/* -&gt; S3 origin (long TTL)</w:t>
+      </w:r>
+    </w:p>
+    <w:p>
+      <w:pPr>
+        <w:ind w:left="260" w:hanging="0"/>
+        <w:spacing w:before="0" w:after="15" w:line="230" w:lineRule="auto"/>
+        <w:shd w:val="clear" w:color="auto" w:fill="F2F2F2"/>
+      </w:pPr>
+      <w:r>
+        <w:rPr>
+          <w:rFonts w:ascii="Consolas" w:hAnsi="Consolas" w:cs="Consolas"/>
+          <w:color w:val="3B3B3B"/>
+          <w:sz w:val="17"/>
+          <w:szCs w:val="17"/>
+        </w:rPr>
+        <w:t xml:space="preserve">  /api/*    -&gt; ALB origin (no cache)</w:t>
+      </w:r>
+    </w:p>
+    <w:p>
+      <w:pPr>
+        <w:ind w:left="260" w:hanging="0"/>
+        <w:spacing w:before="0" w:after="15" w:line="230" w:lineRule="auto"/>
+        <w:shd w:val="clear" w:color="auto" w:fill="F2F2F2"/>
+      </w:pPr>
+      <w:r>
+        <w:rPr>
+          <w:rFonts w:ascii="Consolas" w:hAnsi="Consolas" w:cs="Consolas"/>
+          <w:color w:val="3B3B3B"/>
+          <w:sz w:val="17"/>
+          <w:szCs w:val="17"/>
+        </w:rPr>
+        <w:t xml:space="preserve">cert: ACM us-east-1 (CloudFront)</w:t>
+      </w:r>
+    </w:p>
+    <w:p>
+      <w:pPr>
+        <w:ind w:left="120" w:hanging="0"/>
+        <w:spacing w:before="50" w:after="110" w:line="230" w:lineRule="auto"/>
+        <w:pBdr>
+          <w:left w:val="single" w:sz="12" w:space="4" w:color="2E5E1F"/>
+        </w:pBdr>
+      </w:pPr>
+      <w:r>
+        <w:rPr>
+          <w:b/>
+          <w:color w:val="2E5E1F"/>
+          <w:sz w:val="18"/>
+          <w:szCs w:val="18"/>
+        </w:rPr>
+        <w:t xml:space="preserve">Interview answer:  </w:t>
+      </w:r>
+      <w:r>
+        <w:rPr>
+          <w:i/>
+          <w:sz w:val="18"/>
+          <w:szCs w:val="18"/>
+        </w:rPr>
+        <w:t xml:space="preserve">Route 53 hosts DNS with alias records mapping even apex domains to AWS resources, plus weighted, latency and failover routing policies. CloudFront caches at edge locations - S3 origins for static content with locked-down bucket access, ALB origins for APIs - with ACM TLS and WAF at the edge. The standard front door is Route 53 into CloudFront splitting /static to S3 and /api to the ALB.</w:t>
       </w:r>
     </w:p>
     <w:sectPr>

</xml_diff>

<commit_message>
AWS Phase 4: DevOps & Production (6 topics) - AWS complete, 24/24
CloudWatch observability, Jenkins-to-ECS pipeline, SSM/Secrets Manager,
security layers, cost optimization, RAG chatbot architecture walkthrough

Co-Authored-By: Claude Fable 5 <noreply@anthropic.com>
Claude-Session: https://claude.ai/code/session_01Vm8nqoCZNTvUn3BNmW1Tgz
</commit_message>
<xml_diff>
--- a/AWS_Interview_Theory.docx
+++ b/AWS_Interview_Theory.docx
@@ -5473,6 +5473,1870 @@
           <w:szCs w:val="18"/>
         </w:rPr>
         <w:t xml:space="preserve">Route 53 hosts DNS with alias records mapping even apex domains to AWS resources, plus weighted, latency and failover routing policies. CloudFront caches at edge locations - S3 origins for static content with locked-down bucket access, ALB origins for APIs - with ACM TLS and WAF at the edge. The standard front door is Route 53 into CloudFront splitting /static to S3 and /api to the ALB.</w:t>
+      </w:r>
+    </w:p>
+    <w:p>
+      <w:pPr>
+        <w:spacing w:before="200" w:after="60" w:line="230" w:lineRule="auto"/>
+      </w:pPr>
+      <w:r>
+        <w:rPr>
+          <w:b/>
+          <w:color w:val="1F4E79"/>
+          <w:sz w:val="26"/>
+          <w:szCs w:val="26"/>
+        </w:rPr>
+        <w:t xml:space="preserve">AWS Phase 4 - DevOps and Production</w:t>
+      </w:r>
+    </w:p>
+    <w:p>
+      <w:pPr>
+        <w:spacing w:before="140" w:after="40" w:line="230" w:lineRule="auto"/>
+      </w:pPr>
+      <w:r>
+        <w:rPr>
+          <w:b/>
+          <w:sz w:val="21"/>
+          <w:szCs w:val="21"/>
+        </w:rPr>
+        <w:t xml:space="preserve">A4.1  CloudWatch - Logs, Metrics, Alarms</w:t>
+      </w:r>
+    </w:p>
+    <w:p>
+      <w:pPr>
+        <w:spacing w:before="0" w:after="40" w:line="230" w:lineRule="auto"/>
+      </w:pPr>
+      <w:r>
+        <w:rPr>
+          <w:b/>
+          <w:sz w:val="18"/>
+          <w:szCs w:val="18"/>
+        </w:rPr>
+        <w:t xml:space="preserve">What it is:  </w:t>
+      </w:r>
+      <w:r>
+        <w:rPr>
+          <w:sz w:val="18"/>
+          <w:szCs w:val="18"/>
+        </w:rPr>
+        <w:t xml:space="preserve">CloudWatch is AWS's observability service - centralized logs, metrics with alarms, and dashboards across every service.</w:t>
+      </w:r>
+    </w:p>
+    <w:p>
+      <w:pPr>
+        <w:ind w:left="260" w:hanging="200"/>
+        <w:spacing w:before="0" w:after="25" w:line="230" w:lineRule="auto"/>
+      </w:pPr>
+      <w:r>
+        <w:rPr>
+          <w:sz w:val="18"/>
+          <w:szCs w:val="18"/>
+        </w:rPr>
+        <w:t xml:space="preserve">•   </w:t>
+      </w:r>
+      <w:r>
+        <w:rPr>
+          <w:sz w:val="18"/>
+          <w:szCs w:val="18"/>
+        </w:rPr>
+        <w:t xml:space="preserve">Logs: ECS awslogs driver / Lambda ship stdout to log groups automatically; retention policies stop infinite storage bills (default is keep-forever - set 30/90 days).</w:t>
+      </w:r>
+    </w:p>
+    <w:p>
+      <w:pPr>
+        <w:ind w:left="260" w:hanging="200"/>
+        <w:spacing w:before="0" w:after="25" w:line="230" w:lineRule="auto"/>
+      </w:pPr>
+      <w:r>
+        <w:rPr>
+          <w:sz w:val="18"/>
+          <w:szCs w:val="18"/>
+        </w:rPr>
+        <w:t xml:space="preserve">•   </w:t>
+      </w:r>
+      <w:r>
+        <w:rPr>
+          <w:sz w:val="18"/>
+          <w:szCs w:val="18"/>
+        </w:rPr>
+        <w:t xml:space="preserve">Logs Insights: query language over logs - filter by request id, count errors by endpoint, p95 latency from structured JSON logs; structured logging makes this powerful.</w:t>
+      </w:r>
+    </w:p>
+    <w:p>
+      <w:pPr>
+        <w:ind w:left="260" w:hanging="200"/>
+        <w:spacing w:before="0" w:after="25" w:line="230" w:lineRule="auto"/>
+      </w:pPr>
+      <w:r>
+        <w:rPr>
+          <w:sz w:val="18"/>
+          <w:szCs w:val="18"/>
+        </w:rPr>
+        <w:t xml:space="preserve">•   </w:t>
+      </w:r>
+      <w:r>
+        <w:rPr>
+          <w:sz w:val="18"/>
+          <w:szCs w:val="18"/>
+        </w:rPr>
+        <w:t xml:space="preserve">Metrics: built-in (CPU, ALB request count, 5xx rate, queue depth) + custom (put_metric_data or the cheaper embedded metric format from logs).</w:t>
+      </w:r>
+    </w:p>
+    <w:p>
+      <w:pPr>
+        <w:ind w:left="260" w:hanging="200"/>
+        <w:spacing w:before="0" w:after="25" w:line="230" w:lineRule="auto"/>
+      </w:pPr>
+      <w:r>
+        <w:rPr>
+          <w:sz w:val="18"/>
+          <w:szCs w:val="18"/>
+        </w:rPr>
+        <w:t xml:space="preserve">•   </w:t>
+      </w:r>
+      <w:r>
+        <w:rPr>
+          <w:sz w:val="18"/>
+          <w:szCs w:val="18"/>
+        </w:rPr>
+        <w:t xml:space="preserve">Alarms: threshold or anomaly-detection on any metric -&gt; SNS -&gt; email/Slack/PagerDuty; composite alarms cut noise. The starter set: ALB 5xx rate, p95 latency, ECS CPU/memory, SQS queue depth + DLQ non-empty, RDS connections/storage.</w:t>
+      </w:r>
+    </w:p>
+    <w:p>
+      <w:pPr>
+        <w:ind w:left="260" w:hanging="200"/>
+        <w:spacing w:before="0" w:after="25" w:line="230" w:lineRule="auto"/>
+      </w:pPr>
+      <w:r>
+        <w:rPr>
+          <w:sz w:val="18"/>
+          <w:szCs w:val="18"/>
+        </w:rPr>
+        <w:t xml:space="preserve">•   </w:t>
+      </w:r>
+      <w:r>
+        <w:rPr>
+          <w:sz w:val="18"/>
+          <w:szCs w:val="18"/>
+        </w:rPr>
+        <w:t xml:space="preserve">Dashboards: one per service - traffic, errors, latency, saturation (the four golden signals framing scores points).</w:t>
+      </w:r>
+    </w:p>
+    <w:p>
+      <w:pPr>
+        <w:ind w:left="260" w:hanging="200"/>
+        <w:spacing w:before="0" w:after="25" w:line="230" w:lineRule="auto"/>
+      </w:pPr>
+      <w:r>
+        <w:rPr>
+          <w:sz w:val="18"/>
+          <w:szCs w:val="18"/>
+        </w:rPr>
+        <w:t xml:space="preserve">•   </w:t>
+      </w:r>
+      <w:r>
+        <w:rPr>
+          <w:sz w:val="18"/>
+          <w:szCs w:val="18"/>
+        </w:rPr>
+        <w:t xml:space="preserve">X-Ray adds distributed tracing across services; Container Insights deepens ECS metrics.</w:t>
+      </w:r>
+    </w:p>
+    <w:p>
+      <w:pPr>
+        <w:ind w:left="260" w:hanging="200"/>
+        <w:spacing w:before="0" w:after="25" w:line="230" w:lineRule="auto"/>
+      </w:pPr>
+      <w:r>
+        <w:rPr>
+          <w:sz w:val="18"/>
+          <w:szCs w:val="18"/>
+        </w:rPr>
+        <w:t xml:space="preserve">•   </w:t>
+      </w:r>
+      <w:r>
+        <w:rPr>
+          <w:sz w:val="18"/>
+          <w:szCs w:val="18"/>
+        </w:rPr>
+        <w:t xml:space="preserve">My practice: request-id structured logs + a dashboard + DLQ and 5xx alarms - so failures page us before users report them.</w:t>
+      </w:r>
+    </w:p>
+    <w:p>
+      <w:pPr>
+        <w:ind w:left="260" w:hanging="0"/>
+        <w:spacing w:before="0" w:after="15" w:line="230" w:lineRule="auto"/>
+        <w:shd w:val="clear" w:color="auto" w:fill="F2F2F2"/>
+      </w:pPr>
+      <w:r>
+        <w:rPr>
+          <w:b/>
+          <w:sz w:val="17"/>
+          <w:szCs w:val="17"/>
+        </w:rPr>
+        <w:t xml:space="preserve">Example:  </w:t>
+      </w:r>
+      <w:r>
+        <w:rPr>
+          <w:rFonts w:ascii="Consolas" w:hAnsi="Consolas" w:cs="Consolas"/>
+          <w:color w:val="3B3B3B"/>
+          <w:sz w:val="17"/>
+          <w:szCs w:val="17"/>
+        </w:rPr>
+        <w:t xml:space="preserve"># Logs Insights</w:t>
+      </w:r>
+    </w:p>
+    <w:p>
+      <w:pPr>
+        <w:ind w:left="260" w:hanging="0"/>
+        <w:spacing w:before="0" w:after="15" w:line="230" w:lineRule="auto"/>
+        <w:shd w:val="clear" w:color="auto" w:fill="F2F2F2"/>
+      </w:pPr>
+      <w:r>
+        <w:rPr>
+          <w:rFonts w:ascii="Consolas" w:hAnsi="Consolas" w:cs="Consolas"/>
+          <w:color w:val="3B3B3B"/>
+          <w:sz w:val="17"/>
+          <w:szCs w:val="17"/>
+        </w:rPr>
+        <w:t xml:space="preserve">fields @timestamp, status, path</w:t>
+      </w:r>
+    </w:p>
+    <w:p>
+      <w:pPr>
+        <w:ind w:left="260" w:hanging="0"/>
+        <w:spacing w:before="0" w:after="15" w:line="230" w:lineRule="auto"/>
+        <w:shd w:val="clear" w:color="auto" w:fill="F2F2F2"/>
+      </w:pPr>
+      <w:r>
+        <w:rPr>
+          <w:rFonts w:ascii="Consolas" w:hAnsi="Consolas" w:cs="Consolas"/>
+          <w:color w:val="3B3B3B"/>
+          <w:sz w:val="17"/>
+          <w:szCs w:val="17"/>
+        </w:rPr>
+        <w:t xml:space="preserve">| filter status &gt;= 500</w:t>
+      </w:r>
+    </w:p>
+    <w:p>
+      <w:pPr>
+        <w:ind w:left="260" w:hanging="0"/>
+        <w:spacing w:before="0" w:after="15" w:line="230" w:lineRule="auto"/>
+        <w:shd w:val="clear" w:color="auto" w:fill="F2F2F2"/>
+      </w:pPr>
+      <w:r>
+        <w:rPr>
+          <w:rFonts w:ascii="Consolas" w:hAnsi="Consolas" w:cs="Consolas"/>
+          <w:color w:val="3B3B3B"/>
+          <w:sz w:val="17"/>
+          <w:szCs w:val="17"/>
+        </w:rPr>
+        <w:t xml:space="preserve">| stats count() by path</w:t>
+      </w:r>
+    </w:p>
+    <w:p>
+      <w:pPr>
+        <w:ind w:left="260" w:hanging="0"/>
+        <w:spacing w:before="0" w:after="15" w:line="230" w:lineRule="auto"/>
+        <w:shd w:val="clear" w:color="auto" w:fill="F2F2F2"/>
+      </w:pPr>
+      <w:r>
+        <w:rPr>
+          <w:rFonts w:ascii="Consolas" w:hAnsi="Consolas" w:cs="Consolas"/>
+          <w:color w:val="3B3B3B"/>
+          <w:sz w:val="17"/>
+          <w:szCs w:val="17"/>
+        </w:rPr>
+        <w:t xml:space="preserve">| sort count desc</w:t>
+      </w:r>
+    </w:p>
+    <w:p>
+      <w:pPr>
+        <w:ind w:left="260" w:hanging="0"/>
+        <w:spacing w:before="0" w:after="15" w:line="230" w:lineRule="auto"/>
+        <w:shd w:val="clear" w:color="auto" w:fill="F2F2F2"/>
+      </w:pPr>
+      <w:r>
+        <w:rPr>
+          <w:rFonts w:ascii="Consolas" w:hAnsi="Consolas" w:cs="Consolas"/>
+          <w:color w:val="3B3B3B"/>
+          <w:sz w:val="17"/>
+          <w:szCs w:val="17"/>
+        </w:rPr>
+        <w:t xml:space="preserve"># alarm: ALB HTTPCode_ELB_5XX &gt; 10/5min -&gt; SNS</w:t>
+      </w:r>
+    </w:p>
+    <w:p>
+      <w:pPr>
+        <w:ind w:left="120" w:hanging="0"/>
+        <w:spacing w:before="50" w:after="110" w:line="230" w:lineRule="auto"/>
+        <w:pBdr>
+          <w:left w:val="single" w:sz="12" w:space="4" w:color="2E5E1F"/>
+        </w:pBdr>
+      </w:pPr>
+      <w:r>
+        <w:rPr>
+          <w:b/>
+          <w:color w:val="2E5E1F"/>
+          <w:sz w:val="18"/>
+          <w:szCs w:val="18"/>
+        </w:rPr>
+        <w:t xml:space="preserve">Interview answer:  </w:t>
+      </w:r>
+      <w:r>
+        <w:rPr>
+          <w:i/>
+          <w:sz w:val="18"/>
+          <w:szCs w:val="18"/>
+        </w:rPr>
+        <w:t xml:space="preserve">CloudWatch centralizes logs (ECS/Lambda ship automatically - set retention!), metrics and alarms. I write structured JSON logs so Logs Insights can query error rates and p95s, keep a golden-signals dashboard per service, and run a standard alarm set - 5xx rate, latency, CPU/memory, queue depth, DLQ non-empty - fanning to SNS so problems page us, not the users. X-Ray adds tracing when services multiply.</w:t>
+      </w:r>
+    </w:p>
+    <w:p>
+      <w:pPr>
+        <w:spacing w:before="140" w:after="40" w:line="230" w:lineRule="auto"/>
+      </w:pPr>
+      <w:r>
+        <w:rPr>
+          <w:b/>
+          <w:sz w:val="21"/>
+          <w:szCs w:val="21"/>
+        </w:rPr>
+        <w:t xml:space="preserve">A4.2  CI/CD to AWS - Jenkins Pipeline Flow</w:t>
+      </w:r>
+    </w:p>
+    <w:p>
+      <w:pPr>
+        <w:spacing w:before="0" w:after="40" w:line="230" w:lineRule="auto"/>
+      </w:pPr>
+      <w:r>
+        <w:rPr>
+          <w:b/>
+          <w:sz w:val="18"/>
+          <w:szCs w:val="18"/>
+        </w:rPr>
+        <w:t xml:space="preserve">What it is:  </w:t>
+      </w:r>
+      <w:r>
+        <w:rPr>
+          <w:sz w:val="18"/>
+          <w:szCs w:val="18"/>
+        </w:rPr>
+        <w:t xml:space="preserve">The pipeline turns a git push into a running deployment: test -&gt; build image -&gt; scan -&gt; push to ECR -&gt; roll ECS - with quality gates between.</w:t>
+      </w:r>
+    </w:p>
+    <w:p>
+      <w:pPr>
+        <w:ind w:left="260" w:hanging="200"/>
+        <w:spacing w:before="0" w:after="25" w:line="230" w:lineRule="auto"/>
+      </w:pPr>
+      <w:r>
+        <w:rPr>
+          <w:sz w:val="18"/>
+          <w:szCs w:val="18"/>
+        </w:rPr>
+        <w:t xml:space="preserve">•   </w:t>
+      </w:r>
+      <w:r>
+        <w:rPr>
+          <w:sz w:val="18"/>
+          <w:szCs w:val="18"/>
+        </w:rPr>
+        <w:t xml:space="preserve">My pipeline shape (resume): checkout -&gt; unit tests + lint -&gt; SonarQube quality gate -&gt; docker build (SHA tag) -&gt; Trivy image scan -&gt; push to ECR -&gt; register new task definition revision -&gt; update ECS service -&gt; wait for service stable -&gt; smoke test.</w:t>
+      </w:r>
+    </w:p>
+    <w:p>
+      <w:pPr>
+        <w:ind w:left="260" w:hanging="200"/>
+        <w:spacing w:before="0" w:after="25" w:line="230" w:lineRule="auto"/>
+      </w:pPr>
+      <w:r>
+        <w:rPr>
+          <w:sz w:val="18"/>
+          <w:szCs w:val="18"/>
+        </w:rPr>
+        <w:t xml:space="preserve">•   </w:t>
+      </w:r>
+      <w:r>
+        <w:rPr>
+          <w:sz w:val="18"/>
+          <w:szCs w:val="18"/>
+        </w:rPr>
+        <w:t xml:space="preserve">Jenkins specifics: declarative Jenkinsfile in the repo, agents with docker, credentials from Jenkins store or better - an IAM role on the Jenkins host, not access keys.</w:t>
+      </w:r>
+    </w:p>
+    <w:p>
+      <w:pPr>
+        <w:ind w:left="260" w:hanging="200"/>
+        <w:spacing w:before="0" w:after="25" w:line="230" w:lineRule="auto"/>
+      </w:pPr>
+      <w:r>
+        <w:rPr>
+          <w:sz w:val="18"/>
+          <w:szCs w:val="18"/>
+        </w:rPr>
+        <w:t xml:space="preserve">•   </w:t>
+      </w:r>
+      <w:r>
+        <w:rPr>
+          <w:sz w:val="18"/>
+          <w:szCs w:val="18"/>
+        </w:rPr>
+        <w:t xml:space="preserve">Quality gates fail fast: broken tests never build an image; SonarQube blocks smelly code; Trivy blocks known-CVE images - each stage is a checkpoint (interviewers like the 'shift left' word).</w:t>
+      </w:r>
+    </w:p>
+    <w:p>
+      <w:pPr>
+        <w:ind w:left="260" w:hanging="200"/>
+        <w:spacing w:before="0" w:after="25" w:line="230" w:lineRule="auto"/>
+      </w:pPr>
+      <w:r>
+        <w:rPr>
+          <w:sz w:val="18"/>
+          <w:szCs w:val="18"/>
+        </w:rPr>
+        <w:t xml:space="preserve">•   </w:t>
+      </w:r>
+      <w:r>
+        <w:rPr>
+          <w:sz w:val="18"/>
+          <w:szCs w:val="18"/>
+        </w:rPr>
+        <w:t xml:space="preserve">Deploy safety: ECS rolling update with circuit breaker auto-rollback; blue/green via CodeDeploy for the careful version; git SHA tags make manual rollback = redeploy previous revision.</w:t>
+      </w:r>
+    </w:p>
+    <w:p>
+      <w:pPr>
+        <w:ind w:left="260" w:hanging="200"/>
+        <w:spacing w:before="0" w:after="25" w:line="230" w:lineRule="auto"/>
+      </w:pPr>
+      <w:r>
+        <w:rPr>
+          <w:sz w:val="18"/>
+          <w:szCs w:val="18"/>
+        </w:rPr>
+        <w:t xml:space="preserve">•   </w:t>
+      </w:r>
+      <w:r>
+        <w:rPr>
+          <w:sz w:val="18"/>
+          <w:szCs w:val="18"/>
+        </w:rPr>
+        <w:t xml:space="preserve">Environments: same image promoted dev -&gt; staging -&gt; prod (never rebuilt per env - config differs, artifact does not).</w:t>
+      </w:r>
+    </w:p>
+    <w:p>
+      <w:pPr>
+        <w:ind w:left="260" w:hanging="200"/>
+        <w:spacing w:before="0" w:after="25" w:line="230" w:lineRule="auto"/>
+      </w:pPr>
+      <w:r>
+        <w:rPr>
+          <w:sz w:val="18"/>
+          <w:szCs w:val="18"/>
+        </w:rPr>
+        <w:t xml:space="preserve">•   </w:t>
+      </w:r>
+      <w:r>
+        <w:rPr>
+          <w:sz w:val="18"/>
+          <w:szCs w:val="18"/>
+        </w:rPr>
+        <w:t xml:space="preserve">AWS-native alternates to name: CodePipeline/CodeBuild, GitHub Actions with OIDC (keyless AWS auth - the modern answer).</w:t>
+      </w:r>
+    </w:p>
+    <w:p>
+      <w:pPr>
+        <w:ind w:left="260" w:hanging="200"/>
+        <w:spacing w:before="0" w:after="25" w:line="230" w:lineRule="auto"/>
+      </w:pPr>
+      <w:r>
+        <w:rPr>
+          <w:sz w:val="18"/>
+          <w:szCs w:val="18"/>
+        </w:rPr>
+        <w:t xml:space="preserve">•   </w:t>
+      </w:r>
+      <w:r>
+        <w:rPr>
+          <w:sz w:val="18"/>
+          <w:szCs w:val="18"/>
+        </w:rPr>
+        <w:t xml:space="preserve">IaC completes the story: Terraform/CloudFormation version the infrastructure like code.</w:t>
+      </w:r>
+    </w:p>
+    <w:p>
+      <w:pPr>
+        <w:ind w:left="260" w:hanging="0"/>
+        <w:spacing w:before="0" w:after="15" w:line="230" w:lineRule="auto"/>
+        <w:shd w:val="clear" w:color="auto" w:fill="F2F2F2"/>
+      </w:pPr>
+      <w:r>
+        <w:rPr>
+          <w:b/>
+          <w:sz w:val="17"/>
+          <w:szCs w:val="17"/>
+        </w:rPr>
+        <w:t xml:space="preserve">Example:  </w:t>
+      </w:r>
+      <w:r>
+        <w:rPr>
+          <w:rFonts w:ascii="Consolas" w:hAnsi="Consolas" w:cs="Consolas"/>
+          <w:color w:val="3B3B3B"/>
+          <w:sz w:val="17"/>
+          <w:szCs w:val="17"/>
+        </w:rPr>
+        <w:t xml:space="preserve">stage('Build') {</w:t>
+      </w:r>
+    </w:p>
+    <w:p>
+      <w:pPr>
+        <w:ind w:left="260" w:hanging="0"/>
+        <w:spacing w:before="0" w:after="15" w:line="230" w:lineRule="auto"/>
+        <w:shd w:val="clear" w:color="auto" w:fill="F2F2F2"/>
+      </w:pPr>
+      <w:r>
+        <w:rPr>
+          <w:rFonts w:ascii="Consolas" w:hAnsi="Consolas" w:cs="Consolas"/>
+          <w:color w:val="3B3B3B"/>
+          <w:sz w:val="17"/>
+          <w:szCs w:val="17"/>
+        </w:rPr>
+        <w:t xml:space="preserve">  sh 'docker build -t $ECR/app:$GIT_SHA .' }</w:t>
+      </w:r>
+    </w:p>
+    <w:p>
+      <w:pPr>
+        <w:ind w:left="260" w:hanging="0"/>
+        <w:spacing w:before="0" w:after="15" w:line="230" w:lineRule="auto"/>
+        <w:shd w:val="clear" w:color="auto" w:fill="F2F2F2"/>
+      </w:pPr>
+      <w:r>
+        <w:rPr>
+          <w:rFonts w:ascii="Consolas" w:hAnsi="Consolas" w:cs="Consolas"/>
+          <w:color w:val="3B3B3B"/>
+          <w:sz w:val="17"/>
+          <w:szCs w:val="17"/>
+        </w:rPr>
+        <w:t xml:space="preserve">stage('Scan')  { sh 'trivy image ...' }</w:t>
+      </w:r>
+    </w:p>
+    <w:p>
+      <w:pPr>
+        <w:ind w:left="260" w:hanging="0"/>
+        <w:spacing w:before="0" w:after="15" w:line="230" w:lineRule="auto"/>
+        <w:shd w:val="clear" w:color="auto" w:fill="F2F2F2"/>
+      </w:pPr>
+      <w:r>
+        <w:rPr>
+          <w:rFonts w:ascii="Consolas" w:hAnsi="Consolas" w:cs="Consolas"/>
+          <w:color w:val="3B3B3B"/>
+          <w:sz w:val="17"/>
+          <w:szCs w:val="17"/>
+        </w:rPr>
+        <w:t xml:space="preserve">stage('Deploy') {</w:t>
+      </w:r>
+    </w:p>
+    <w:p>
+      <w:pPr>
+        <w:ind w:left="260" w:hanging="0"/>
+        <w:spacing w:before="0" w:after="15" w:line="230" w:lineRule="auto"/>
+        <w:shd w:val="clear" w:color="auto" w:fill="F2F2F2"/>
+      </w:pPr>
+      <w:r>
+        <w:rPr>
+          <w:rFonts w:ascii="Consolas" w:hAnsi="Consolas" w:cs="Consolas"/>
+          <w:color w:val="3B3B3B"/>
+          <w:sz w:val="17"/>
+          <w:szCs w:val="17"/>
+        </w:rPr>
+        <w:t xml:space="preserve">  sh '''aws ecs update-service \</w:t>
+      </w:r>
+    </w:p>
+    <w:p>
+      <w:pPr>
+        <w:ind w:left="260" w:hanging="0"/>
+        <w:spacing w:before="0" w:after="15" w:line="230" w:lineRule="auto"/>
+        <w:shd w:val="clear" w:color="auto" w:fill="F2F2F2"/>
+      </w:pPr>
+      <w:r>
+        <w:rPr>
+          <w:rFonts w:ascii="Consolas" w:hAnsi="Consolas" w:cs="Consolas"/>
+          <w:color w:val="3B3B3B"/>
+          <w:sz w:val="17"/>
+          <w:szCs w:val="17"/>
+        </w:rPr>
+        <w:t xml:space="preserve">    --cluster prod --service api \</w:t>
+      </w:r>
+    </w:p>
+    <w:p>
+      <w:pPr>
+        <w:ind w:left="260" w:hanging="0"/>
+        <w:spacing w:before="0" w:after="15" w:line="230" w:lineRule="auto"/>
+        <w:shd w:val="clear" w:color="auto" w:fill="F2F2F2"/>
+      </w:pPr>
+      <w:r>
+        <w:rPr>
+          <w:rFonts w:ascii="Consolas" w:hAnsi="Consolas" w:cs="Consolas"/>
+          <w:color w:val="3B3B3B"/>
+          <w:sz w:val="17"/>
+          <w:szCs w:val="17"/>
+        </w:rPr>
+        <w:t xml:space="preserve">    --task-definition app:$REV'''</w:t>
+      </w:r>
+    </w:p>
+    <w:p>
+      <w:pPr>
+        <w:ind w:left="260" w:hanging="0"/>
+        <w:spacing w:before="0" w:after="15" w:line="230" w:lineRule="auto"/>
+        <w:shd w:val="clear" w:color="auto" w:fill="F2F2F2"/>
+      </w:pPr>
+      <w:r>
+        <w:rPr>
+          <w:rFonts w:ascii="Consolas" w:hAnsi="Consolas" w:cs="Consolas"/>
+          <w:color w:val="3B3B3B"/>
+          <w:sz w:val="17"/>
+          <w:szCs w:val="17"/>
+        </w:rPr>
+        <w:t xml:space="preserve">}</w:t>
+      </w:r>
+    </w:p>
+    <w:p>
+      <w:pPr>
+        <w:ind w:left="120" w:hanging="0"/>
+        <w:spacing w:before="50" w:after="110" w:line="230" w:lineRule="auto"/>
+        <w:pBdr>
+          <w:left w:val="single" w:sz="12" w:space="4" w:color="2E5E1F"/>
+        </w:pBdr>
+      </w:pPr>
+      <w:r>
+        <w:rPr>
+          <w:b/>
+          <w:color w:val="2E5E1F"/>
+          <w:sz w:val="18"/>
+          <w:szCs w:val="18"/>
+        </w:rPr>
+        <w:t xml:space="preserve">Interview answer:  </w:t>
+      </w:r>
+      <w:r>
+        <w:rPr>
+          <w:i/>
+          <w:sz w:val="18"/>
+          <w:szCs w:val="18"/>
+        </w:rPr>
+        <w:t xml:space="preserve">My Jenkins pipeline goes checkout, tests and lint, SonarQube gate, docker build tagged with the git SHA, Trivy scan, push to ECR, then a new ECS task revision with rolling deploy and circuit-breaker rollback - the same image promoted across environments, only config changing. Jenkins authenticates via IAM role, not stored keys, and I would name GitHub Actions with OIDC as the modern keyless alternative.</w:t>
+      </w:r>
+    </w:p>
+    <w:p>
+      <w:pPr>
+        <w:spacing w:before="140" w:after="40" w:line="230" w:lineRule="auto"/>
+      </w:pPr>
+      <w:r>
+        <w:rPr>
+          <w:b/>
+          <w:sz w:val="21"/>
+          <w:szCs w:val="21"/>
+        </w:rPr>
+        <w:t xml:space="preserve">A4.3  Secrets Management - SSM and Secrets Manager</w:t>
+      </w:r>
+    </w:p>
+    <w:p>
+      <w:pPr>
+        <w:spacing w:before="0" w:after="40" w:line="230" w:lineRule="auto"/>
+      </w:pPr>
+      <w:r>
+        <w:rPr>
+          <w:b/>
+          <w:sz w:val="18"/>
+          <w:szCs w:val="18"/>
+        </w:rPr>
+        <w:t xml:space="preserve">What it is:  </w:t>
+      </w:r>
+      <w:r>
+        <w:rPr>
+          <w:sz w:val="18"/>
+          <w:szCs w:val="18"/>
+        </w:rPr>
+        <w:t xml:space="preserve">Secrets live in SSM Parameter Store or Secrets Manager and are injected at runtime by IAM-authorized services - never in code, images or plain env files.</w:t>
+      </w:r>
+    </w:p>
+    <w:p>
+      <w:pPr>
+        <w:ind w:left="260" w:hanging="200"/>
+        <w:spacing w:before="0" w:after="25" w:line="230" w:lineRule="auto"/>
+      </w:pPr>
+      <w:r>
+        <w:rPr>
+          <w:sz w:val="18"/>
+          <w:szCs w:val="18"/>
+        </w:rPr>
+        <w:t xml:space="preserve">•   </w:t>
+      </w:r>
+      <w:r>
+        <w:rPr>
+          <w:sz w:val="18"/>
+          <w:szCs w:val="18"/>
+        </w:rPr>
+        <w:t xml:space="preserve">SSM Parameter Store: simple key-value with SecureString (KMS-encrypted) - free tier, fine for most config + secrets.</w:t>
+      </w:r>
+    </w:p>
+    <w:p>
+      <w:pPr>
+        <w:ind w:left="260" w:hanging="200"/>
+        <w:spacing w:before="0" w:after="25" w:line="230" w:lineRule="auto"/>
+      </w:pPr>
+      <w:r>
+        <w:rPr>
+          <w:sz w:val="18"/>
+          <w:szCs w:val="18"/>
+        </w:rPr>
+        <w:t xml:space="preserve">•   </w:t>
+      </w:r>
+      <w:r>
+        <w:rPr>
+          <w:sz w:val="18"/>
+          <w:szCs w:val="18"/>
+        </w:rPr>
+        <w:t xml:space="preserve">Secrets Manager: adds automatic rotation (RDS rotation built-in), cross-account access, per-secret cost - choose it when rotation/compliance matters; otherwise SSM is the pragmatic answer.</w:t>
+      </w:r>
+    </w:p>
+    <w:p>
+      <w:pPr>
+        <w:ind w:left="260" w:hanging="200"/>
+        <w:spacing w:before="0" w:after="25" w:line="230" w:lineRule="auto"/>
+      </w:pPr>
+      <w:r>
+        <w:rPr>
+          <w:sz w:val="18"/>
+          <w:szCs w:val="18"/>
+        </w:rPr>
+        <w:t xml:space="preserve">•   </w:t>
+      </w:r>
+      <w:r>
+        <w:rPr>
+          <w:sz w:val="18"/>
+          <w:szCs w:val="18"/>
+        </w:rPr>
+        <w:t xml:space="preserve">ECS integration: task definition 'secrets' maps a parameter/secret ARN to an env var - the EXECUTION role reads it at task start; the app just sees os.environ.</w:t>
+      </w:r>
+    </w:p>
+    <w:p>
+      <w:pPr>
+        <w:ind w:left="260" w:hanging="200"/>
+        <w:spacing w:before="0" w:after="25" w:line="230" w:lineRule="auto"/>
+      </w:pPr>
+      <w:r>
+        <w:rPr>
+          <w:sz w:val="18"/>
+          <w:szCs w:val="18"/>
+        </w:rPr>
+        <w:t xml:space="preserve">•   </w:t>
+      </w:r>
+      <w:r>
+        <w:rPr>
+          <w:sz w:val="18"/>
+          <w:szCs w:val="18"/>
+        </w:rPr>
+        <w:t xml:space="preserve">The anti-patterns to name: secrets in git (my .env/.gitignore discipline), baked into docker images (layers are readable), pasted in CI logs.</w:t>
+      </w:r>
+    </w:p>
+    <w:p>
+      <w:pPr>
+        <w:ind w:left="260" w:hanging="200"/>
+        <w:spacing w:before="0" w:after="25" w:line="230" w:lineRule="auto"/>
+      </w:pPr>
+      <w:r>
+        <w:rPr>
+          <w:sz w:val="18"/>
+          <w:szCs w:val="18"/>
+        </w:rPr>
+        <w:t xml:space="preserve">•   </w:t>
+      </w:r>
+      <w:r>
+        <w:rPr>
+          <w:sz w:val="18"/>
+          <w:szCs w:val="18"/>
+        </w:rPr>
+        <w:t xml:space="preserve">KMS underneath encrypts everything; IAM scopes who reads which path (/prod/* vs /dev/*).</w:t>
+      </w:r>
+    </w:p>
+    <w:p>
+      <w:pPr>
+        <w:ind w:left="260" w:hanging="200"/>
+        <w:spacing w:before="0" w:after="25" w:line="230" w:lineRule="auto"/>
+      </w:pPr>
+      <w:r>
+        <w:rPr>
+          <w:sz w:val="18"/>
+          <w:szCs w:val="18"/>
+        </w:rPr>
+        <w:t xml:space="preserve">•   </w:t>
+      </w:r>
+      <w:r>
+        <w:rPr>
+          <w:sz w:val="18"/>
+          <w:szCs w:val="18"/>
+        </w:rPr>
+        <w:t xml:space="preserve">Rotation story: DB password rotates -&gt; app reads at startup or caches with TTL -&gt; rolling restart picks it up.</w:t>
+      </w:r>
+    </w:p>
+    <w:p>
+      <w:pPr>
+        <w:ind w:left="260" w:hanging="200"/>
+        <w:spacing w:before="0" w:after="25" w:line="230" w:lineRule="auto"/>
+      </w:pPr>
+      <w:r>
+        <w:rPr>
+          <w:sz w:val="18"/>
+          <w:szCs w:val="18"/>
+        </w:rPr>
+        <w:t xml:space="preserve">•   </w:t>
+      </w:r>
+      <w:r>
+        <w:rPr>
+          <w:sz w:val="18"/>
+          <w:szCs w:val="18"/>
+        </w:rPr>
+        <w:t xml:space="preserve">Local dev mirrors with .env files; production never uses them.</w:t>
+      </w:r>
+    </w:p>
+    <w:p>
+      <w:pPr>
+        <w:ind w:left="260" w:hanging="0"/>
+        <w:spacing w:before="0" w:after="15" w:line="230" w:lineRule="auto"/>
+        <w:shd w:val="clear" w:color="auto" w:fill="F2F2F2"/>
+      </w:pPr>
+      <w:r>
+        <w:rPr>
+          <w:b/>
+          <w:sz w:val="17"/>
+          <w:szCs w:val="17"/>
+        </w:rPr>
+        <w:t xml:space="preserve">Example:  </w:t>
+      </w:r>
+      <w:r>
+        <w:rPr>
+          <w:rFonts w:ascii="Consolas" w:hAnsi="Consolas" w:cs="Consolas"/>
+          <w:color w:val="3B3B3B"/>
+          <w:sz w:val="17"/>
+          <w:szCs w:val="17"/>
+        </w:rPr>
+        <w:t xml:space="preserve"># task definition</w:t>
+      </w:r>
+    </w:p>
+    <w:p>
+      <w:pPr>
+        <w:ind w:left="260" w:hanging="0"/>
+        <w:spacing w:before="0" w:after="15" w:line="230" w:lineRule="auto"/>
+        <w:shd w:val="clear" w:color="auto" w:fill="F2F2F2"/>
+      </w:pPr>
+      <w:r>
+        <w:rPr>
+          <w:rFonts w:ascii="Consolas" w:hAnsi="Consolas" w:cs="Consolas"/>
+          <w:color w:val="3B3B3B"/>
+          <w:sz w:val="17"/>
+          <w:szCs w:val="17"/>
+        </w:rPr>
+        <w:t xml:space="preserve">"secrets": [{</w:t>
+      </w:r>
+    </w:p>
+    <w:p>
+      <w:pPr>
+        <w:ind w:left="260" w:hanging="0"/>
+        <w:spacing w:before="0" w:after="15" w:line="230" w:lineRule="auto"/>
+        <w:shd w:val="clear" w:color="auto" w:fill="F2F2F2"/>
+      </w:pPr>
+      <w:r>
+        <w:rPr>
+          <w:rFonts w:ascii="Consolas" w:hAnsi="Consolas" w:cs="Consolas"/>
+          <w:color w:val="3B3B3B"/>
+          <w:sz w:val="17"/>
+          <w:szCs w:val="17"/>
+        </w:rPr>
+        <w:t xml:space="preserve">  "name": "DB_PASSWORD",</w:t>
+      </w:r>
+    </w:p>
+    <w:p>
+      <w:pPr>
+        <w:ind w:left="260" w:hanging="0"/>
+        <w:spacing w:before="0" w:after="15" w:line="230" w:lineRule="auto"/>
+        <w:shd w:val="clear" w:color="auto" w:fill="F2F2F2"/>
+      </w:pPr>
+      <w:r>
+        <w:rPr>
+          <w:rFonts w:ascii="Consolas" w:hAnsi="Consolas" w:cs="Consolas"/>
+          <w:color w:val="3B3B3B"/>
+          <w:sz w:val="17"/>
+          <w:szCs w:val="17"/>
+        </w:rPr>
+        <w:t xml:space="preserve">  "valueFrom": "arn:aws:ssm:ap-south-1:</w:t>
+      </w:r>
+    </w:p>
+    <w:p>
+      <w:pPr>
+        <w:ind w:left="260" w:hanging="0"/>
+        <w:spacing w:before="0" w:after="15" w:line="230" w:lineRule="auto"/>
+        <w:shd w:val="clear" w:color="auto" w:fill="F2F2F2"/>
+      </w:pPr>
+      <w:r>
+        <w:rPr>
+          <w:rFonts w:ascii="Consolas" w:hAnsi="Consolas" w:cs="Consolas"/>
+          <w:color w:val="3B3B3B"/>
+          <w:sz w:val="17"/>
+          <w:szCs w:val="17"/>
+        </w:rPr>
+        <w:t xml:space="preserve">    123:parameter/prod/db_password"}]</w:t>
+      </w:r>
+    </w:p>
+    <w:p>
+      <w:pPr>
+        <w:ind w:left="260" w:hanging="0"/>
+        <w:spacing w:before="0" w:after="15" w:line="230" w:lineRule="auto"/>
+        <w:shd w:val="clear" w:color="auto" w:fill="F2F2F2"/>
+      </w:pPr>
+      <w:r>
+        <w:rPr>
+          <w:rFonts w:ascii="Consolas" w:hAnsi="Consolas" w:cs="Consolas"/>
+          <w:color w:val="3B3B3B"/>
+          <w:sz w:val="17"/>
+          <w:szCs w:val="17"/>
+        </w:rPr>
+        <w:t xml:space="preserve"># app code: os.environ["DB_PASSWORD"]</w:t>
+      </w:r>
+    </w:p>
+    <w:p>
+      <w:pPr>
+        <w:ind w:left="120" w:hanging="0"/>
+        <w:spacing w:before="50" w:after="110" w:line="230" w:lineRule="auto"/>
+        <w:pBdr>
+          <w:left w:val="single" w:sz="12" w:space="4" w:color="2E5E1F"/>
+        </w:pBdr>
+      </w:pPr>
+      <w:r>
+        <w:rPr>
+          <w:b/>
+          <w:color w:val="2E5E1F"/>
+          <w:sz w:val="18"/>
+          <w:szCs w:val="18"/>
+        </w:rPr>
+        <w:t xml:space="preserve">Interview answer:  </w:t>
+      </w:r>
+      <w:r>
+        <w:rPr>
+          <w:i/>
+          <w:sz w:val="18"/>
+          <w:szCs w:val="18"/>
+        </w:rPr>
+        <w:t xml:space="preserve">Secrets sit KMS-encrypted in SSM Parameter Store - or Secrets Manager when automatic rotation is needed - and reach the app as env vars injected by the ECS execution role at task start, path-scoped by IAM per environment. Never in git, never in image layers, never echoed in CI logs; local dev uses gitignored .env files that production never touches.</w:t>
+      </w:r>
+    </w:p>
+    <w:p>
+      <w:pPr>
+        <w:spacing w:before="140" w:after="40" w:line="230" w:lineRule="auto"/>
+      </w:pPr>
+      <w:r>
+        <w:rPr>
+          <w:b/>
+          <w:sz w:val="21"/>
+          <w:szCs w:val="21"/>
+        </w:rPr>
+        <w:t xml:space="preserve">A4.4  Security Best Practices</w:t>
+      </w:r>
+    </w:p>
+    <w:p>
+      <w:pPr>
+        <w:spacing w:before="0" w:after="40" w:line="230" w:lineRule="auto"/>
+      </w:pPr>
+      <w:r>
+        <w:rPr>
+          <w:b/>
+          <w:sz w:val="18"/>
+          <w:szCs w:val="18"/>
+        </w:rPr>
+        <w:t xml:space="preserve">What it is:  </w:t>
+      </w:r>
+      <w:r>
+        <w:rPr>
+          <w:sz w:val="18"/>
+          <w:szCs w:val="18"/>
+        </w:rPr>
+        <w:t xml:space="preserve">AWS security is layered: locked root, least-privilege IAM, private networks, encrypted data, scanned images, and audit trails.</w:t>
+      </w:r>
+    </w:p>
+    <w:p>
+      <w:pPr>
+        <w:ind w:left="260" w:hanging="200"/>
+        <w:spacing w:before="0" w:after="25" w:line="230" w:lineRule="auto"/>
+      </w:pPr>
+      <w:r>
+        <w:rPr>
+          <w:sz w:val="18"/>
+          <w:szCs w:val="18"/>
+        </w:rPr>
+        <w:t xml:space="preserve">•   </w:t>
+      </w:r>
+      <w:r>
+        <w:rPr>
+          <w:sz w:val="18"/>
+          <w:szCs w:val="18"/>
+        </w:rPr>
+        <w:t xml:space="preserve">Account: root locked with MFA and no access keys; humans via SSO/IAM users with MFA; CloudTrail on - every API call audited.</w:t>
+      </w:r>
+    </w:p>
+    <w:p>
+      <w:pPr>
+        <w:ind w:left="260" w:hanging="200"/>
+        <w:spacing w:before="0" w:after="25" w:line="230" w:lineRule="auto"/>
+      </w:pPr>
+      <w:r>
+        <w:rPr>
+          <w:sz w:val="18"/>
+          <w:szCs w:val="18"/>
+        </w:rPr>
+        <w:t xml:space="preserve">•   </w:t>
+      </w:r>
+      <w:r>
+        <w:rPr>
+          <w:sz w:val="18"/>
+          <w:szCs w:val="18"/>
+        </w:rPr>
+        <w:t xml:space="preserve">IAM: roles for every service, least privilege per policy, no wildcard admin in app roles, no long-lived keys in code or CI (roles/OIDC instead).</w:t>
+      </w:r>
+    </w:p>
+    <w:p>
+      <w:pPr>
+        <w:ind w:left="260" w:hanging="200"/>
+        <w:spacing w:before="0" w:after="25" w:line="230" w:lineRule="auto"/>
+      </w:pPr>
+      <w:r>
+        <w:rPr>
+          <w:sz w:val="18"/>
+          <w:szCs w:val="18"/>
+        </w:rPr>
+        <w:t xml:space="preserve">•   </w:t>
+      </w:r>
+      <w:r>
+        <w:rPr>
+          <w:sz w:val="18"/>
+          <w:szCs w:val="18"/>
+        </w:rPr>
+        <w:t xml:space="preserve">Network: app and DB in private subnets, SG chains by reference, no 0.0.0.0/0 on SSH/DB ports ever - SSM Session Manager replaces bastion SSH.</w:t>
+      </w:r>
+    </w:p>
+    <w:p>
+      <w:pPr>
+        <w:ind w:left="260" w:hanging="200"/>
+        <w:spacing w:before="0" w:after="25" w:line="230" w:lineRule="auto"/>
+      </w:pPr>
+      <w:r>
+        <w:rPr>
+          <w:sz w:val="18"/>
+          <w:szCs w:val="18"/>
+        </w:rPr>
+        <w:t xml:space="preserve">•   </w:t>
+      </w:r>
+      <w:r>
+        <w:rPr>
+          <w:sz w:val="18"/>
+          <w:szCs w:val="18"/>
+        </w:rPr>
+        <w:t xml:space="preserve">Data: encryption at rest (S3/EBS/RDS with KMS) and TLS in transit everywhere; S3 Block Public Access on account-wide.</w:t>
+      </w:r>
+    </w:p>
+    <w:p>
+      <w:pPr>
+        <w:ind w:left="260" w:hanging="200"/>
+        <w:spacing w:before="0" w:after="25" w:line="230" w:lineRule="auto"/>
+      </w:pPr>
+      <w:r>
+        <w:rPr>
+          <w:sz w:val="18"/>
+          <w:szCs w:val="18"/>
+        </w:rPr>
+        <w:t xml:space="preserve">•   </w:t>
+      </w:r>
+      <w:r>
+        <w:rPr>
+          <w:sz w:val="18"/>
+          <w:szCs w:val="18"/>
+        </w:rPr>
+        <w:t xml:space="preserve">Supply chain: Trivy/ECR scanning for image CVEs, dependency scanning in CI, minimal non-root base images (my pipeline items).</w:t>
+      </w:r>
+    </w:p>
+    <w:p>
+      <w:pPr>
+        <w:ind w:left="260" w:hanging="200"/>
+        <w:spacing w:before="0" w:after="25" w:line="230" w:lineRule="auto"/>
+      </w:pPr>
+      <w:r>
+        <w:rPr>
+          <w:sz w:val="18"/>
+          <w:szCs w:val="18"/>
+        </w:rPr>
+        <w:t xml:space="preserve">•   </w:t>
+      </w:r>
+      <w:r>
+        <w:rPr>
+          <w:sz w:val="18"/>
+          <w:szCs w:val="18"/>
+        </w:rPr>
+        <w:t xml:space="preserve">Edge: WAF on ALB/CloudFront for rate limits and common attacks; Security Hub/GuardDuty aggregate findings.</w:t>
+      </w:r>
+    </w:p>
+    <w:p>
+      <w:pPr>
+        <w:ind w:left="260" w:hanging="200"/>
+        <w:spacing w:before="0" w:after="25" w:line="230" w:lineRule="auto"/>
+      </w:pPr>
+      <w:r>
+        <w:rPr>
+          <w:sz w:val="18"/>
+          <w:szCs w:val="18"/>
+        </w:rPr>
+        <w:t xml:space="preserve">•   </w:t>
+      </w:r>
+      <w:r>
+        <w:rPr>
+          <w:sz w:val="18"/>
+          <w:szCs w:val="18"/>
+        </w:rPr>
+        <w:t xml:space="preserve">The one-line summary interviewers like: assume breach - layer defenses so no single mistake is fatal.</w:t>
+      </w:r>
+    </w:p>
+    <w:p>
+      <w:pPr>
+        <w:ind w:left="260" w:hanging="0"/>
+        <w:spacing w:before="0" w:after="15" w:line="230" w:lineRule="auto"/>
+        <w:shd w:val="clear" w:color="auto" w:fill="F2F2F2"/>
+      </w:pPr>
+      <w:r>
+        <w:rPr>
+          <w:b/>
+          <w:sz w:val="17"/>
+          <w:szCs w:val="17"/>
+        </w:rPr>
+        <w:t xml:space="preserve">Example:  </w:t>
+      </w:r>
+      <w:r>
+        <w:rPr>
+          <w:rFonts w:ascii="Consolas" w:hAnsi="Consolas" w:cs="Consolas"/>
+          <w:color w:val="3B3B3B"/>
+          <w:sz w:val="17"/>
+          <w:szCs w:val="17"/>
+        </w:rPr>
+        <w:t xml:space="preserve">checklist:</w:t>
+      </w:r>
+    </w:p>
+    <w:p>
+      <w:pPr>
+        <w:ind w:left="260" w:hanging="0"/>
+        <w:spacing w:before="0" w:after="15" w:line="230" w:lineRule="auto"/>
+        <w:shd w:val="clear" w:color="auto" w:fill="F2F2F2"/>
+      </w:pPr>
+      <w:r>
+        <w:rPr>
+          <w:rFonts w:ascii="Consolas" w:hAnsi="Consolas" w:cs="Consolas"/>
+          <w:color w:val="3B3B3B"/>
+          <w:sz w:val="17"/>
+          <w:szCs w:val="17"/>
+        </w:rPr>
+        <w:t xml:space="preserve">  root: MFA, no keys     IAM: roles, least-priv</w:t>
+      </w:r>
+    </w:p>
+    <w:p>
+      <w:pPr>
+        <w:ind w:left="260" w:hanging="0"/>
+        <w:spacing w:before="0" w:after="15" w:line="230" w:lineRule="auto"/>
+        <w:shd w:val="clear" w:color="auto" w:fill="F2F2F2"/>
+      </w:pPr>
+      <w:r>
+        <w:rPr>
+          <w:rFonts w:ascii="Consolas" w:hAnsi="Consolas" w:cs="Consolas"/>
+          <w:color w:val="3B3B3B"/>
+          <w:sz w:val="17"/>
+          <w:szCs w:val="17"/>
+        </w:rPr>
+        <w:t xml:space="preserve">  net: private subnets, SG chains, no open 22</w:t>
+      </w:r>
+    </w:p>
+    <w:p>
+      <w:pPr>
+        <w:ind w:left="260" w:hanging="0"/>
+        <w:spacing w:before="0" w:after="15" w:line="230" w:lineRule="auto"/>
+        <w:shd w:val="clear" w:color="auto" w:fill="F2F2F2"/>
+      </w:pPr>
+      <w:r>
+        <w:rPr>
+          <w:rFonts w:ascii="Consolas" w:hAnsi="Consolas" w:cs="Consolas"/>
+          <w:color w:val="3B3B3B"/>
+          <w:sz w:val="17"/>
+          <w:szCs w:val="17"/>
+        </w:rPr>
+        <w:t xml:space="preserve">  data: KMS at rest, TLS in transit</w:t>
+      </w:r>
+    </w:p>
+    <w:p>
+      <w:pPr>
+        <w:ind w:left="260" w:hanging="0"/>
+        <w:spacing w:before="0" w:after="15" w:line="230" w:lineRule="auto"/>
+        <w:shd w:val="clear" w:color="auto" w:fill="F2F2F2"/>
+      </w:pPr>
+      <w:r>
+        <w:rPr>
+          <w:rFonts w:ascii="Consolas" w:hAnsi="Consolas" w:cs="Consolas"/>
+          <w:color w:val="3B3B3B"/>
+          <w:sz w:val="17"/>
+          <w:szCs w:val="17"/>
+        </w:rPr>
+        <w:t xml:space="preserve">  images: Trivy scan, non-root</w:t>
+      </w:r>
+    </w:p>
+    <w:p>
+      <w:pPr>
+        <w:ind w:left="260" w:hanging="0"/>
+        <w:spacing w:before="0" w:after="15" w:line="230" w:lineRule="auto"/>
+        <w:shd w:val="clear" w:color="auto" w:fill="F2F2F2"/>
+      </w:pPr>
+      <w:r>
+        <w:rPr>
+          <w:rFonts w:ascii="Consolas" w:hAnsi="Consolas" w:cs="Consolas"/>
+          <w:color w:val="3B3B3B"/>
+          <w:sz w:val="17"/>
+          <w:szCs w:val="17"/>
+        </w:rPr>
+        <w:t xml:space="preserve">  audit: CloudTrail + GuardDuty on</w:t>
+      </w:r>
+    </w:p>
+    <w:p>
+      <w:pPr>
+        <w:ind w:left="120" w:hanging="0"/>
+        <w:spacing w:before="50" w:after="110" w:line="230" w:lineRule="auto"/>
+        <w:pBdr>
+          <w:left w:val="single" w:sz="12" w:space="4" w:color="2E5E1F"/>
+        </w:pBdr>
+      </w:pPr>
+      <w:r>
+        <w:rPr>
+          <w:b/>
+          <w:color w:val="2E5E1F"/>
+          <w:sz w:val="18"/>
+          <w:szCs w:val="18"/>
+        </w:rPr>
+        <w:t xml:space="preserve">Interview answer:  </w:t>
+      </w:r>
+      <w:r>
+        <w:rPr>
+          <w:i/>
+          <w:sz w:val="18"/>
+          <w:szCs w:val="18"/>
+        </w:rPr>
+        <w:t xml:space="preserve">Layered defense: root locked behind MFA with CloudTrail auditing everything; least-privilege roles instead of keys; app and data in private subnets with SG chains and zero open SSH (SSM sessions instead); KMS at rest and TLS in transit; scanned, non-root container images; WAF at the edge. The principle - assume breach, so no single mistake is fatal.</w:t>
+      </w:r>
+    </w:p>
+    <w:p>
+      <w:pPr>
+        <w:spacing w:before="140" w:after="40" w:line="230" w:lineRule="auto"/>
+      </w:pPr>
+      <w:r>
+        <w:rPr>
+          <w:b/>
+          <w:sz w:val="21"/>
+          <w:szCs w:val="21"/>
+        </w:rPr>
+        <w:t xml:space="preserve">A4.5  Cost Optimization</w:t>
+      </w:r>
+    </w:p>
+    <w:p>
+      <w:pPr>
+        <w:spacing w:before="0" w:after="40" w:line="230" w:lineRule="auto"/>
+      </w:pPr>
+      <w:r>
+        <w:rPr>
+          <w:b/>
+          <w:sz w:val="18"/>
+          <w:szCs w:val="18"/>
+        </w:rPr>
+        <w:t xml:space="preserve">What it is:  </w:t>
+      </w:r>
+      <w:r>
+        <w:rPr>
+          <w:sz w:val="18"/>
+          <w:szCs w:val="18"/>
+        </w:rPr>
+        <w:t xml:space="preserve">Cost work is visibility first - tags, Cost Explorer, budgets - then rightsizing, commitment discounts, storage lifecycle and killing idle spend.</w:t>
+      </w:r>
+    </w:p>
+    <w:p>
+      <w:pPr>
+        <w:ind w:left="260" w:hanging="200"/>
+        <w:spacing w:before="0" w:after="25" w:line="230" w:lineRule="auto"/>
+      </w:pPr>
+      <w:r>
+        <w:rPr>
+          <w:sz w:val="18"/>
+          <w:szCs w:val="18"/>
+        </w:rPr>
+        <w:t xml:space="preserve">•   </w:t>
+      </w:r>
+      <w:r>
+        <w:rPr>
+          <w:sz w:val="18"/>
+          <w:szCs w:val="18"/>
+        </w:rPr>
+        <w:t xml:space="preserve">Visibility: cost allocation tags per project/env, Cost Explorer for trends, budgets + anomaly detection alerts - you cannot cut what you cannot see.</w:t>
+      </w:r>
+    </w:p>
+    <w:p>
+      <w:pPr>
+        <w:ind w:left="260" w:hanging="200"/>
+        <w:spacing w:before="0" w:after="25" w:line="230" w:lineRule="auto"/>
+      </w:pPr>
+      <w:r>
+        <w:rPr>
+          <w:sz w:val="18"/>
+          <w:szCs w:val="18"/>
+        </w:rPr>
+        <w:t xml:space="preserve">•   </w:t>
+      </w:r>
+      <w:r>
+        <w:rPr>
+          <w:sz w:val="18"/>
+          <w:szCs w:val="18"/>
+        </w:rPr>
+        <w:t xml:space="preserve">Rightsizing: CPU/memory metrics vs provisioned - shrink oversized ECS tasks and RDS instances; Compute Optimizer recommends.</w:t>
+      </w:r>
+    </w:p>
+    <w:p>
+      <w:pPr>
+        <w:ind w:left="260" w:hanging="200"/>
+        <w:spacing w:before="0" w:after="25" w:line="230" w:lineRule="auto"/>
+      </w:pPr>
+      <w:r>
+        <w:rPr>
+          <w:sz w:val="18"/>
+          <w:szCs w:val="18"/>
+        </w:rPr>
+        <w:t xml:space="preserve">•   </w:t>
+      </w:r>
+      <w:r>
+        <w:rPr>
+          <w:sz w:val="18"/>
+          <w:szCs w:val="18"/>
+        </w:rPr>
+        <w:t xml:space="preserve">Commitments: Savings Plans on the steady baseline (~30-70% off); Spot/Fargate Spot for interruptible workers (~70-90% off).</w:t>
+      </w:r>
+    </w:p>
+    <w:p>
+      <w:pPr>
+        <w:ind w:left="260" w:hanging="200"/>
+        <w:spacing w:before="0" w:after="25" w:line="230" w:lineRule="auto"/>
+      </w:pPr>
+      <w:r>
+        <w:rPr>
+          <w:sz w:val="18"/>
+          <w:szCs w:val="18"/>
+        </w:rPr>
+        <w:t xml:space="preserve">•   </w:t>
+      </w:r>
+      <w:r>
+        <w:rPr>
+          <w:sz w:val="18"/>
+          <w:szCs w:val="18"/>
+        </w:rPr>
+        <w:t xml:space="preserve">Storage: S3 lifecycle to IA/Glacier, Intelligent-Tiering when access is unknown, ECR lifecycle pruning, log retention policies (the forever-logs bill).</w:t>
+      </w:r>
+    </w:p>
+    <w:p>
+      <w:pPr>
+        <w:ind w:left="260" w:hanging="200"/>
+        <w:spacing w:before="0" w:after="25" w:line="230" w:lineRule="auto"/>
+      </w:pPr>
+      <w:r>
+        <w:rPr>
+          <w:sz w:val="18"/>
+          <w:szCs w:val="18"/>
+        </w:rPr>
+        <w:t xml:space="preserve">•   </w:t>
+      </w:r>
+      <w:r>
+        <w:rPr>
+          <w:sz w:val="18"/>
+          <w:szCs w:val="18"/>
+        </w:rPr>
+        <w:t xml:space="preserve">Idle hunt: unattached EBS/EIPs, dev environments running nights/weekends (schedule them off), oversized NAT traffic (VPC endpoints for S3 cut NAT GB charges).</w:t>
+      </w:r>
+    </w:p>
+    <w:p>
+      <w:pPr>
+        <w:ind w:left="260" w:hanging="200"/>
+        <w:spacing w:before="0" w:after="25" w:line="230" w:lineRule="auto"/>
+      </w:pPr>
+      <w:r>
+        <w:rPr>
+          <w:sz w:val="18"/>
+          <w:szCs w:val="18"/>
+        </w:rPr>
+        <w:t xml:space="preserve">•   </w:t>
+      </w:r>
+      <w:r>
+        <w:rPr>
+          <w:sz w:val="18"/>
+          <w:szCs w:val="18"/>
+        </w:rPr>
+        <w:t xml:space="preserve">Architecture wins: scale-to-zero services (App Runner/Lambda) for spiky loads; caching cuts DB size needs; serverless where always-on wastes.</w:t>
+      </w:r>
+    </w:p>
+    <w:p>
+      <w:pPr>
+        <w:ind w:left="260" w:hanging="200"/>
+        <w:spacing w:before="0" w:after="25" w:line="230" w:lineRule="auto"/>
+      </w:pPr>
+      <w:r>
+        <w:rPr>
+          <w:sz w:val="18"/>
+          <w:szCs w:val="18"/>
+        </w:rPr>
+        <w:t xml:space="preserve">•   </w:t>
+      </w:r>
+      <w:r>
+        <w:rPr>
+          <w:sz w:val="18"/>
+          <w:szCs w:val="18"/>
+        </w:rPr>
+        <w:t xml:space="preserve">The 3-YOE answer shape: name a concrete save - e.g. in-house scraping portal replacing credit-based APIs (my resume), scheduled dev shutdowns, lifecycle rules.</w:t>
+      </w:r>
+    </w:p>
+    <w:p>
+      <w:pPr>
+        <w:ind w:left="260" w:hanging="0"/>
+        <w:spacing w:before="0" w:after="15" w:line="230" w:lineRule="auto"/>
+        <w:shd w:val="clear" w:color="auto" w:fill="F2F2F2"/>
+      </w:pPr>
+      <w:r>
+        <w:rPr>
+          <w:b/>
+          <w:sz w:val="17"/>
+          <w:szCs w:val="17"/>
+        </w:rPr>
+        <w:t xml:space="preserve">Example:  </w:t>
+      </w:r>
+      <w:r>
+        <w:rPr>
+          <w:rFonts w:ascii="Consolas" w:hAnsi="Consolas" w:cs="Consolas"/>
+          <w:color w:val="3B3B3B"/>
+          <w:sz w:val="17"/>
+          <w:szCs w:val="17"/>
+        </w:rPr>
+        <w:t xml:space="preserve">quick wins:</w:t>
+      </w:r>
+    </w:p>
+    <w:p>
+      <w:pPr>
+        <w:ind w:left="260" w:hanging="0"/>
+        <w:spacing w:before="0" w:after="15" w:line="230" w:lineRule="auto"/>
+        <w:shd w:val="clear" w:color="auto" w:fill="F2F2F2"/>
+      </w:pPr>
+      <w:r>
+        <w:rPr>
+          <w:rFonts w:ascii="Consolas" w:hAnsi="Consolas" w:cs="Consolas"/>
+          <w:color w:val="3B3B3B"/>
+          <w:sz w:val="17"/>
+          <w:szCs w:val="17"/>
+        </w:rPr>
+        <w:t xml:space="preserve">  dev ECS desired-count -&gt; 0 at night</w:t>
+      </w:r>
+    </w:p>
+    <w:p>
+      <w:pPr>
+        <w:ind w:left="260" w:hanging="0"/>
+        <w:spacing w:before="0" w:after="15" w:line="230" w:lineRule="auto"/>
+        <w:shd w:val="clear" w:color="auto" w:fill="F2F2F2"/>
+      </w:pPr>
+      <w:r>
+        <w:rPr>
+          <w:rFonts w:ascii="Consolas" w:hAnsi="Consolas" w:cs="Consolas"/>
+          <w:color w:val="3B3B3B"/>
+          <w:sz w:val="17"/>
+          <w:szCs w:val="17"/>
+        </w:rPr>
+        <w:t xml:space="preserve">  S3 lifecycle: 30d IA, 90d Glacier</w:t>
+      </w:r>
+    </w:p>
+    <w:p>
+      <w:pPr>
+        <w:ind w:left="260" w:hanging="0"/>
+        <w:spacing w:before="0" w:after="15" w:line="230" w:lineRule="auto"/>
+        <w:shd w:val="clear" w:color="auto" w:fill="F2F2F2"/>
+      </w:pPr>
+      <w:r>
+        <w:rPr>
+          <w:rFonts w:ascii="Consolas" w:hAnsi="Consolas" w:cs="Consolas"/>
+          <w:color w:val="3B3B3B"/>
+          <w:sz w:val="17"/>
+          <w:szCs w:val="17"/>
+        </w:rPr>
+        <w:t xml:space="preserve">  logs: 30d retention</w:t>
+      </w:r>
+    </w:p>
+    <w:p>
+      <w:pPr>
+        <w:ind w:left="260" w:hanging="0"/>
+        <w:spacing w:before="0" w:after="15" w:line="230" w:lineRule="auto"/>
+        <w:shd w:val="clear" w:color="auto" w:fill="F2F2F2"/>
+      </w:pPr>
+      <w:r>
+        <w:rPr>
+          <w:rFonts w:ascii="Consolas" w:hAnsi="Consolas" w:cs="Consolas"/>
+          <w:color w:val="3B3B3B"/>
+          <w:sz w:val="17"/>
+          <w:szCs w:val="17"/>
+        </w:rPr>
+        <w:t xml:space="preserve">  VPC endpoint for S3 (kill NAT GB)</w:t>
+      </w:r>
+    </w:p>
+    <w:p>
+      <w:pPr>
+        <w:ind w:left="260" w:hanging="0"/>
+        <w:spacing w:before="0" w:after="15" w:line="230" w:lineRule="auto"/>
+        <w:shd w:val="clear" w:color="auto" w:fill="F2F2F2"/>
+      </w:pPr>
+      <w:r>
+        <w:rPr>
+          <w:rFonts w:ascii="Consolas" w:hAnsi="Consolas" w:cs="Consolas"/>
+          <w:color w:val="3B3B3B"/>
+          <w:sz w:val="17"/>
+          <w:szCs w:val="17"/>
+        </w:rPr>
+        <w:t xml:space="preserve">  Savings Plan on prod baseline</w:t>
+      </w:r>
+    </w:p>
+    <w:p>
+      <w:pPr>
+        <w:ind w:left="120" w:hanging="0"/>
+        <w:spacing w:before="50" w:after="110" w:line="230" w:lineRule="auto"/>
+        <w:pBdr>
+          <w:left w:val="single" w:sz="12" w:space="4" w:color="2E5E1F"/>
+        </w:pBdr>
+      </w:pPr>
+      <w:r>
+        <w:rPr>
+          <w:b/>
+          <w:color w:val="2E5E1F"/>
+          <w:sz w:val="18"/>
+          <w:szCs w:val="18"/>
+        </w:rPr>
+        <w:t xml:space="preserve">Interview answer:  </w:t>
+      </w:r>
+      <w:r>
+        <w:rPr>
+          <w:i/>
+          <w:sz w:val="18"/>
+          <w:szCs w:val="18"/>
+        </w:rPr>
+        <w:t xml:space="preserve">First visibility - tags, Cost Explorer, budget alerts - then rightsizing from real metrics, Savings Plans on the steady baseline with Spot for interruptible work, S3 and log lifecycle policies, and hunting idle spend like unattached volumes and nights-on dev environments. Architecturally, scale-to-zero and caching cut the baseline itself - at Leemboodi our in-house scraping portal replacing paid credit APIs was exactly that kind of cost win.</w:t>
+      </w:r>
+    </w:p>
+    <w:p>
+      <w:pPr>
+        <w:spacing w:before="140" w:after="40" w:line="230" w:lineRule="auto"/>
+      </w:pPr>
+      <w:r>
+        <w:rPr>
+          <w:b/>
+          <w:sz w:val="21"/>
+          <w:szCs w:val="21"/>
+        </w:rPr>
+        <w:t xml:space="preserve">A4.6  Architecture Walkthrough - RAG Chatbot on AWS (resume story)</w:t>
+      </w:r>
+    </w:p>
+    <w:p>
+      <w:pPr>
+        <w:spacing w:before="0" w:after="40" w:line="230" w:lineRule="auto"/>
+      </w:pPr>
+      <w:r>
+        <w:rPr>
+          <w:b/>
+          <w:sz w:val="18"/>
+          <w:szCs w:val="18"/>
+        </w:rPr>
+        <w:t xml:space="preserve">What it is:  </w:t>
+      </w:r>
+      <w:r>
+        <w:rPr>
+          <w:sz w:val="18"/>
+          <w:szCs w:val="18"/>
+        </w:rPr>
+        <w:t xml:space="preserve">The tell-me-about-your-deployment answer: a containerized Flask RAG service on App Runner, with the full path from user to vector search explainable end-to-end.</w:t>
+      </w:r>
+    </w:p>
+    <w:p>
+      <w:pPr>
+        <w:ind w:left="260" w:hanging="200"/>
+        <w:spacing w:before="0" w:after="25" w:line="230" w:lineRule="auto"/>
+      </w:pPr>
+      <w:r>
+        <w:rPr>
+          <w:sz w:val="18"/>
+          <w:szCs w:val="18"/>
+        </w:rPr>
+        <w:t xml:space="preserve">•   </w:t>
+      </w:r>
+      <w:r>
+        <w:rPr>
+          <w:sz w:val="18"/>
+          <w:szCs w:val="18"/>
+        </w:rPr>
+        <w:t xml:space="preserve">Stack (resume): Flask + LangChain + FAISS, Dockerized, ECR, App Runner - enterprise document search chatbot.</w:t>
+      </w:r>
+    </w:p>
+    <w:p>
+      <w:pPr>
+        <w:ind w:left="260" w:hanging="200"/>
+        <w:spacing w:before="0" w:after="25" w:line="230" w:lineRule="auto"/>
+      </w:pPr>
+      <w:r>
+        <w:rPr>
+          <w:sz w:val="18"/>
+          <w:szCs w:val="18"/>
+        </w:rPr>
+        <w:t xml:space="preserve">•   </w:t>
+      </w:r>
+      <w:r>
+        <w:rPr>
+          <w:sz w:val="18"/>
+          <w:szCs w:val="18"/>
+        </w:rPr>
+        <w:t xml:space="preserve">Request path: user -&gt; HTTPS (App Runner managed TLS) -&gt; Flask API -&gt; embed query -&gt; FAISS vector search over document index -&gt; top-k chunks + prompt -&gt; LLM -&gt; answer with sources.</w:t>
+      </w:r>
+    </w:p>
+    <w:p>
+      <w:pPr>
+        <w:ind w:left="260" w:hanging="200"/>
+        <w:spacing w:before="0" w:after="25" w:line="230" w:lineRule="auto"/>
+      </w:pPr>
+      <w:r>
+        <w:rPr>
+          <w:sz w:val="18"/>
+          <w:szCs w:val="18"/>
+        </w:rPr>
+        <w:t xml:space="preserve">•   </w:t>
+      </w:r>
+      <w:r>
+        <w:rPr>
+          <w:sz w:val="18"/>
+          <w:szCs w:val="18"/>
+        </w:rPr>
+        <w:t xml:space="preserve">Why App Runner: request-scaling web service, no cluster to run - autoscaling, TLS, health checks out of the box; the honest trade-off (less VPC/worker control) and when I would move to ECS.</w:t>
+      </w:r>
+    </w:p>
+    <w:p>
+      <w:pPr>
+        <w:ind w:left="260" w:hanging="200"/>
+        <w:spacing w:before="0" w:after="25" w:line="230" w:lineRule="auto"/>
+      </w:pPr>
+      <w:r>
+        <w:rPr>
+          <w:sz w:val="18"/>
+          <w:szCs w:val="18"/>
+        </w:rPr>
+        <w:t xml:space="preserve">•   </w:t>
+      </w:r>
+      <w:r>
+        <w:rPr>
+          <w:sz w:val="18"/>
+          <w:szCs w:val="18"/>
+        </w:rPr>
+        <w:t xml:space="preserve">CI/CD: Jenkins builds and scans the image, pushes ECR, App Runner auto-deploys on new image - same pipeline discipline as A4.2.</w:t>
+      </w:r>
+    </w:p>
+    <w:p>
+      <w:pPr>
+        <w:ind w:left="260" w:hanging="200"/>
+        <w:spacing w:before="0" w:after="25" w:line="230" w:lineRule="auto"/>
+      </w:pPr>
+      <w:r>
+        <w:rPr>
+          <w:sz w:val="18"/>
+          <w:szCs w:val="18"/>
+        </w:rPr>
+        <w:t xml:space="preserve">•   </w:t>
+      </w:r>
+      <w:r>
+        <w:rPr>
+          <w:sz w:val="18"/>
+          <w:szCs w:val="18"/>
+        </w:rPr>
+        <w:t xml:space="preserve">Ops: structured logs to CloudWatch, latency/error alarms, secrets (LLM API keys) from SSM - not env-baked.</w:t>
+      </w:r>
+    </w:p>
+    <w:p>
+      <w:pPr>
+        <w:ind w:left="260" w:hanging="200"/>
+        <w:spacing w:before="0" w:after="25" w:line="230" w:lineRule="auto"/>
+      </w:pPr>
+      <w:r>
+        <w:rPr>
+          <w:sz w:val="18"/>
+          <w:szCs w:val="18"/>
+        </w:rPr>
+        <w:t xml:space="preserve">•   </w:t>
+      </w:r>
+      <w:r>
+        <w:rPr>
+          <w:sz w:val="18"/>
+          <w:szCs w:val="18"/>
+        </w:rPr>
+        <w:t xml:space="preserve">Evolution answer (they always ask 'how would you scale it'): move index to a vector DB service (Pinecone/pgvector on RDS), queue heavy ingestion via SQS + workers, cache frequent queries in Redis, ECS when workers/VPC needs grow.</w:t>
+      </w:r>
+    </w:p>
+    <w:p>
+      <w:pPr>
+        <w:ind w:left="260" w:hanging="200"/>
+        <w:spacing w:before="0" w:after="25" w:line="230" w:lineRule="auto"/>
+      </w:pPr>
+      <w:r>
+        <w:rPr>
+          <w:sz w:val="18"/>
+          <w:szCs w:val="18"/>
+        </w:rPr>
+        <w:t xml:space="preserve">•   </w:t>
+      </w:r>
+      <w:r>
+        <w:rPr>
+          <w:sz w:val="18"/>
+          <w:szCs w:val="18"/>
+        </w:rPr>
+        <w:t xml:space="preserve">This narrative form - context, choices, trade-offs, evolution - is what a 3-YOE candidate is judged on, reusable for the scraping portal and MailFlow too.</w:t>
+      </w:r>
+    </w:p>
+    <w:p>
+      <w:pPr>
+        <w:ind w:left="260" w:hanging="0"/>
+        <w:spacing w:before="0" w:after="15" w:line="230" w:lineRule="auto"/>
+        <w:shd w:val="clear" w:color="auto" w:fill="F2F2F2"/>
+      </w:pPr>
+      <w:r>
+        <w:rPr>
+          <w:b/>
+          <w:sz w:val="17"/>
+          <w:szCs w:val="17"/>
+        </w:rPr>
+        <w:t xml:space="preserve">Example:  </w:t>
+      </w:r>
+      <w:r>
+        <w:rPr>
+          <w:rFonts w:ascii="Consolas" w:hAnsi="Consolas" w:cs="Consolas"/>
+          <w:color w:val="3B3B3B"/>
+          <w:sz w:val="17"/>
+          <w:szCs w:val="17"/>
+        </w:rPr>
+        <w:t xml:space="preserve">user -&gt; App Runner (TLS, autoscale)</w:t>
+      </w:r>
+    </w:p>
+    <w:p>
+      <w:pPr>
+        <w:ind w:left="260" w:hanging="0"/>
+        <w:spacing w:before="0" w:after="15" w:line="230" w:lineRule="auto"/>
+        <w:shd w:val="clear" w:color="auto" w:fill="F2F2F2"/>
+      </w:pPr>
+      <w:r>
+        <w:rPr>
+          <w:rFonts w:ascii="Consolas" w:hAnsi="Consolas" w:cs="Consolas"/>
+          <w:color w:val="3B3B3B"/>
+          <w:sz w:val="17"/>
+          <w:szCs w:val="17"/>
+        </w:rPr>
+        <w:t xml:space="preserve">  -&gt; Flask API -&gt; embed(query)</w:t>
+      </w:r>
+    </w:p>
+    <w:p>
+      <w:pPr>
+        <w:ind w:left="260" w:hanging="0"/>
+        <w:spacing w:before="0" w:after="15" w:line="230" w:lineRule="auto"/>
+        <w:shd w:val="clear" w:color="auto" w:fill="F2F2F2"/>
+      </w:pPr>
+      <w:r>
+        <w:rPr>
+          <w:rFonts w:ascii="Consolas" w:hAnsi="Consolas" w:cs="Consolas"/>
+          <w:color w:val="3B3B3B"/>
+          <w:sz w:val="17"/>
+          <w:szCs w:val="17"/>
+        </w:rPr>
+        <w:t xml:space="preserve">  -&gt; FAISS top-k -&gt; LLM + context</w:t>
+      </w:r>
+    </w:p>
+    <w:p>
+      <w:pPr>
+        <w:ind w:left="260" w:hanging="0"/>
+        <w:spacing w:before="0" w:after="15" w:line="230" w:lineRule="auto"/>
+        <w:shd w:val="clear" w:color="auto" w:fill="F2F2F2"/>
+      </w:pPr>
+      <w:r>
+        <w:rPr>
+          <w:rFonts w:ascii="Consolas" w:hAnsi="Consolas" w:cs="Consolas"/>
+          <w:color w:val="3B3B3B"/>
+          <w:sz w:val="17"/>
+          <w:szCs w:val="17"/>
+        </w:rPr>
+        <w:t xml:space="preserve">  -&gt; answer + sources</w:t>
+      </w:r>
+    </w:p>
+    <w:p>
+      <w:pPr>
+        <w:ind w:left="260" w:hanging="0"/>
+        <w:spacing w:before="0" w:after="15" w:line="230" w:lineRule="auto"/>
+        <w:shd w:val="clear" w:color="auto" w:fill="F2F2F2"/>
+      </w:pPr>
+      <w:r>
+        <w:rPr>
+          <w:rFonts w:ascii="Consolas" w:hAnsi="Consolas" w:cs="Consolas"/>
+          <w:color w:val="3B3B3B"/>
+          <w:sz w:val="17"/>
+          <w:szCs w:val="17"/>
+        </w:rPr>
+        <w:t xml:space="preserve">CI: Jenkins -&gt; ECR -&gt; auto-deploy</w:t>
+      </w:r>
+    </w:p>
+    <w:p>
+      <w:pPr>
+        <w:ind w:left="260" w:hanging="0"/>
+        <w:spacing w:before="0" w:after="15" w:line="230" w:lineRule="auto"/>
+        <w:shd w:val="clear" w:color="auto" w:fill="F2F2F2"/>
+      </w:pPr>
+      <w:r>
+        <w:rPr>
+          <w:rFonts w:ascii="Consolas" w:hAnsi="Consolas" w:cs="Consolas"/>
+          <w:color w:val="3B3B3B"/>
+          <w:sz w:val="17"/>
+          <w:szCs w:val="17"/>
+        </w:rPr>
+        <w:t xml:space="preserve">ops: CloudWatch + SSM secrets</w:t>
+      </w:r>
+    </w:p>
+    <w:p>
+      <w:pPr>
+        <w:ind w:left="120" w:hanging="0"/>
+        <w:spacing w:before="50" w:after="110" w:line="230" w:lineRule="auto"/>
+        <w:pBdr>
+          <w:left w:val="single" w:sz="12" w:space="4" w:color="2E5E1F"/>
+        </w:pBdr>
+      </w:pPr>
+      <w:r>
+        <w:rPr>
+          <w:b/>
+          <w:color w:val="2E5E1F"/>
+          <w:sz w:val="18"/>
+          <w:szCs w:val="18"/>
+        </w:rPr>
+        <w:t xml:space="preserve">Interview answer:  </w:t>
+      </w:r>
+      <w:r>
+        <w:rPr>
+          <w:i/>
+          <w:sz w:val="18"/>
+          <w:szCs w:val="18"/>
+        </w:rPr>
+        <w:t xml:space="preserve">My RAG chatbot ran as a Dockerized Flask+LangChain+FAISS service: Jenkins built and scanned the image to ECR, App Runner auto-deployed it with managed TLS and request-based autoscaling, secrets came from SSM and logs went to CloudWatch. I chose App Runner for zero-cluster simplicity, and my scaling path is a managed vector DB, SQS-queued ingestion workers, Redis caching, and ECS once VPC and worker control matter - context, trade-offs, evolution.</w:t>
       </w:r>
     </w:p>
     <w:sectPr>

</xml_diff>